<commit_message>
Update branding to Meridian Works with general-niche logo and banner prompts
Co-Authored-By: Claude Opus 5.5 <noreply@anthropic.com>
Claude-Session: https://claude.ai/code/session_01U1rj9GJSwgi7H5znknxBqv
</commit_message>
<xml_diff>
--- a/evolution-of-the-helmet/Evolution-of-the-Helmet-Production-Pack.docx
+++ b/evolution-of-the-helmet/Evolution-of-the-Helmet-Production-Pack.docx
@@ -404,6 +404,96 @@
         <w:pStyle w:val="Heading2"/>
       </w:pPr>
       <w:r>
+        <w:t xml:space="preserve">Chosen Channel: Meridian Works</w:t>
+      </w:r>
+    </w:p>
+    <w:p>
+      <w:pPr>
+        <w:spacing w:after="120"/>
+      </w:pPr>
+      <w:r>
+        <w:rPr>
+          <w:b/>
+          <w:bCs/>
+        </w:rPr>
+        <w:t xml:space="preserve">Meridian Works | Documentaries That Explain Our World</w:t>
+      </w:r>
+    </w:p>
+    <w:p>
+      <w:pPr>
+        <w:spacing w:after="120"/>
+      </w:pPr>
+      <w:r>
+        <w:t xml:space="preserve">Every object has a story. Every invention has an origin. Every turning point has a before and after.</w:t>
+      </w:r>
+    </w:p>
+    <w:p>
+      <w:pPr>
+        <w:spacing w:after="120"/>
+      </w:pPr>
+      <w:r>
+        <w:t xml:space="preserve">At </w:t>
+      </w:r>
+      <w:r>
+        <w:rPr>
+          <w:b/>
+          <w:bCs/>
+        </w:rPr>
+        <w:t xml:space="preserve">Meridian Works</w:t>
+      </w:r>
+      <w:r>
+        <w:t xml:space="preserve">, we make documentaries about the things that shaped our world — from weapons and groundbreaking inventions to ingenious engineering, historical turning points, and the everyday objects whose origins reveal extraordinary stories.</w:t>
+      </w:r>
+    </w:p>
+    <w:p>
+      <w:pPr>
+        <w:spacing w:after="120"/>
+      </w:pPr>
+      <w:r>
+        <w:t xml:space="preserve">Each documentary takes one subject and traces its journey from its earliest beginnings to what it became, exploring the ideas, people, innovations, and events that changed everything along the way.</w:t>
+      </w:r>
+    </w:p>
+    <w:p>
+      <w:pPr>
+        <w:spacing w:after="120"/>
+      </w:pPr>
+      <w:r>
+        <w:t xml:space="preserve">No talking heads. No filler. Just carefully researched stories, told step by step through compelling visuals, with every detail brought to life.</w:t>
+      </w:r>
+    </w:p>
+    <w:p>
+      <w:pPr>
+        <w:spacing w:after="120"/>
+      </w:pPr>
+      <w:r>
+        <w:rPr>
+          <w:b/>
+          <w:bCs/>
+        </w:rPr>
+        <w:t xml:space="preserve">New documentaries every week.</w:t>
+      </w:r>
+    </w:p>
+    <w:p>
+      <w:pPr>
+        <w:spacing w:after="120"/>
+      </w:pPr>
+      <w:r>
+        <w:t xml:space="preserve">Subscribe to Meridian Works and discover the fascinating stories behind how our world came to be.</w:t>
+      </w:r>
+    </w:p>
+    <w:p>
+      <w:pPr>
+        <w:spacing w:after="120"/>
+      </w:pPr>
+      <w:r>
+        <w:t xml:space="preserve">The past explains more than you think. Let's explore it.</w:t>
+      </w:r>
+    </w:p>
+    <w:p>
+      <w:pPr>
+        <w:pStyle w:val="Heading2"/>
+      </w:pPr>
+      <w:r>
         <w:t xml:space="preserve">Logo Generation Prompt</w:t>
       </w:r>
     </w:p>
@@ -421,7 +511,7 @@
           <w:sz w:val="20"/>
           <w:szCs w:val="20"/>
         </w:rPr>
-        <w:t xml:space="preserve">Minimalist circular emblem for a YouTube documentary channel, a single matte-black sculpted object (a stylized lead projectile silhouette) centered on a deep charcoal background, lit by one soft overhead spotlight that leaves a warm rim highlight on the top edge, subtle tabletop reflection beneath, photoreal Blender Cycles 3D render, low-key lighting, heavy falloff to black at the edges, muted palette of charcoal, graphite gray and faint copper, no text, clean premium museum-artifact feel, high detail, 1:1 aspect ratio.</w:t>
+        <w:t xml:space="preserve">Minimalist emblem logo for a history documentary channel called Meridian Works: a thin polished brass meridian ring, like the engraved meridian arc of an antique globe, with fine degree marks along its edge, and a single vertical beam of warm light passing through its center that divides the circle into a before and an after. The ring floats on a deep charcoal background, lit by one soft overhead light with a warm rim highlight along its top edge and a faint reflection below. Photoreal 3D render, low-key lighting with steep falloff to black, palette of charcoal, graphite and aged brass, clean premium museum-artifact feel, perfectly centered with generous empty space around the emblem so it survives a circular crop, no text, 1:1.</w:t>
       </w:r>
     </w:p>
     <w:p>
@@ -446,15 +536,15 @@
           <w:sz w:val="20"/>
           <w:szCs w:val="20"/>
         </w:rPr>
-        <w:t xml:space="preserve">Wide cinematic YouTube banner, 2560x1440, photoreal Blender Cycles 3D render, a chronological lineup of historical military helmets placed left to right on a long dark-green felt table runner: a corroded bronze-age helmet, a dented iron medieval helm, a WWI steel brodie helmet, a WWII stahlhelm, and a modern matte composite combat helmet, each evenly spaced, oldest objects dull and weathered, newest clean and sharp. A single soft overhead spotlight with a faint vertical light shaft behind the center, deep black background fading into shadow, subtle reflections and contact shadows on the felt, low-key museum display mood, muted palette of black, graphite, olive-green felt and aged metal tones with one warm brass accent, shallow depth of field, key objects in the central safe area, no text.</w:t>
-      </w:r>
-    </w:p>
-    <w:p>
-      <w:pPr>
-        <w:spacing w:after="120"/>
-      </w:pPr>
-      <w:r>
-        <w:t xml:space="preserve">"Blender Cycles" only tells the image generator to aim for a realistic 3D look. You don't need Blender to use these prompts.</w:t>
+        <w:t xml:space="preserve">Wide cinematic YouTube channel banner, 2560x1440, photoreal 3D render. A long dark worn wooden table runs left to right across the frame, holding a chronological lineup of objects that shaped the world, each resting in its own soft pool of light: a chipped flint hand axe, a bronze sword, a brass astrolabe, an old leather-bound printed book, a brass pocket watch, a flintlock pistol, a small brass steam engine model, an early glass light bulb, a vintage film camera and a modern smartphone. The oldest objects on the left are weathered and dull; the newest on the right are clean and sharp. A thin vertical beam of warm light falls through the exact center of the frame like a meridian line. Centered in the middle of the image, above the lineup, the text "MERIDIAN WORKS" in bold white classic serif capitals with wide letter spacing, and directly below it in smaller brass-colored capitals "DOCUMENTARIES THAT EXPLAIN OUR WORLD". Keep the text and the central objects inside the middle horizontal band of the image (the central 1546x423 safe area); let the outer edges fade into darkness and soft haze. Low-key museum lighting, crisp specular highlights on metal, faint atmospheric haze, desaturated palette of charcoal, graphite, worn brown wood, aged steel and brass with one warm amber accent, shallow depth of field, premium documentary mood.</w:t>
+      </w:r>
+    </w:p>
+    <w:p>
+      <w:pPr>
+        <w:spacing w:after="120"/>
+      </w:pPr>
+      <w:r>
+        <w:t xml:space="preserve">AI image tools often misspell text. If the channel name comes out wrong, generate the banner without text and add it in Canva using a classic serif font such as Cinzel or Playfair Display.</w:t>
       </w:r>
     </w:p>
     <w:p>

</xml_diff>

<commit_message>
Split video prompts into 8-second Google Flow clips
Each of the 30 shots now has one 8-second clip per ~8 seconds of
narration (81 clips): clip 1 uses the shot image via Frames to Video,
later clips extend the previous one with a new camera move.

Co-Authored-By: Claude Opus 5.5 <noreply@anthropic.com>
Claude-Session: https://claude.ai/code/session_01U1rj9GJSwgi7H5znknxBqv
</commit_message>
<xml_diff>
--- a/evolution-of-the-helmet/Evolution-of-the-Helmet-Production-Pack.docx
+++ b/evolution-of-the-helmet/Evolution-of-the-Helmet-Production-Pack.docx
@@ -169,7 +169,7 @@
           <w:sz w:val="24"/>
           <w:szCs w:val="24"/>
         </w:rPr>
-        <w:t xml:space="preserve">7. Video Prompts (30 shots)</w:t>
+        <w:t xml:space="preserve">7. Video Prompts for Google Flow (81 clips of 8 seconds)</w:t>
       </w:r>
     </w:p>
     <w:p>
@@ -6128,23 +6128,111 @@
         <w:pageBreakBefore/>
       </w:pPr>
       <w:r>
-        <w:t xml:space="preserve">7. Video Prompts (30 shots)</w:t>
-      </w:r>
-    </w:p>
-    <w:p>
-      <w:pPr>
-        <w:spacing w:after="120"/>
-      </w:pPr>
-      <w:r>
-        <w:t xml:space="preserve">Use the matching shot image as the start frame. Generate the longest clip your tool allows (usually 5–10 seconds), then slow it down in your editor, or let it hold on the last frame, to fill the shot length shown. For shots over 20 seconds, you can also make a second clip from the same image with a different camera move.</w:t>
-      </w:r>
-    </w:p>
-    <w:p>
-      <w:pPr>
-        <w:pStyle w:val="Heading3"/>
-      </w:pPr>
-      <w:r>
-        <w:t xml:space="preserve">Shot 1 (0:00–0:25, ~26s)</w:t>
+        <w:t xml:space="preserve">7. Video Prompts for Google Flow (81 clips of 8 seconds)</w:t>
+      </w:r>
+    </w:p>
+    <w:p>
+      <w:pPr>
+        <w:spacing w:after="120"/>
+      </w:pPr>
+      <w:r>
+        <w:t xml:space="preserve">Google Flow makes 8-second clips, so each of the 30 shots is split into 8-second clips that follow the narration.</w:t>
+      </w:r>
+    </w:p>
+    <w:p>
+      <w:pPr>
+        <w:pStyle w:val="ListParagraph"/>
+        <w:numPr>
+          <w:ilvl w:val="0"/>
+          <w:numId w:val="2"/>
+        </w:numPr>
+        <w:spacing w:after="60"/>
+      </w:pPr>
+      <w:r>
+        <w:rPr>
+          <w:b/>
+          <w:bCs/>
+        </w:rPr>
+        <w:t xml:space="preserve">Clip 1 of each shot:</w:t>
+      </w:r>
+      <w:r>
+        <w:t xml:space="preserve"> use Frames to Video, upload that shot's image as the first frame, and paste the Clip 1 prompt.</w:t>
+      </w:r>
+    </w:p>
+    <w:p>
+      <w:pPr>
+        <w:pStyle w:val="ListParagraph"/>
+        <w:numPr>
+          <w:ilvl w:val="0"/>
+          <w:numId w:val="2"/>
+        </w:numPr>
+        <w:spacing w:after="60"/>
+      </w:pPr>
+      <w:r>
+        <w:rPr>
+          <w:b/>
+          <w:bCs/>
+        </w:rPr>
+        <w:t xml:space="preserve">Clip 2, 3, 4:</w:t>
+      </w:r>
+      <w:r>
+        <w:t xml:space="preserve"> add the clip to Scenebuilder and use Extend, which continues from the last frame of the previous clip, then paste the next prompt. If Extend isn't available, use Frames to Video again with the same shot image and the next prompt.</w:t>
+      </w:r>
+    </w:p>
+    <w:p>
+      <w:pPr>
+        <w:pStyle w:val="ListParagraph"/>
+        <w:numPr>
+          <w:ilvl w:val="0"/>
+          <w:numId w:val="2"/>
+        </w:numPr>
+        <w:spacing w:after="60"/>
+      </w:pPr>
+      <w:r>
+        <w:rPr>
+          <w:b/>
+          <w:bCs/>
+        </w:rPr>
+        <w:t xml:space="preserve">Sound:</w:t>
+      </w:r>
+      <w:r>
+        <w:t xml:space="preserve"> mute the clips in your editor. Your voiceover replaces the audio.</w:t>
+      </w:r>
+    </w:p>
+    <w:p>
+      <w:pPr>
+        <w:pStyle w:val="ListParagraph"/>
+        <w:numPr>
+          <w:ilvl w:val="0"/>
+          <w:numId w:val="2"/>
+        </w:numPr>
+        <w:spacing w:after="60"/>
+      </w:pPr>
+      <w:r>
+        <w:rPr>
+          <w:b/>
+          <w:bCs/>
+        </w:rPr>
+        <w:t xml:space="preserve">Fitting the voiceover:</w:t>
+      </w:r>
+      <w:r>
+        <w:t xml:space="preserve"> some clips cover 4–7 seconds of narration and some about 9. Trim the extra, or slow a clip slightly to cover the gap.</w:t>
+      </w:r>
+    </w:p>
+    <w:p>
+      <w:pPr>
+        <w:pStyle w:val="Heading3"/>
+      </w:pPr>
+      <w:r>
+        <w:t xml:space="preserve">Shot 1 (0:00, ~26s, 4 clips)</w:t>
+      </w:r>
+    </w:p>
+    <w:p>
+      <w:pPr>
+        <w:pStyle w:val="Heading3"/>
+      </w:pPr>
+      <w:r>
+        <w:t xml:space="preserve">Shot 1, Clip 1 of 4 (Frames to Video, shot image as first frame; covers ~6s of narration)</w:t>
       </w:r>
     </w:p>
     <w:p>
@@ -6159,7 +6247,7 @@
         <w:t xml:space="preserve">[Script Segment]</w:t>
       </w:r>
       <w:r>
-        <w:t xml:space="preserve"> "Nearly five thousand years separate a dented cap of hammered copper from the helmet soldiers wear today. Every era added something new. A tougher metal. A smarter shape. A better way to soak up a blow. And every one of those changes happened for the same reason. The helmet before it had let something through. To follow that path, our team spent months digging through records and rebuilding each helmet in 3D, piece by piece."</w:t>
+        <w:t xml:space="preserve"> "Nearly five thousand years separate a dented cap of hammered copper from the helmet soldiers wear today."</w:t>
       </w:r>
     </w:p>
     <w:p>
@@ -6185,15 +6273,15 @@
           <w:sz w:val="20"/>
           <w:szCs w:val="20"/>
         </w:rPr>
-        <w:t xml:space="preserve"> Start frame: A long dark worn wooden table holds a chronological row of helmets fading into darkness: a dented hammered-copper Sumerian helmet, a bronze Corinthian helmet, an iron Roman helmet, a medieval great helm, a WWI steel helmet and a modern matte-tan composite combat helmet with a night-vision mount, each in its own soft pool of light. Camera and subject motion: Very slow continuous lateral slide along the full row from the copper helmet to the modern helmet, focus travelling with the camera; each pool of light brightens gently as the camera passes, one continuous unbroken move. Framing: low side angle along the table, deep perspective, shallow depth of field. Lighting: narrow overhead spotlight forming a pool of light on the table, everything else falling into black. Ambient motion: fine dust motes float slowly through the pools of light. Mood: epic, reverent, museum-like. Motion: very slow, smooth, weighted and cinematic, no camera shake, no sudden cuts. Keep every object, material and the lighting consistent with the start frame; add nothing beyond what the motion describes, never people, hands, text or logos; no warping or shape changes other than the described action. Visual style: Dark Archive Macro, a photoreal 3D CGI render in a museum-artifact still-life look, low-key lighting with steep falloff into near-black, desaturated charcoal, graphite, worn wood, aged steel and dull bronze with warm brass accents, extremely high surface detail. Duration: longest clip available (5–10 seconds), 16:9; slow to ~26 seconds in the edit.</w:t>
-      </w:r>
-    </w:p>
-    <w:p>
-      <w:pPr>
-        <w:pStyle w:val="Heading3"/>
-      </w:pPr>
-      <w:r>
-        <w:t xml:space="preserve">Shot 2 (0:25–0:52, ~27s)</w:t>
+        <w:t xml:space="preserve"> 8-second shot. Scene: A long dark worn wooden table holds a chronological row of helmets fading into darkness: a dented hammered-copper Sumerian helmet, a bronze Corinthian helmet, an iron Roman helmet, a medieval great helm, a WWI steel helmet and a modern matte-tan composite combat helmet with a night-vision mount, each in its own soft pool of light. Camera and motion: Slow push-in on the dented copper helmet at the near end of the table, then a gentle rack focus down the row toward the modern helmet at the far end. Ambient: fine dust motes float slowly through the pools of light. Lighting: narrow overhead spotlight forming a pool of light on the table, everything else falling into black. Mood: epic, reverent, museum-like. Style: photoreal 3D CGI, museum-artifact look, dark low-key lighting with steep falloff into near-black, desaturated charcoal, graphite, worn wood, aged steel and brass, faint haze, extremely detailed surfaces, shallow depth of field. Very slow, smooth, cinematic movement, no camera shake, no cuts. No people, no hands, no text, no logos; objects keep their shape except for the described action. Audio: no speech, no music.</w:t>
+      </w:r>
+    </w:p>
+    <w:p>
+      <w:pPr>
+        <w:pStyle w:val="Heading3"/>
+      </w:pPr>
+      <w:r>
+        <w:t xml:space="preserve">Shot 1, Clip 2 of 4 (Extend the previous clip; covers ~7s of narration)</w:t>
       </w:r>
     </w:p>
     <w:p>
@@ -6208,7 +6296,7 @@
         <w:t xml:space="preserve">[Script Segment]</w:t>
       </w:r>
       <w:r>
-        <w:t xml:space="preserve"> "It starts in ancient Mesopotamia, around 2500 BC. Sumerian soldiers marching in tight formations wore helmets of beaten copper over padded leather caps. The idea was simple. Put something hard between the skull and the weapon. For rulers, the same idea became a symbol. One Sumerian ruler was buried with a helmet of solid gold, shaped to imitate hair tied up in a knot. It was never meant to be hit. It was meant to be seen."</w:t>
+        <w:t xml:space="preserve"> "Every era added something new. A tougher metal. A smarter shape. A better way to soak up a blow."</w:t>
       </w:r>
     </w:p>
     <w:p>
@@ -6234,15 +6322,15 @@
           <w:sz w:val="20"/>
           <w:szCs w:val="20"/>
         </w:rPr>
-        <w:t xml:space="preserve"> Start frame: A dim ancient Sumerian tomb chamber of mud brick around 2500 BC: a hammered-copper soldier's helmet over a padded leather cap rests on a low ledge, and beyond it a golden ceremonial helmet engraved with wavy hair and a tied knot sits half-buried in dry earth, a single shaft of dusty light falling on the gold. Camera and subject motion: Slow push past the copper helmet toward the gold helmet with a rack focus from copper to gold, dust motes drifting through the light shaft, one continuous unbroken move. Framing: low-angle medium shot, shallow depth of field. Lighting: soft backlight creating a thin glowing rim around the silhouette, front mostly in shadow. Ambient motion: thin atmospheric haze drifts slowly through the backlight. Mood: ancient, sacred, mysterious. Motion: very slow, smooth, weighted and cinematic, no camera shake, no sudden cuts. Keep every object, material and the lighting consistent with the start frame; add nothing beyond what the motion describes, never people, hands, text or logos; no warping or shape changes other than the described action. Visual style: Dark Archive Macro, a photoreal 3D CGI render in a museum-artifact still-life look, low-key lighting with steep falloff into near-black, desaturated charcoal, graphite, worn wood, aged steel and dull bronze with warm brass accents, extremely high surface detail. Duration: longest clip available (5–10 seconds), 16:9; slow to ~27 seconds in the edit.</w:t>
-      </w:r>
-    </w:p>
-    <w:p>
-      <w:pPr>
-        <w:pStyle w:val="Heading3"/>
-      </w:pPr>
-      <w:r>
-        <w:t xml:space="preserve">Shot 3 (0:52–1:15, ~23s)</w:t>
+        <w:t xml:space="preserve"> Continue the same shot for 8 seconds with the same objects, lighting and style. Scene: A long dark worn wooden table holds a chronological row of helmets fading into darkness: a dented hammered-copper Sumerian helmet, a bronze Corinthian helmet, an iron Roman helmet, a medieval great helm, a WWI steel helmet and a modern matte-tan composite combat helmet with a night-vision mount, each in its own soft pool of light. Camera and motion: Slow lateral slide along the row past the bronze Corinthian and iron Roman helmets, each pool of light brightening softly as the camera passes. Ambient: fine dust motes float slowly through the pools of light. Style: photoreal 3D CGI, museum-artifact look, dark low-key lighting with steep falloff into near-black, desaturated charcoal, graphite, worn wood, aged steel and brass, faint haze, extremely detailed surfaces, shallow depth of field. Very slow, smooth, cinematic movement, no camera shake, no cuts. No people, no hands, no text, no logos; objects keep their shape except for the described action. Audio: no speech, no music.</w:t>
+      </w:r>
+    </w:p>
+    <w:p>
+      <w:pPr>
+        <w:pStyle w:val="Heading3"/>
+      </w:pPr>
+      <w:r>
+        <w:t xml:space="preserve">Shot 1, Clip 3 of 4 (Extend the previous clip; covers ~7s of narration)</w:t>
       </w:r>
     </w:p>
     <w:p>
@@ -6257,7 +6345,7 @@
         <w:t xml:space="preserve">[Script Segment]</w:t>
       </w:r>
       <w:r>
-        <w:t xml:space="preserve"> "But copper had a weakness. It was soft. A heavy strike could dent it deep enough to injure the man beneath it. The answer arrived with the Bronze Age. By mixing copper with a small amount of tin, metalworkers created an alloy far harder than either metal alone. Bronze held its shape, resisted cutting, and could be polished to a shine that unsettled anyone facing it."</w:t>
+        <w:t xml:space="preserve"> "And every one of those changes happened for the same reason. The helmet before it had let something through."</w:t>
       </w:r>
     </w:p>
     <w:p>
@@ -6283,15 +6371,15 @@
           <w:sz w:val="20"/>
           <w:szCs w:val="20"/>
         </w:rPr>
-        <w:t xml:space="preserve"> Start frame: A dark ancient workshop: on the left a copper helmet with a deep fresh dent in its crown, on the right a glowing clay crucible of molten bronze with reddish copper nuggets and silvery tin ingots beside it, and a freshly polished golden-brown bronze helmet catching the firelight. Camera and subject motion: Slow lateral slide from the dented copper helmet to the crucible and the polished bronze helmet; the molten bronze ripples, sparks rise, and a sharp light flare rolls across the polished bronze dome, one continuous unbroken move. Framing: high 3/4 angle tabletop medium shot. Lighting: warm flickering orange glow from a forge or flame mixed with cold grey ambient fill. Ambient motion: warm firelight flickers gently across the metal and tiny embers drift upward. Mood: transformative, discovery. Motion: very slow, smooth, weighted and cinematic, no camera shake, no sudden cuts. Keep every object, material and the lighting consistent with the start frame; add nothing beyond what the motion describes, never people, hands, text or logos; no warping or shape changes other than the described action. Visual style: Dark Archive Macro, a photoreal 3D CGI render in a museum-artifact still-life look, low-key lighting with steep falloff into near-black, desaturated charcoal, graphite, worn wood, aged steel and dull bronze with warm brass accents, extremely high surface detail. Duration: longest clip available (5–10 seconds), 16:9; slow to ~23 seconds in the edit.</w:t>
-      </w:r>
-    </w:p>
-    <w:p>
-      <w:pPr>
-        <w:pStyle w:val="Heading3"/>
-      </w:pPr>
-      <w:r>
-        <w:t xml:space="preserve">Shot 4 (1:15–1:29, ~14s)</w:t>
+        <w:t xml:space="preserve"> Continue the same shot for 8 seconds with the same objects, lighting and style. Scene: A long dark worn wooden table holds a chronological row of helmets fading into darkness: a dented hammered-copper Sumerian helmet, a bronze Corinthian helmet, an iron Roman helmet, a medieval great helm, a WWI steel helmet and a modern matte-tan composite combat helmet with a night-vision mount, each in its own soft pool of light. Camera and motion: Continue the slide past the great helm and the WWI steel helmet, then ease in close on a dent in the WWI helmet's surface. Ambient: fine dust motes float slowly through the pools of light. Style: photoreal 3D CGI, museum-artifact look, dark low-key lighting with steep falloff into near-black, desaturated charcoal, graphite, worn wood, aged steel and brass, faint haze, extremely detailed surfaces, shallow depth of field. Very slow, smooth, cinematic movement, no camera shake, no cuts. No people, no hands, no text, no logos; objects keep their shape except for the described action. Audio: no speech, no music.</w:t>
+      </w:r>
+    </w:p>
+    <w:p>
+      <w:pPr>
+        <w:pStyle w:val="Heading3"/>
+      </w:pPr>
+      <w:r>
+        <w:t xml:space="preserve">Shot 1, Clip 4 of 4 (Extend the previous clip; covers ~7s of narration)</w:t>
       </w:r>
     </w:p>
     <w:p>
@@ -6306,7 +6394,7 @@
         <w:t xml:space="preserve">[Script Segment]</w:t>
       </w:r>
       <w:r>
-        <w:t xml:space="preserve"> "By the 7th century BC, Greek armorers had pushed bronze to its limit. They created the Corinthian helmet. Hammered from a single sheet of metal, it wrapped the entire head and face, leaving only narrow openings for the eyes and mouth."</w:t>
+        <w:t xml:space="preserve"> "To follow that path, our team spent months digging through records and rebuilding each helmet in 3D, piece by piece."</w:t>
       </w:r>
     </w:p>
     <w:p>
@@ -6332,15 +6420,23 @@
           <w:sz w:val="20"/>
           <w:szCs w:val="20"/>
         </w:rPr>
-        <w:t xml:space="preserve"> Start frame: A gleaming bronze Greek Corinthian helmet from the 7th century BC with almond-shaped eye openings, a long nose guard and a narrow mouth gap, standing on a dark wooden stand in a dim armorer's workshop. Camera and subject motion: Slow rise from below to eye level with a gentle push-in toward the dark eye openings; light slowly grows across the bronze, one continuous unbroken move. Framing: eye-level frontal medium close-up. Lighting: single soft key light from upper left, steep falloff into near-black, crisp rim highlights on metal edges. Ambient motion: faint haze drifts in the darkness and specular highlights slide subtly across the metal as the view shifts. Mood: iconic, heroic. Motion: very slow, smooth, weighted and cinematic, no camera shake, no sudden cuts. Keep every object, material and the lighting consistent with the start frame; add nothing beyond what the motion describes, never people, hands, text or logos; no warping or shape changes other than the described action. Visual style: Dark Archive Macro, a photoreal 3D CGI render in a museum-artifact still-life look, low-key lighting with steep falloff into near-black, desaturated charcoal, graphite, worn wood, aged steel and dull bronze with warm brass accents, extremely high surface detail. Duration: longest clip available (5–10 seconds), 16:9; slow to ~14 seconds in the edit.</w:t>
-      </w:r>
-    </w:p>
-    <w:p>
-      <w:pPr>
-        <w:pStyle w:val="Heading3"/>
-      </w:pPr>
-      <w:r>
-        <w:t xml:space="preserve">Shot 5 (1:29–1:43, ~14s)</w:t>
+        <w:t xml:space="preserve"> Continue the same shot for 8 seconds with the same objects, lighting and style. Scene: A long dark worn wooden table holds a chronological row of helmets fading into darkness: a dented hammered-copper Sumerian helmet, a bronze Corinthian helmet, an iron Roman helmet, a medieval great helm, a WWI steel helmet and a modern matte-tan composite combat helmet with a night-vision mount, each in its own soft pool of light. Camera and motion: Slow crane up and back to reveal the whole row from above, faint dust drifting through the pools of light. Ambient: fine dust motes float slowly through the pools of light. Style: photoreal 3D CGI, museum-artifact look, dark low-key lighting with steep falloff into near-black, desaturated charcoal, graphite, worn wood, aged steel and brass, faint haze, extremely detailed surfaces, shallow depth of field. Very slow, smooth, cinematic movement, no camera shake, no cuts. No people, no hands, no text, no logos; objects keep their shape except for the described action. Audio: no speech, no music.</w:t>
+      </w:r>
+    </w:p>
+    <w:p>
+      <w:pPr>
+        <w:pStyle w:val="Heading3"/>
+      </w:pPr>
+      <w:r>
+        <w:t xml:space="preserve">Shot 2 (0:25, ~27s, 4 clips)</w:t>
+      </w:r>
+    </w:p>
+    <w:p>
+      <w:pPr>
+        <w:pStyle w:val="Heading3"/>
+      </w:pPr>
+      <w:r>
+        <w:t xml:space="preserve">Shot 2, Clip 1 of 4 (Frames to Video, shot image as first frame; covers ~7s of narration)</w:t>
       </w:r>
     </w:p>
     <w:p>
@@ -6355,7 +6451,7 @@
         <w:t xml:space="preserve">[Script Segment]</w:t>
       </w:r>
       <w:r>
-        <w:t xml:space="preserve"> "Making one took enormous skill. The smith had to stretch the bronze thin enough to wear, yet keep it thick across the brow and crown, where blows landed most. A single mistake could tear the sheet and ruin weeks of work."</w:t>
+        <w:t xml:space="preserve"> "It starts in ancient Mesopotamia, around 2500 BC. Sumerian soldiers marching in tight formations wore helmets of beaten copper"</w:t>
       </w:r>
     </w:p>
     <w:p>
@@ -6381,15 +6477,15 @@
           <w:sz w:val="20"/>
           <w:szCs w:val="20"/>
         </w:rPr>
-        <w:t xml:space="preserve"> Start frame: An ancient Greek armorer's anvil in a dark workshop: a half-finished bronze Corinthian helmet shell on a curved anvil horn, small hammers and stakes around it, and beside it a torn, split bronze sheet ruined by a single mistake. Camera and subject motion: Slow push along the anvil from the half-finished helmet to the torn sheet; tiny sparks and dust drift in the forge glow, one continuous unbroken move. Framing: low side close-up. Lighting: warm flickering orange glow from a forge or flame mixed with cold grey ambient fill. Ambient motion: warm firelight flickers gently across the metal and tiny embers drift upward. Mood: painstaking craft, fragile. Motion: very slow, smooth, weighted and cinematic, no camera shake, no sudden cuts. Keep every object, material and the lighting consistent with the start frame; add nothing beyond what the motion describes, never people, hands, text or logos; no warping or shape changes other than the described action. Visual style: Dark Archive Macro, a photoreal 3D CGI render in a museum-artifact still-life look, low-key lighting with steep falloff into near-black, desaturated charcoal, graphite, worn wood, aged steel and dull bronze with warm brass accents, extremely high surface detail. Duration: longest clip available (5–10 seconds), 16:9; slow to ~14 seconds in the edit.</w:t>
-      </w:r>
-    </w:p>
-    <w:p>
-      <w:pPr>
-        <w:pStyle w:val="Heading3"/>
-      </w:pPr>
-      <w:r>
-        <w:t xml:space="preserve">Shot 6 (1:43–2:01, ~18s)</w:t>
+        <w:t xml:space="preserve"> 8-second shot. Scene: A dim ancient Sumerian tomb chamber of mud brick around 2500 BC: a hammered-copper soldier's helmet over a padded leather cap rests on a low ledge, and beyond it a golden ceremonial helmet engraved with wavy hair and a tied knot sits half-buried in dry earth, a single shaft of dusty light falling on the gold. Camera and motion: Slow push past the copper helmet on the ledge, holding it in soft focus in the foreground. Ambient: thin atmospheric haze drifts slowly through the backlight. Lighting: soft backlight creating a thin glowing rim around the silhouette, front mostly in shadow. Mood: ancient, sacred, mysterious. Style: photoreal 3D CGI, museum-artifact look, dark low-key lighting with steep falloff into near-black, desaturated charcoal, graphite, worn wood, aged steel and brass, faint haze, extremely detailed surfaces, shallow depth of field. Very slow, smooth, cinematic movement, no camera shake, no cuts. No people, no hands, no text, no logos; objects keep their shape except for the described action. Audio: no speech, no music.</w:t>
+      </w:r>
+    </w:p>
+    <w:p>
+      <w:pPr>
+        <w:pStyle w:val="Heading3"/>
+      </w:pPr>
+      <w:r>
+        <w:t xml:space="preserve">Shot 2, Clip 2 of 4 (Extend the previous clip; covers ~6s of narration)</w:t>
       </w:r>
     </w:p>
     <w:p>
@@ -6404,7 +6500,7 @@
         <w:t xml:space="preserve">[Script Segment]</w:t>
       </w:r>
       <w:r>
-        <w:t xml:space="preserve"> "It was superb protection. And that was exactly the problem. A soldier inside a Corinthian helmet could barely hear orders and could see almost nothing to his sides. So over the next few centuries, Greek designs slowly opened up. Cheek pieces became hinged. Ear openings appeared. Protection was traded for awareness."</w:t>
+        <w:t xml:space="preserve"> "over padded leather caps. The idea was simple. Put something hard between the skull and the weapon."</w:t>
       </w:r>
     </w:p>
     <w:p>
@@ -6430,15 +6526,15 @@
           <w:sz w:val="20"/>
           <w:szCs w:val="20"/>
         </w:rPr>
-        <w:t xml:space="preserve"> Start frame: First-person view from inside a bronze Corinthian helmet, looking out through its narrow eye slits at a blurred dusty ancient Greek battlefield of spears, the frame edges blocked by dark bronze. Camera and subject motion: Slow, slightly unsteady head-turn pan to the left revealing only dark bronze at the sides, then back to the narrow view ahead; dust drifts across the battlefield, one continuous unbroken move. Framing: first-person point of view through the eye slits. Lighting: soft backlight creating a thin glowing rim around the silhouette, front mostly in shadow. Ambient motion: thin atmospheric haze drifts slowly through the backlight. Mood: claustrophobic, isolated. Motion: very slow, smooth, weighted and cinematic, no camera shake, no sudden cuts. Keep every object, material and the lighting consistent with the start frame; add nothing beyond what the motion describes, never people, hands, text or logos; no warping or shape changes other than the described action. Visual style: Dark Archive Macro, a photoreal 3D CGI render in a museum-artifact still-life look, low-key lighting with steep falloff into near-black, desaturated charcoal, graphite, worn wood, aged steel and dull bronze with warm brass accents, extremely high surface detail. Duration: longest clip available (5–10 seconds), 16:9; slow to ~18 seconds in the edit.</w:t>
-      </w:r>
-    </w:p>
-    <w:p>
-      <w:pPr>
-        <w:pStyle w:val="Heading3"/>
-      </w:pPr>
-      <w:r>
-        <w:t xml:space="preserve">Shot 7 (2:01–2:22, ~21s)</w:t>
+        <w:t xml:space="preserve"> Continue the same shot for 8 seconds with the same objects, lighting and style. Scene: A dim ancient Sumerian tomb chamber of mud brick around 2500 BC: a hammered-copper soldier's helmet over a padded leather cap rests on a low ledge, and beyond it a golden ceremonial helmet engraved with wavy hair and a tied knot sits half-buried in dry earth, a single shaft of dusty light falling on the gold. Camera and motion: Gentle orbit around the copper helmet, revealing the padded leather cap edge beneath its rim. Ambient: thin atmospheric haze drifts slowly through the backlight. Style: photoreal 3D CGI, museum-artifact look, dark low-key lighting with steep falloff into near-black, desaturated charcoal, graphite, worn wood, aged steel and brass, faint haze, extremely detailed surfaces, shallow depth of field. Very slow, smooth, cinematic movement, no camera shake, no cuts. No people, no hands, no text, no logos; objects keep their shape except for the described action. Audio: no speech, no music.</w:t>
+      </w:r>
+    </w:p>
+    <w:p>
+      <w:pPr>
+        <w:pStyle w:val="Heading3"/>
+      </w:pPr>
+      <w:r>
+        <w:t xml:space="preserve">Shot 2, Clip 3 of 4 (Extend the previous clip; covers ~7s of narration)</w:t>
       </w:r>
     </w:p>
     <w:p>
@@ -6453,7 +6549,7 @@
         <w:t xml:space="preserve">[Script Segment]</w:t>
       </w:r>
       <w:r>
-        <w:t xml:space="preserve"> "Then came Rome. And Rome faced a different problem entirely. Scale. Hand-shaping a full-face helmet took a skilled craftsman days of work. Rome needed to equip hundreds of thousands of men. So its legions adopted a simpler design borrowed from the Celts, the Montefortino. A plain rounded bowl with a small neck guard and cheek pieces. Fast to make. Easy to repair."</w:t>
+        <w:t xml:space="preserve"> "For rulers, the same idea became a symbol. One Sumerian ruler was buried with a helmet of solid gold,"</w:t>
       </w:r>
     </w:p>
     <w:p>
@@ -6479,15 +6575,15 @@
           <w:sz w:val="20"/>
           <w:szCs w:val="20"/>
         </w:rPr>
-        <w:t xml:space="preserve"> Start frame: A vast dark stone Roman armory with endless rows of identical plain bronze Montefortino helmets with top knobs, small neck guards and cheek pieces, lined up on wooden racks into the darkness. Camera and subject motion: Slow steady push down the central aisle between the racks of identical helmets, faint dust drifting in pools of light, one continuous unbroken move. Framing: low-angle one-point perspective down the central aisle. Lighting: narrow overhead spotlight forming a pool of light on the table, everything else falling into black. Ambient motion: fine dust motes float slowly through the pools of light. Mood: imperial, massive scale. Motion: very slow, smooth, weighted and cinematic, no camera shake, no sudden cuts. Keep every object, material and the lighting consistent with the start frame; add nothing beyond what the motion describes, never people, hands, text or logos; no warping or shape changes other than the described action. Visual style: Dark Archive Macro, a photoreal 3D CGI render in a museum-artifact still-life look, low-key lighting with steep falloff into near-black, desaturated charcoal, graphite, worn wood, aged steel and dull bronze with warm brass accents, extremely high surface detail. Duration: longest clip available (5–10 seconds), 16:9; slow to ~21 seconds in the edit.</w:t>
-      </w:r>
-    </w:p>
-    <w:p>
-      <w:pPr>
-        <w:pStyle w:val="Heading3"/>
-      </w:pPr>
-      <w:r>
-        <w:t xml:space="preserve">Shot 8 (2:22–2:30, ~8s)</w:t>
+        <w:t xml:space="preserve"> Continue the same shot for 8 seconds with the same objects, lighting and style. Scene: A dim ancient Sumerian tomb chamber of mud brick around 2500 BC: a hammered-copper soldier's helmet over a padded leather cap rests on a low ledge, and beyond it a golden ceremonial helmet engraved with wavy hair and a tied knot sits half-buried in dry earth, a single shaft of dusty light falling on the gold. Camera and motion: Rack focus from the copper helmet to the golden helmet glowing in the shaft of light behind it, dust drifting through the beam. Ambient: thin atmospheric haze drifts slowly through the backlight. Style: photoreal 3D CGI, museum-artifact look, dark low-key lighting with steep falloff into near-black, desaturated charcoal, graphite, worn wood, aged steel and brass, faint haze, extremely detailed surfaces, shallow depth of field. Very slow, smooth, cinematic movement, no camera shake, no cuts. No people, no hands, no text, no logos; objects keep their shape except for the described action. Audio: no speech, no music.</w:t>
+      </w:r>
+    </w:p>
+    <w:p>
+      <w:pPr>
+        <w:pStyle w:val="Heading3"/>
+      </w:pPr>
+      <w:r>
+        <w:t xml:space="preserve">Shot 2, Clip 4 of 4 (Extend the previous clip; covers ~8s of narration)</w:t>
       </w:r>
     </w:p>
     <w:p>
@@ -6502,6 +6598,740 @@
         <w:t xml:space="preserve">[Script Segment]</w:t>
       </w:r>
       <w:r>
+        <w:t xml:space="preserve"> "shaped to imitate hair tied up in a knot. It was never meant to be hit. It was meant to be seen."</w:t>
+      </w:r>
+    </w:p>
+    <w:p>
+      <w:pPr>
+        <w:pBdr>
+          <w:left w:val="single" w:color="B9A882" w:sz="18" w:space="8"/>
+        </w:pBdr>
+        <w:shd w:fill="F3F1EC" w:color="auto" w:val="clear"/>
+        <w:spacing w:after="160" w:line="276"/>
+        <w:ind w:left="200" w:right="120"/>
+      </w:pPr>
+      <w:r>
+        <w:rPr>
+          <w:b/>
+          <w:bCs/>
+          <w:sz w:val="20"/>
+          <w:szCs w:val="20"/>
+        </w:rPr>
+        <w:t xml:space="preserve">Video Prompt:</w:t>
+      </w:r>
+      <w:r>
+        <w:rPr>
+          <w:sz w:val="20"/>
+          <w:szCs w:val="20"/>
+        </w:rPr>
+        <w:t xml:space="preserve"> Continue the same shot for 8 seconds with the same objects, lighting and style. Scene: A dim ancient Sumerian tomb chamber of mud brick around 2500 BC: a hammered-copper soldier's helmet over a padded leather cap rests on a low ledge, and beyond it a golden ceremonial helmet engraved with wavy hair and a tied knot sits half-buried in dry earth, a single shaft of dusty light falling on the gold. Camera and motion: Slow push-in on the golden helmet's engraved hair and tied knot, the light shaft shimmering. Ambient: thin atmospheric haze drifts slowly through the backlight. Style: photoreal 3D CGI, museum-artifact look, dark low-key lighting with steep falloff into near-black, desaturated charcoal, graphite, worn wood, aged steel and brass, faint haze, extremely detailed surfaces, shallow depth of field. Very slow, smooth, cinematic movement, no camera shake, no cuts. No people, no hands, no text, no logos; objects keep their shape except for the described action. Audio: no speech, no music.</w:t>
+      </w:r>
+    </w:p>
+    <w:p>
+      <w:pPr>
+        <w:pStyle w:val="Heading3"/>
+      </w:pPr>
+      <w:r>
+        <w:t xml:space="preserve">Shot 3 (0:52, ~23s, 3 clips)</w:t>
+      </w:r>
+    </w:p>
+    <w:p>
+      <w:pPr>
+        <w:pStyle w:val="Heading3"/>
+      </w:pPr>
+      <w:r>
+        <w:t xml:space="preserve">Shot 3, Clip 1 of 3 (Frames to Video, shot image as first frame; covers ~8s of narration)</w:t>
+      </w:r>
+    </w:p>
+    <w:p>
+      <w:pPr>
+        <w:spacing w:after="120"/>
+      </w:pPr>
+      <w:r>
+        <w:rPr>
+          <w:b/>
+          <w:bCs/>
+        </w:rPr>
+        <w:t xml:space="preserve">[Script Segment]</w:t>
+      </w:r>
+      <w:r>
+        <w:t xml:space="preserve"> "But copper had a weakness. It was soft. A heavy strike could dent it deep enough to injure the man beneath it."</w:t>
+      </w:r>
+    </w:p>
+    <w:p>
+      <w:pPr>
+        <w:pBdr>
+          <w:left w:val="single" w:color="B9A882" w:sz="18" w:space="8"/>
+        </w:pBdr>
+        <w:shd w:fill="F3F1EC" w:color="auto" w:val="clear"/>
+        <w:spacing w:after="160" w:line="276"/>
+        <w:ind w:left="200" w:right="120"/>
+      </w:pPr>
+      <w:r>
+        <w:rPr>
+          <w:b/>
+          <w:bCs/>
+          <w:sz w:val="20"/>
+          <w:szCs w:val="20"/>
+        </w:rPr>
+        <w:t xml:space="preserve">Video Prompt:</w:t>
+      </w:r>
+      <w:r>
+        <w:rPr>
+          <w:sz w:val="20"/>
+          <w:szCs w:val="20"/>
+        </w:rPr>
+        <w:t xml:space="preserve"> 8-second shot. Scene: A dark ancient workshop: on the left a copper helmet with a deep fresh dent in its crown, on the right a glowing clay crucible of molten bronze with reddish copper nuggets and silvery tin ingots beside it, and a freshly polished golden-brown bronze helmet catching the firelight. Camera and motion: Slow push-in on the deep fresh dent in the copper helmet's crown, a few metal flakes settling. Ambient: warm firelight flickers gently across the metal and tiny embers drift upward. Lighting: warm flickering orange glow from a forge or flame mixed with cold grey ambient fill. Mood: transformative, discovery. Style: photoreal 3D CGI, museum-artifact look, dark low-key lighting with steep falloff into near-black, desaturated charcoal, graphite, worn wood, aged steel and brass, faint haze, extremely detailed surfaces, shallow depth of field. Very slow, smooth, cinematic movement, no camera shake, no cuts. No people, no hands, no text, no logos; objects keep their shape except for the described action. Audio: no speech, no music.</w:t>
+      </w:r>
+    </w:p>
+    <w:p>
+      <w:pPr>
+        <w:pStyle w:val="Heading3"/>
+      </w:pPr>
+      <w:r>
+        <w:t xml:space="preserve">Shot 3, Clip 2 of 3 (Extend the previous clip; covers ~9s of narration)</w:t>
+      </w:r>
+    </w:p>
+    <w:p>
+      <w:pPr>
+        <w:spacing w:after="120"/>
+      </w:pPr>
+      <w:r>
+        <w:rPr>
+          <w:b/>
+          <w:bCs/>
+        </w:rPr>
+        <w:t xml:space="preserve">[Script Segment]</w:t>
+      </w:r>
+      <w:r>
+        <w:t xml:space="preserve"> "The answer arrived with the Bronze Age. By mixing copper with a small amount of tin, metalworkers created an alloy far harder than either metal alone."</w:t>
+      </w:r>
+    </w:p>
+    <w:p>
+      <w:pPr>
+        <w:pBdr>
+          <w:left w:val="single" w:color="B9A882" w:sz="18" w:space="8"/>
+        </w:pBdr>
+        <w:shd w:fill="F3F1EC" w:color="auto" w:val="clear"/>
+        <w:spacing w:after="160" w:line="276"/>
+        <w:ind w:left="200" w:right="120"/>
+      </w:pPr>
+      <w:r>
+        <w:rPr>
+          <w:b/>
+          <w:bCs/>
+          <w:sz w:val="20"/>
+          <w:szCs w:val="20"/>
+        </w:rPr>
+        <w:t xml:space="preserve">Video Prompt:</w:t>
+      </w:r>
+      <w:r>
+        <w:rPr>
+          <w:sz w:val="20"/>
+          <w:szCs w:val="20"/>
+        </w:rPr>
+        <w:t xml:space="preserve"> Continue the same shot for 8 seconds with the same objects, lighting and style. Scene: A dark ancient workshop: on the left a copper helmet with a deep fresh dent in its crown, on the right a glowing clay crucible of molten bronze with reddish copper nuggets and silvery tin ingots beside it, and a freshly polished golden-brown bronze helmet catching the firelight. Camera and motion: Slow lateral slide to the glowing crucible as molten bronze ripples and sparks rise, tin ingots beside it. Ambient: warm firelight flickers gently across the metal and tiny embers drift upward. Style: photoreal 3D CGI, museum-artifact look, dark low-key lighting with steep falloff into near-black, desaturated charcoal, graphite, worn wood, aged steel and brass, faint haze, extremely detailed surfaces, shallow depth of field. Very slow, smooth, cinematic movement, no camera shake, no cuts. No people, no hands, no text, no logos; objects keep their shape except for the described action. Audio: no speech, no music.</w:t>
+      </w:r>
+    </w:p>
+    <w:p>
+      <w:pPr>
+        <w:pStyle w:val="Heading3"/>
+      </w:pPr>
+      <w:r>
+        <w:t xml:space="preserve">Shot 3, Clip 3 of 3 (Extend the previous clip; covers ~6s of narration)</w:t>
+      </w:r>
+    </w:p>
+    <w:p>
+      <w:pPr>
+        <w:spacing w:after="120"/>
+      </w:pPr>
+      <w:r>
+        <w:rPr>
+          <w:b/>
+          <w:bCs/>
+        </w:rPr>
+        <w:t xml:space="preserve">[Script Segment]</w:t>
+      </w:r>
+      <w:r>
+        <w:t xml:space="preserve"> "Bronze held its shape, resisted cutting, and could be polished to a shine that unsettled anyone facing it."</w:t>
+      </w:r>
+    </w:p>
+    <w:p>
+      <w:pPr>
+        <w:pBdr>
+          <w:left w:val="single" w:color="B9A882" w:sz="18" w:space="8"/>
+        </w:pBdr>
+        <w:shd w:fill="F3F1EC" w:color="auto" w:val="clear"/>
+        <w:spacing w:after="160" w:line="276"/>
+        <w:ind w:left="200" w:right="120"/>
+      </w:pPr>
+      <w:r>
+        <w:rPr>
+          <w:b/>
+          <w:bCs/>
+          <w:sz w:val="20"/>
+          <w:szCs w:val="20"/>
+        </w:rPr>
+        <w:t xml:space="preserve">Video Prompt:</w:t>
+      </w:r>
+      <w:r>
+        <w:rPr>
+          <w:sz w:val="20"/>
+          <w:szCs w:val="20"/>
+        </w:rPr>
+        <w:t xml:space="preserve"> Continue the same shot for 8 seconds with the same objects, lighting and style. Scene: A dark ancient workshop: on the left a copper helmet with a deep fresh dent in its crown, on the right a glowing clay crucible of molten bronze with reddish copper nuggets and silvery tin ingots beside it, and a freshly polished golden-brown bronze helmet catching the firelight. Camera and motion: Slow orbit around the polished bronze helmet as a sharp light flare rolls across its dome. Ambient: warm firelight flickers gently across the metal and tiny embers drift upward. Style: photoreal 3D CGI, museum-artifact look, dark low-key lighting with steep falloff into near-black, desaturated charcoal, graphite, worn wood, aged steel and brass, faint haze, extremely detailed surfaces, shallow depth of field. Very slow, smooth, cinematic movement, no camera shake, no cuts. No people, no hands, no text, no logos; objects keep their shape except for the described action. Audio: no speech, no music.</w:t>
+      </w:r>
+    </w:p>
+    <w:p>
+      <w:pPr>
+        <w:pStyle w:val="Heading3"/>
+      </w:pPr>
+      <w:r>
+        <w:t xml:space="preserve">Shot 4 (1:15, ~14s, 2 clips)</w:t>
+      </w:r>
+    </w:p>
+    <w:p>
+      <w:pPr>
+        <w:pStyle w:val="Heading3"/>
+      </w:pPr>
+      <w:r>
+        <w:t xml:space="preserve">Shot 4, Clip 1 of 2 (Frames to Video, shot image as first frame; covers ~6s of narration)</w:t>
+      </w:r>
+    </w:p>
+    <w:p>
+      <w:pPr>
+        <w:spacing w:after="120"/>
+      </w:pPr>
+      <w:r>
+        <w:rPr>
+          <w:b/>
+          <w:bCs/>
+        </w:rPr>
+        <w:t xml:space="preserve">[Script Segment]</w:t>
+      </w:r>
+      <w:r>
+        <w:t xml:space="preserve"> "By the 7th century BC, Greek armorers had pushed bronze to its limit. They created the Corinthian helmet."</w:t>
+      </w:r>
+    </w:p>
+    <w:p>
+      <w:pPr>
+        <w:pBdr>
+          <w:left w:val="single" w:color="B9A882" w:sz="18" w:space="8"/>
+        </w:pBdr>
+        <w:shd w:fill="F3F1EC" w:color="auto" w:val="clear"/>
+        <w:spacing w:after="160" w:line="276"/>
+        <w:ind w:left="200" w:right="120"/>
+      </w:pPr>
+      <w:r>
+        <w:rPr>
+          <w:b/>
+          <w:bCs/>
+          <w:sz w:val="20"/>
+          <w:szCs w:val="20"/>
+        </w:rPr>
+        <w:t xml:space="preserve">Video Prompt:</w:t>
+      </w:r>
+      <w:r>
+        <w:rPr>
+          <w:sz w:val="20"/>
+          <w:szCs w:val="20"/>
+        </w:rPr>
+        <w:t xml:space="preserve"> 8-second shot. Scene: A gleaming bronze Greek Corinthian helmet from the 7th century BC with almond-shaped eye openings, a long nose guard and a narrow mouth gap, standing on a dark wooden stand in a dim armorer's workshop. Camera and motion: Slow rise from below to eye level as light grows across the bronze Corinthian helmet. Ambient: faint haze drifts in the darkness and specular highlights slide subtly across the metal as the view shifts. Lighting: single soft key light from upper left, steep falloff into near-black, crisp rim highlights on metal edges. Mood: iconic, heroic. Style: photoreal 3D CGI, museum-artifact look, dark low-key lighting with steep falloff into near-black, desaturated charcoal, graphite, worn wood, aged steel and brass, faint haze, extremely detailed surfaces, shallow depth of field. Very slow, smooth, cinematic movement, no camera shake, no cuts. No people, no hands, no text, no logos; objects keep their shape except for the described action. Audio: no speech, no music.</w:t>
+      </w:r>
+    </w:p>
+    <w:p>
+      <w:pPr>
+        <w:pStyle w:val="Heading3"/>
+      </w:pPr>
+      <w:r>
+        <w:t xml:space="preserve">Shot 4, Clip 2 of 2 (Extend the previous clip; covers ~8s of narration)</w:t>
+      </w:r>
+    </w:p>
+    <w:p>
+      <w:pPr>
+        <w:spacing w:after="120"/>
+      </w:pPr>
+      <w:r>
+        <w:rPr>
+          <w:b/>
+          <w:bCs/>
+        </w:rPr>
+        <w:t xml:space="preserve">[Script Segment]</w:t>
+      </w:r>
+      <w:r>
+        <w:t xml:space="preserve"> "Hammered from a single sheet of metal, it wrapped the entire head and face, leaving only narrow openings for the eyes and mouth."</w:t>
+      </w:r>
+    </w:p>
+    <w:p>
+      <w:pPr>
+        <w:pBdr>
+          <w:left w:val="single" w:color="B9A882" w:sz="18" w:space="8"/>
+        </w:pBdr>
+        <w:shd w:fill="F3F1EC" w:color="auto" w:val="clear"/>
+        <w:spacing w:after="160" w:line="276"/>
+        <w:ind w:left="200" w:right="120"/>
+      </w:pPr>
+      <w:r>
+        <w:rPr>
+          <w:b/>
+          <w:bCs/>
+          <w:sz w:val="20"/>
+          <w:szCs w:val="20"/>
+        </w:rPr>
+        <w:t xml:space="preserve">Video Prompt:</w:t>
+      </w:r>
+      <w:r>
+        <w:rPr>
+          <w:sz w:val="20"/>
+          <w:szCs w:val="20"/>
+        </w:rPr>
+        <w:t xml:space="preserve"> Continue the same shot for 8 seconds with the same objects, lighting and style. Scene: A gleaming bronze Greek Corinthian helmet from the 7th century BC with almond-shaped eye openings, a long nose guard and a narrow mouth gap, standing on a dark wooden stand in a dim armorer's workshop. Camera and motion: Gentle push-in toward the narrow almond-shaped eye openings until darkness inside them fills the centre of the frame. Ambient: faint haze drifts in the darkness and specular highlights slide subtly across the metal as the view shifts. Style: photoreal 3D CGI, museum-artifact look, dark low-key lighting with steep falloff into near-black, desaturated charcoal, graphite, worn wood, aged steel and brass, faint haze, extremely detailed surfaces, shallow depth of field. Very slow, smooth, cinematic movement, no camera shake, no cuts. No people, no hands, no text, no logos; objects keep their shape except for the described action. Audio: no speech, no music.</w:t>
+      </w:r>
+    </w:p>
+    <w:p>
+      <w:pPr>
+        <w:pStyle w:val="Heading3"/>
+      </w:pPr>
+      <w:r>
+        <w:t xml:space="preserve">Shot 5 (1:29, ~14s, 2 clips)</w:t>
+      </w:r>
+    </w:p>
+    <w:p>
+      <w:pPr>
+        <w:pStyle w:val="Heading3"/>
+      </w:pPr>
+      <w:r>
+        <w:t xml:space="preserve">Shot 5, Clip 1 of 2 (Frames to Video, shot image as first frame; covers ~6s of narration)</w:t>
+      </w:r>
+    </w:p>
+    <w:p>
+      <w:pPr>
+        <w:spacing w:after="120"/>
+      </w:pPr>
+      <w:r>
+        <w:rPr>
+          <w:b/>
+          <w:bCs/>
+        </w:rPr>
+        <w:t xml:space="preserve">[Script Segment]</w:t>
+      </w:r>
+      <w:r>
+        <w:t xml:space="preserve"> "Making one took enormous skill. The smith had to stretch the bronze thin enough to wear,"</w:t>
+      </w:r>
+    </w:p>
+    <w:p>
+      <w:pPr>
+        <w:pBdr>
+          <w:left w:val="single" w:color="B9A882" w:sz="18" w:space="8"/>
+        </w:pBdr>
+        <w:shd w:fill="F3F1EC" w:color="auto" w:val="clear"/>
+        <w:spacing w:after="160" w:line="276"/>
+        <w:ind w:left="200" w:right="120"/>
+      </w:pPr>
+      <w:r>
+        <w:rPr>
+          <w:b/>
+          <w:bCs/>
+          <w:sz w:val="20"/>
+          <w:szCs w:val="20"/>
+        </w:rPr>
+        <w:t xml:space="preserve">Video Prompt:</w:t>
+      </w:r>
+      <w:r>
+        <w:rPr>
+          <w:sz w:val="20"/>
+          <w:szCs w:val="20"/>
+        </w:rPr>
+        <w:t xml:space="preserve"> 8-second shot. Scene: An ancient Greek armorer's anvil in a dark workshop: a half-finished bronze Corinthian helmet shell on a curved anvil horn, small hammers and stakes around it, and beside it a torn, split bronze sheet ruined by a single mistake. Camera and motion: Slow push along the anvil toward the half-finished bronze helmet shell, tiny sparks drifting in the forge glow. Ambient: warm firelight flickers gently across the metal and tiny embers drift upward. Lighting: warm flickering orange glow from a forge or flame mixed with cold grey ambient fill. Mood: painstaking craft, fragile. Style: photoreal 3D CGI, museum-artifact look, dark low-key lighting with steep falloff into near-black, desaturated charcoal, graphite, worn wood, aged steel and brass, faint haze, extremely detailed surfaces, shallow depth of field. Very slow, smooth, cinematic movement, no camera shake, no cuts. No people, no hands, no text, no logos; objects keep their shape except for the described action. Audio: no speech, no music.</w:t>
+      </w:r>
+    </w:p>
+    <w:p>
+      <w:pPr>
+        <w:pStyle w:val="Heading3"/>
+      </w:pPr>
+      <w:r>
+        <w:t xml:space="preserve">Shot 5, Clip 2 of 2 (Extend the previous clip; covers ~9s of narration)</w:t>
+      </w:r>
+    </w:p>
+    <w:p>
+      <w:pPr>
+        <w:spacing w:after="120"/>
+      </w:pPr>
+      <w:r>
+        <w:rPr>
+          <w:b/>
+          <w:bCs/>
+        </w:rPr>
+        <w:t xml:space="preserve">[Script Segment]</w:t>
+      </w:r>
+      <w:r>
+        <w:t xml:space="preserve"> "yet keep it thick across the brow and crown, where blows landed most. A single mistake could tear the sheet and ruin weeks of work."</w:t>
+      </w:r>
+    </w:p>
+    <w:p>
+      <w:pPr>
+        <w:pBdr>
+          <w:left w:val="single" w:color="B9A882" w:sz="18" w:space="8"/>
+        </w:pBdr>
+        <w:shd w:fill="F3F1EC" w:color="auto" w:val="clear"/>
+        <w:spacing w:after="160" w:line="276"/>
+        <w:ind w:left="200" w:right="120"/>
+      </w:pPr>
+      <w:r>
+        <w:rPr>
+          <w:b/>
+          <w:bCs/>
+          <w:sz w:val="20"/>
+          <w:szCs w:val="20"/>
+        </w:rPr>
+        <w:t xml:space="preserve">Video Prompt:</w:t>
+      </w:r>
+      <w:r>
+        <w:rPr>
+          <w:sz w:val="20"/>
+          <w:szCs w:val="20"/>
+        </w:rPr>
+        <w:t xml:space="preserve"> Continue the same shot for 8 seconds with the same objects, lighting and style. Scene: An ancient Greek armorer's anvil in a dark workshop: a half-finished bronze Corinthian helmet shell on a curved anvil horn, small hammers and stakes around it, and beside it a torn, split bronze sheet ruined by a single mistake. Camera and motion: Slow slide to the torn bronze sheet beside it, ending close on its jagged tear. Ambient: warm firelight flickers gently across the metal and tiny embers drift upward. Style: photoreal 3D CGI, museum-artifact look, dark low-key lighting with steep falloff into near-black, desaturated charcoal, graphite, worn wood, aged steel and brass, faint haze, extremely detailed surfaces, shallow depth of field. Very slow, smooth, cinematic movement, no camera shake, no cuts. No people, no hands, no text, no logos; objects keep their shape except for the described action. Audio: no speech, no music.</w:t>
+      </w:r>
+    </w:p>
+    <w:p>
+      <w:pPr>
+        <w:pStyle w:val="Heading3"/>
+      </w:pPr>
+      <w:r>
+        <w:t xml:space="preserve">Shot 6 (1:43, ~18s, 3 clips)</w:t>
+      </w:r>
+    </w:p>
+    <w:p>
+      <w:pPr>
+        <w:pStyle w:val="Heading3"/>
+      </w:pPr>
+      <w:r>
+        <w:t xml:space="preserve">Shot 6, Clip 1 of 3 (Frames to Video, shot image as first frame; covers ~7s of narration)</w:t>
+      </w:r>
+    </w:p>
+    <w:p>
+      <w:pPr>
+        <w:spacing w:after="120"/>
+      </w:pPr>
+      <w:r>
+        <w:rPr>
+          <w:b/>
+          <w:bCs/>
+        </w:rPr>
+        <w:t xml:space="preserve">[Script Segment]</w:t>
+      </w:r>
+      <w:r>
+        <w:t xml:space="preserve"> "It was superb protection. And that was exactly the problem. A soldier inside a Corinthian helmet could barely hear orders"</w:t>
+      </w:r>
+    </w:p>
+    <w:p>
+      <w:pPr>
+        <w:pBdr>
+          <w:left w:val="single" w:color="B9A882" w:sz="18" w:space="8"/>
+        </w:pBdr>
+        <w:shd w:fill="F3F1EC" w:color="auto" w:val="clear"/>
+        <w:spacing w:after="160" w:line="276"/>
+        <w:ind w:left="200" w:right="120"/>
+      </w:pPr>
+      <w:r>
+        <w:rPr>
+          <w:b/>
+          <w:bCs/>
+          <w:sz w:val="20"/>
+          <w:szCs w:val="20"/>
+        </w:rPr>
+        <w:t xml:space="preserve">Video Prompt:</w:t>
+      </w:r>
+      <w:r>
+        <w:rPr>
+          <w:sz w:val="20"/>
+          <w:szCs w:val="20"/>
+        </w:rPr>
+        <w:t xml:space="preserve"> 8-second shot. Scene: First-person view from inside a bronze Corinthian helmet, looking out through its narrow eye slits at a blurred dusty ancient Greek battlefield of spears, the frame edges blocked by dark bronze. Camera and motion: Static first-person view through the eye slits, the distant battlefield blurred and slightly muffled, dust drifting. Ambient: thin atmospheric haze drifts slowly through the backlight. Lighting: soft backlight creating a thin glowing rim around the silhouette, front mostly in shadow. Mood: claustrophobic, isolated. Style: photoreal 3D CGI, museum-artifact look, dark low-key lighting with steep falloff into near-black, desaturated charcoal, graphite, worn wood, aged steel and brass, faint haze, extremely detailed surfaces, shallow depth of field. Very slow, smooth, cinematic movement, no camera shake, no cuts. No people, no hands, no text, no logos; objects keep their shape except for the described action. Audio: no speech, no music.</w:t>
+      </w:r>
+    </w:p>
+    <w:p>
+      <w:pPr>
+        <w:pStyle w:val="Heading3"/>
+      </w:pPr>
+      <w:r>
+        <w:t xml:space="preserve">Shot 6, Clip 2 of 3 (Extend the previous clip; covers ~7s of narration)</w:t>
+      </w:r>
+    </w:p>
+    <w:p>
+      <w:pPr>
+        <w:spacing w:after="120"/>
+      </w:pPr>
+      <w:r>
+        <w:rPr>
+          <w:b/>
+          <w:bCs/>
+        </w:rPr>
+        <w:t xml:space="preserve">[Script Segment]</w:t>
+      </w:r>
+      <w:r>
+        <w:t xml:space="preserve"> "and could see almost nothing to his sides. So over the next few centuries, Greek designs slowly opened up."</w:t>
+      </w:r>
+    </w:p>
+    <w:p>
+      <w:pPr>
+        <w:pBdr>
+          <w:left w:val="single" w:color="B9A882" w:sz="18" w:space="8"/>
+        </w:pBdr>
+        <w:shd w:fill="F3F1EC" w:color="auto" w:val="clear"/>
+        <w:spacing w:after="160" w:line="276"/>
+        <w:ind w:left="200" w:right="120"/>
+      </w:pPr>
+      <w:r>
+        <w:rPr>
+          <w:b/>
+          <w:bCs/>
+          <w:sz w:val="20"/>
+          <w:szCs w:val="20"/>
+        </w:rPr>
+        <w:t xml:space="preserve">Video Prompt:</w:t>
+      </w:r>
+      <w:r>
+        <w:rPr>
+          <w:sz w:val="20"/>
+          <w:szCs w:val="20"/>
+        </w:rPr>
+        <w:t xml:space="preserve"> Continue the same shot for 8 seconds with the same objects, lighting and style. Scene: First-person view from inside a bronze Corinthian helmet, looking out through its narrow eye slits at a blurred dusty ancient Greek battlefield of spears, the frame edges blocked by dark bronze. Camera and motion: Slow head-turn to the left revealing only dark bronze blocking the side view, then back to the narrow strip ahead. Ambient: thin atmospheric haze drifts slowly through the backlight. Style: photoreal 3D CGI, museum-artifact look, dark low-key lighting with steep falloff into near-black, desaturated charcoal, graphite, worn wood, aged steel and brass, faint haze, extremely detailed surfaces, shallow depth of field. Very slow, smooth, cinematic movement, no camera shake, no cuts. No people, no hands, no text, no logos; objects keep their shape except for the described action. Audio: no speech, no music.</w:t>
+      </w:r>
+    </w:p>
+    <w:p>
+      <w:pPr>
+        <w:pStyle w:val="Heading3"/>
+      </w:pPr>
+      <w:r>
+        <w:t xml:space="preserve">Shot 6, Clip 3 of 3 (Extend the previous clip; covers ~4s of narration)</w:t>
+      </w:r>
+    </w:p>
+    <w:p>
+      <w:pPr>
+        <w:spacing w:after="120"/>
+      </w:pPr>
+      <w:r>
+        <w:rPr>
+          <w:b/>
+          <w:bCs/>
+        </w:rPr>
+        <w:t xml:space="preserve">[Script Segment]</w:t>
+      </w:r>
+      <w:r>
+        <w:t xml:space="preserve"> "Cheek pieces became hinged. Ear openings appeared. Protection was traded for awareness."</w:t>
+      </w:r>
+    </w:p>
+    <w:p>
+      <w:pPr>
+        <w:pBdr>
+          <w:left w:val="single" w:color="B9A882" w:sz="18" w:space="8"/>
+        </w:pBdr>
+        <w:shd w:fill="F3F1EC" w:color="auto" w:val="clear"/>
+        <w:spacing w:after="160" w:line="276"/>
+        <w:ind w:left="200" w:right="120"/>
+      </w:pPr>
+      <w:r>
+        <w:rPr>
+          <w:b/>
+          <w:bCs/>
+          <w:sz w:val="20"/>
+          <w:szCs w:val="20"/>
+        </w:rPr>
+        <w:t xml:space="preserve">Video Prompt:</w:t>
+      </w:r>
+      <w:r>
+        <w:rPr>
+          <w:sz w:val="20"/>
+          <w:szCs w:val="20"/>
+        </w:rPr>
+        <w:t xml:space="preserve"> Continue the same shot for 8 seconds with the same objects, lighting and style. Scene: First-person view from inside a bronze Corinthian helmet, looking out through its narrow eye slits at a blurred dusty ancient Greek battlefield of spears, the frame edges blocked by dark bronze. Camera and motion: Slow pull back out of the helmet so the eye slits shrink and the dark bronze rim comes into view. Ambient: thin atmospheric haze drifts slowly through the backlight. Style: photoreal 3D CGI, museum-artifact look, dark low-key lighting with steep falloff into near-black, desaturated charcoal, graphite, worn wood, aged steel and brass, faint haze, extremely detailed surfaces, shallow depth of field. Very slow, smooth, cinematic movement, no camera shake, no cuts. No people, no hands, no text, no logos; objects keep their shape except for the described action. Audio: no speech, no music.</w:t>
+      </w:r>
+    </w:p>
+    <w:p>
+      <w:pPr>
+        <w:pStyle w:val="Heading3"/>
+      </w:pPr>
+      <w:r>
+        <w:t xml:space="preserve">Shot 7 (2:01, ~21s, 3 clips)</w:t>
+      </w:r>
+    </w:p>
+    <w:p>
+      <w:pPr>
+        <w:pStyle w:val="Heading3"/>
+      </w:pPr>
+      <w:r>
+        <w:t xml:space="preserve">Shot 7, Clip 1 of 3 (Frames to Video, shot image as first frame; covers ~8s of narration)</w:t>
+      </w:r>
+    </w:p>
+    <w:p>
+      <w:pPr>
+        <w:spacing w:after="120"/>
+      </w:pPr>
+      <w:r>
+        <w:rPr>
+          <w:b/>
+          <w:bCs/>
+        </w:rPr>
+        <w:t xml:space="preserve">[Script Segment]</w:t>
+      </w:r>
+      <w:r>
+        <w:t xml:space="preserve"> "Then came Rome. And Rome faced a different problem entirely. Scale. Hand-shaping a full-face helmet took a skilled craftsman days of work."</w:t>
+      </w:r>
+    </w:p>
+    <w:p>
+      <w:pPr>
+        <w:pBdr>
+          <w:left w:val="single" w:color="B9A882" w:sz="18" w:space="8"/>
+        </w:pBdr>
+        <w:shd w:fill="F3F1EC" w:color="auto" w:val="clear"/>
+        <w:spacing w:after="160" w:line="276"/>
+        <w:ind w:left="200" w:right="120"/>
+      </w:pPr>
+      <w:r>
+        <w:rPr>
+          <w:b/>
+          <w:bCs/>
+          <w:sz w:val="20"/>
+          <w:szCs w:val="20"/>
+        </w:rPr>
+        <w:t xml:space="preserve">Video Prompt:</w:t>
+      </w:r>
+      <w:r>
+        <w:rPr>
+          <w:sz w:val="20"/>
+          <w:szCs w:val="20"/>
+        </w:rPr>
+        <w:t xml:space="preserve"> 8-second shot. Scene: A vast dark stone Roman armory with endless rows of identical plain bronze Montefortino helmets with top knobs, small neck guards and cheek pieces, lined up on wooden racks into the darkness. Camera and motion: Slow push into the dark armory as pools of light reveal the first racks of helmets. Ambient: fine dust motes float slowly through the pools of light. Lighting: narrow overhead spotlight forming a pool of light on the table, everything else falling into black. Mood: imperial, massive scale. Style: photoreal 3D CGI, museum-artifact look, dark low-key lighting with steep falloff into near-black, desaturated charcoal, graphite, worn wood, aged steel and brass, faint haze, extremely detailed surfaces, shallow depth of field. Very slow, smooth, cinematic movement, no camera shake, no cuts. No people, no hands, no text, no logos; objects keep their shape except for the described action. Audio: no speech, no music.</w:t>
+      </w:r>
+    </w:p>
+    <w:p>
+      <w:pPr>
+        <w:pStyle w:val="Heading3"/>
+      </w:pPr>
+      <w:r>
+        <w:t xml:space="preserve">Shot 7, Clip 2 of 3 (Extend the previous clip; covers ~8s of narration)</w:t>
+      </w:r>
+    </w:p>
+    <w:p>
+      <w:pPr>
+        <w:spacing w:after="120"/>
+      </w:pPr>
+      <w:r>
+        <w:rPr>
+          <w:b/>
+          <w:bCs/>
+        </w:rPr>
+        <w:t xml:space="preserve">[Script Segment]</w:t>
+      </w:r>
+      <w:r>
+        <w:t xml:space="preserve"> "Rome needed to equip hundreds of thousands of men. So its legions adopted a simpler design borrowed from the Celts, the Montefortino."</w:t>
+      </w:r>
+    </w:p>
+    <w:p>
+      <w:pPr>
+        <w:pBdr>
+          <w:left w:val="single" w:color="B9A882" w:sz="18" w:space="8"/>
+        </w:pBdr>
+        <w:shd w:fill="F3F1EC" w:color="auto" w:val="clear"/>
+        <w:spacing w:after="160" w:line="276"/>
+        <w:ind w:left="200" w:right="120"/>
+      </w:pPr>
+      <w:r>
+        <w:rPr>
+          <w:b/>
+          <w:bCs/>
+          <w:sz w:val="20"/>
+          <w:szCs w:val="20"/>
+        </w:rPr>
+        <w:t xml:space="preserve">Video Prompt:</w:t>
+      </w:r>
+      <w:r>
+        <w:rPr>
+          <w:sz w:val="20"/>
+          <w:szCs w:val="20"/>
+        </w:rPr>
+        <w:t xml:space="preserve"> Continue the same shot for 8 seconds with the same objects, lighting and style. Scene: A vast dark stone Roman armory with endless rows of identical plain bronze Montefortino helmets with top knobs, small neck guards and cheek pieces, lined up on wooden racks into the darkness. Camera and motion: Steady glide down the central aisle between endless racks of identical Montefortino helmets. Ambient: fine dust motes float slowly through the pools of light. Style: photoreal 3D CGI, museum-artifact look, dark low-key lighting with steep falloff into near-black, desaturated charcoal, graphite, worn wood, aged steel and brass, faint haze, extremely detailed surfaces, shallow depth of field. Very slow, smooth, cinematic movement, no camera shake, no cuts. No people, no hands, no text, no logos; objects keep their shape except for the described action. Audio: no speech, no music.</w:t>
+      </w:r>
+    </w:p>
+    <w:p>
+      <w:pPr>
+        <w:pStyle w:val="Heading3"/>
+      </w:pPr>
+      <w:r>
+        <w:t xml:space="preserve">Shot 7, Clip 3 of 3 (Extend the previous clip; covers ~6s of narration)</w:t>
+      </w:r>
+    </w:p>
+    <w:p>
+      <w:pPr>
+        <w:spacing w:after="120"/>
+      </w:pPr>
+      <w:r>
+        <w:rPr>
+          <w:b/>
+          <w:bCs/>
+        </w:rPr>
+        <w:t xml:space="preserve">[Script Segment]</w:t>
+      </w:r>
+      <w:r>
+        <w:t xml:space="preserve"> "A plain rounded bowl with a small neck guard and cheek pieces. Fast to make. Easy to repair."</w:t>
+      </w:r>
+    </w:p>
+    <w:p>
+      <w:pPr>
+        <w:pBdr>
+          <w:left w:val="single" w:color="B9A882" w:sz="18" w:space="8"/>
+        </w:pBdr>
+        <w:shd w:fill="F3F1EC" w:color="auto" w:val="clear"/>
+        <w:spacing w:after="160" w:line="276"/>
+        <w:ind w:left="200" w:right="120"/>
+      </w:pPr>
+      <w:r>
+        <w:rPr>
+          <w:b/>
+          <w:bCs/>
+          <w:sz w:val="20"/>
+          <w:szCs w:val="20"/>
+        </w:rPr>
+        <w:t xml:space="preserve">Video Prompt:</w:t>
+      </w:r>
+      <w:r>
+        <w:rPr>
+          <w:sz w:val="20"/>
+          <w:szCs w:val="20"/>
+        </w:rPr>
+        <w:t xml:space="preserve"> Continue the same shot for 8 seconds with the same objects, lighting and style. Scene: A vast dark stone Roman armory with endless rows of identical plain bronze Montefortino helmets with top knobs, small neck guards and cheek pieces, lined up on wooden racks into the darkness. Camera and motion: Slow push-in on one Montefortino helmet in the foreground, showing its rounded bowl, small neck guard and cheek pieces. Ambient: fine dust motes float slowly through the pools of light. Style: photoreal 3D CGI, museum-artifact look, dark low-key lighting with steep falloff into near-black, desaturated charcoal, graphite, worn wood, aged steel and brass, faint haze, extremely detailed surfaces, shallow depth of field. Very slow, smooth, cinematic movement, no camera shake, no cuts. No people, no hands, no text, no logos; objects keep their shape except for the described action. Audio: no speech, no music.</w:t>
+      </w:r>
+    </w:p>
+    <w:p>
+      <w:pPr>
+        <w:pStyle w:val="Heading3"/>
+      </w:pPr>
+      <w:r>
+        <w:t xml:space="preserve">Shot 8 (2:22, ~8s, 1 clip)</w:t>
+      </w:r>
+    </w:p>
+    <w:p>
+      <w:pPr>
+        <w:pStyle w:val="Heading3"/>
+      </w:pPr>
+      <w:r>
+        <w:t xml:space="preserve">Shot 8, Clip 1 of 1 (Frames to Video, shot image as first frame; covers ~8s of narration)</w:t>
+      </w:r>
+    </w:p>
+    <w:p>
+      <w:pPr>
+        <w:spacing w:after="120"/>
+      </w:pPr>
+      <w:r>
+        <w:rPr>
+          <w:b/>
+          <w:bCs/>
+        </w:rPr>
+        <w:t xml:space="preserve">[Script Segment]</w:t>
+      </w:r>
+      <w:r>
         <w:t xml:space="preserve"> "These helmets were handed down from soldier to soldier, and some survive today with several different owners' names punched into the metal."</w:t>
       </w:r>
     </w:p>
@@ -6528,15 +7358,23 @@
           <w:sz w:val="20"/>
           <w:szCs w:val="20"/>
         </w:rPr>
-        <w:t xml:space="preserve"> Start frame: Extreme close-up of the neck guard of a worn ancient bronze Roman Montefortino helmet, rows of dotted punched Latin letters from several different owners, green patina in the grooves. Camera and subject motion: Very slow pan along the punched letters with a gentle focus pull from one name to the next, one continuous unbroken move. Framing: macro close-up, razor-thin depth of field. Lighting: low raking side light from the right, long soft shadows, specular glints along edges. Ambient motion: faint haze drifts in the darkness and the raking light glints softly along the edges as the view shifts. Mood: personal, haunting. Motion: very slow, smooth, weighted and cinematic, no camera shake, no sudden cuts. Keep every object, material and the lighting consistent with the start frame; add nothing beyond what the motion describes, never people, hands, text or logos; no warping or shape changes other than the described action. Visual style: Dark Archive Macro, a photoreal 3D CGI render in a museum-artifact still-life look, low-key lighting with steep falloff into near-black, desaturated charcoal, graphite, worn wood, aged steel and dull bronze with warm brass accents, extremely high surface detail. Duration: longest clip available (5–10 seconds), 16:9; slow to ~8 seconds in the edit.</w:t>
-      </w:r>
-    </w:p>
-    <w:p>
-      <w:pPr>
-        <w:pStyle w:val="Heading3"/>
-      </w:pPr>
-      <w:r>
-        <w:t xml:space="preserve">Shot 9 (2:30–2:45, ~15s)</w:t>
+        <w:t xml:space="preserve"> 8-second shot. Scene: Extreme close-up of the neck guard of a worn ancient bronze Roman Montefortino helmet, rows of dotted punched Latin letters from several different owners, green patina in the grooves. Camera and motion: Very slow pan along the punched Latin letters on the neck guard with a gentle focus pull from one owner's name to the next. Ambient: faint haze drifts in the darkness and the raking light glints softly along the edges as the view shifts. Lighting: low raking side light from the right, long soft shadows, specular glints along edges. Mood: personal, haunting. Style: photoreal 3D CGI, museum-artifact look, dark low-key lighting with steep falloff into near-black, desaturated charcoal, graphite, worn wood, aged steel and brass, faint haze, extremely detailed surfaces, shallow depth of field. Very slow, smooth, cinematic movement, no camera shake, no cuts. No people, no hands, no text, no logos; objects keep their shape except for the described action. Audio: no speech, no music.</w:t>
+      </w:r>
+    </w:p>
+    <w:p>
+      <w:pPr>
+        <w:pStyle w:val="Heading3"/>
+      </w:pPr>
+      <w:r>
+        <w:t xml:space="preserve">Shot 9 (2:30, ~15s, 2 clips)</w:t>
+      </w:r>
+    </w:p>
+    <w:p>
+      <w:pPr>
+        <w:pStyle w:val="Heading3"/>
+      </w:pPr>
+      <w:r>
+        <w:t xml:space="preserve">Shot 9, Clip 1 of 2 (Frames to Video, shot image as first frame; covers ~8s of narration)</w:t>
       </w:r>
     </w:p>
     <w:p>
@@ -6551,7 +7389,7 @@
         <w:t xml:space="preserve">[Script Segment]</w:t>
       </w:r>
       <w:r>
-        <w:t xml:space="preserve"> "Over time, Roman workshops shifted from bronze to iron. Iron was cheaper and far more plentiful. And with it came the Imperial Gallic helmet, with a reinforced brow ridge to stop downward blows and a wide flared guard protecting the back of the neck."</w:t>
+        <w:t xml:space="preserve"> "Over time, Roman workshops shifted from bronze to iron. Iron was cheaper and far more plentiful. And with it came the Imperial Gallic helmet,"</w:t>
       </w:r>
     </w:p>
     <w:p>
@@ -6577,15 +7415,15 @@
           <w:sz w:val="20"/>
           <w:szCs w:val="20"/>
         </w:rPr>
-        <w:t xml:space="preserve"> Start frame: A polished iron Roman Imperial Gallic helmet with brass decorations, a reinforced brow ridge across the front and a wide flared neck guard, on a dark stand beside a forge bench with glowing coals and a duller bronze helmet behind it. Camera and subject motion: Slow orbit from the front of the helmet, showing the brow ridge, around to the rear, revealing the wide flared neck guard; firelight flickers on the iron, one continuous unbroken move. Framing: low-angle 3/4 medium close-up. Lighting: warm flickering orange glow from a forge or flame mixed with cold grey ambient fill. Ambient motion: warm firelight flickers gently across the metal and tiny embers drift upward. Mood: powerful, imperial. Motion: very slow, smooth, weighted and cinematic, no camera shake, no sudden cuts. Keep every object, material and the lighting consistent with the start frame; add nothing beyond what the motion describes, never people, hands, text or logos; no warping or shape changes other than the described action. Visual style: Dark Archive Macro, a photoreal 3D CGI render in a museum-artifact still-life look, low-key lighting with steep falloff into near-black, desaturated charcoal, graphite, worn wood, aged steel and dull bronze with warm brass accents, extremely high surface detail. Duration: longest clip available (5–10 seconds), 16:9; slow to ~15 seconds in the edit.</w:t>
-      </w:r>
-    </w:p>
-    <w:p>
-      <w:pPr>
-        <w:pStyle w:val="Heading3"/>
-      </w:pPr>
-      <w:r>
-        <w:t xml:space="preserve">Shot 10 (2:45–3:07, ~22s)</w:t>
+        <w:t xml:space="preserve"> 8-second shot. Scene: A polished iron Roman Imperial Gallic helmet with brass decorations, a reinforced brow ridge across the front and a wide flared neck guard, on a dark stand beside a forge bench with glowing coals and a duller bronze helmet behind it. Camera and motion: Slow push from the duller bronze helmet to the polished iron Imperial Gallic helmet as forge light flickers on the iron. Ambient: warm firelight flickers gently across the metal and tiny embers drift upward. Lighting: warm flickering orange glow from a forge or flame mixed with cold grey ambient fill. Mood: powerful, imperial. Style: photoreal 3D CGI, museum-artifact look, dark low-key lighting with steep falloff into near-black, desaturated charcoal, graphite, worn wood, aged steel and brass, faint haze, extremely detailed surfaces, shallow depth of field. Very slow, smooth, cinematic movement, no camera shake, no cuts. No people, no hands, no text, no logos; objects keep their shape except for the described action. Audio: no speech, no music.</w:t>
+      </w:r>
+    </w:p>
+    <w:p>
+      <w:pPr>
+        <w:pStyle w:val="Heading3"/>
+      </w:pPr>
+      <w:r>
+        <w:t xml:space="preserve">Shot 9, Clip 2 of 2 (Extend the previous clip; covers ~7s of narration)</w:t>
       </w:r>
     </w:p>
     <w:p>
@@ -6600,7 +7438,7 @@
         <w:t xml:space="preserve">[Script Segment]</w:t>
       </w:r>
       <w:r>
-        <w:t xml:space="preserve"> "When the Western Empire collapsed, so did its workshops. Without large-scale industry, smiths turned to a design that needed less skill, the spangenhelm. Instead of one solid bowl, it used a frame of iron strips with plates riveted between them. It was easy to build. But every seam was a weak point. A hard enough blow could split a joint and drive straight through."</w:t>
+        <w:t xml:space="preserve"> "with a reinforced brow ridge to stop downward blows and a wide flared guard protecting the back of the neck."</w:t>
       </w:r>
     </w:p>
     <w:p>
@@ -6626,15 +7464,23 @@
           <w:sz w:val="20"/>
           <w:szCs w:val="20"/>
         </w:rPr>
-        <w:t xml:space="preserve"> Start frame: An abandoned Roman armory in ruins with collapsed roof beams and dust, and in the foreground on a broken bench an early medieval spangenhelm: a frame of iron strips with riveted plates, one seam burst open, a plate bent inward and broken rivets scattered beside it. Camera and subject motion: Slow crane down through falling dust from the ruined roof to the damaged spangenhelm, ending close on the split seam; a loose rivet rolls to a stop, one continuous unbroken move. Framing: high 3/4 angle medium close-up. Lighting: soft backlight creating a thin glowing rim around the silhouette, front mostly in shadow. Ambient motion: thin atmospheric haze drifts slowly through the backlight. Mood: decline, fragile, grim. Motion: very slow, smooth, weighted and cinematic, no camera shake, no sudden cuts. Keep every object, material and the lighting consistent with the start frame; add nothing beyond what the motion describes, never people, hands, text or logos; no warping or shape changes other than the described action. Visual style: Dark Archive Macro, a photoreal 3D CGI render in a museum-artifact still-life look, low-key lighting with steep falloff into near-black, desaturated charcoal, graphite, worn wood, aged steel and dull bronze with warm brass accents, extremely high surface detail. Duration: longest clip available (5–10 seconds), 16:9; slow to ~22 seconds in the edit.</w:t>
-      </w:r>
-    </w:p>
-    <w:p>
-      <w:pPr>
-        <w:pStyle w:val="Heading3"/>
-      </w:pPr>
-      <w:r>
-        <w:t xml:space="preserve">Shot 11 (3:07–3:28, ~21s)</w:t>
+        <w:t xml:space="preserve"> Continue the same shot for 8 seconds with the same objects, lighting and style. Scene: A polished iron Roman Imperial Gallic helmet with brass decorations, a reinforced brow ridge across the front and a wide flared neck guard, on a dark stand beside a forge bench with glowing coals and a duller bronze helmet behind it. Camera and motion: Slow orbit from the reinforced brow ridge at the front around to the wide flared neck guard at the back. Ambient: warm firelight flickers gently across the metal and tiny embers drift upward. Style: photoreal 3D CGI, museum-artifact look, dark low-key lighting with steep falloff into near-black, desaturated charcoal, graphite, worn wood, aged steel and brass, faint haze, extremely detailed surfaces, shallow depth of field. Very slow, smooth, cinematic movement, no camera shake, no cuts. No people, no hands, no text, no logos; objects keep their shape except for the described action. Audio: no speech, no music.</w:t>
+      </w:r>
+    </w:p>
+    <w:p>
+      <w:pPr>
+        <w:pStyle w:val="Heading3"/>
+      </w:pPr>
+      <w:r>
+        <w:t xml:space="preserve">Shot 10 (2:45, ~22s, 3 clips)</w:t>
+      </w:r>
+    </w:p>
+    <w:p>
+      <w:pPr>
+        <w:pStyle w:val="Heading3"/>
+      </w:pPr>
+      <w:r>
+        <w:t xml:space="preserve">Shot 10, Clip 1 of 3 (Frames to Video, shot image as first frame; covers ~8s of narration)</w:t>
       </w:r>
     </w:p>
     <w:p>
@@ -6649,7 +7495,7 @@
         <w:t xml:space="preserve">[Script Segment]</w:t>
       </w:r>
       <w:r>
-        <w:t xml:space="preserve"> "By the 11th century, smiths had relearned how to raise a helmet from a single piece of iron. The result was the Norman nasal helmet. A conical shell that deflected blows, with one narrow bar running down over the nose. Yet the rest of the face remained completely exposed. And on medieval battlefields, arrows and blades went looking for exactly that."</w:t>
+        <w:t xml:space="preserve"> "When the Western Empire collapsed, so did its workshops. Without large-scale industry, smiths turned to a design that needed less skill, the spangenhelm."</w:t>
       </w:r>
     </w:p>
     <w:p>
@@ -6675,15 +7521,15 @@
           <w:sz w:val="20"/>
           <w:szCs w:val="20"/>
         </w:rPr>
-        <w:t xml:space="preserve"> Start frame: A conical Norman nasal helmet from the 11th century, raised from a single piece of iron with one narrow bar running down over the nose, on a featureless matte-grey display mannequin head in a dark medieval forge, bodkin arrows stuck in muddy ground beside it. Camera and subject motion: Slow orbit from the profile of the conical shell to a frontal view, ending on the exposed face area; smoke drifts low across the ground, one continuous unbroken move. Framing: eye-level 3/4 close-up. Lighting: warm flickering orange glow from a forge or flame mixed with cold grey ambient fill. Ambient motion: warm firelight flickers gently across the metal and tiny embers drift upward. Mood: austere, vulnerable. Motion: very slow, smooth, weighted and cinematic, no camera shake, no sudden cuts. Keep every object, material and the lighting consistent with the start frame; add nothing beyond what the motion describes, never people, hands, text or logos; no warping or shape changes other than the described action. Visual style: Dark Archive Macro, a photoreal 3D CGI render in a museum-artifact still-life look, low-key lighting with steep falloff into near-black, desaturated charcoal, graphite, worn wood, aged steel and dull bronze with warm brass accents, extremely high surface detail. Duration: longest clip available (5–10 seconds), 16:9; slow to ~21 seconds in the edit.</w:t>
-      </w:r>
-    </w:p>
-    <w:p>
-      <w:pPr>
-        <w:pStyle w:val="Heading3"/>
-      </w:pPr>
-      <w:r>
-        <w:t xml:space="preserve">Shot 12 (3:28–3:46, ~19s)</w:t>
+        <w:t xml:space="preserve"> 8-second shot. Scene: An abandoned Roman armory in ruins with collapsed roof beams and dust, and in the foreground on a broken bench an early medieval spangenhelm: a frame of iron strips with riveted plates, one seam burst open, a plate bent inward and broken rivets scattered beside it. Camera and motion: Slow crane down through falling dust from the broken roof of the ruined armory toward the spangenhelm on the bench. Ambient: thin atmospheric haze drifts slowly through the backlight. Lighting: soft backlight creating a thin glowing rim around the silhouette, front mostly in shadow. Mood: decline, fragile, grim. Style: photoreal 3D CGI, museum-artifact look, dark low-key lighting with steep falloff into near-black, desaturated charcoal, graphite, worn wood, aged steel and brass, faint haze, extremely detailed surfaces, shallow depth of field. Very slow, smooth, cinematic movement, no camera shake, no cuts. No people, no hands, no text, no logos; objects keep their shape except for the described action. Audio: no speech, no music.</w:t>
+      </w:r>
+    </w:p>
+    <w:p>
+      <w:pPr>
+        <w:pStyle w:val="Heading3"/>
+      </w:pPr>
+      <w:r>
+        <w:t xml:space="preserve">Shot 10, Clip 2 of 3 (Extend the previous clip; covers ~6s of narration)</w:t>
       </w:r>
     </w:p>
     <w:p>
@@ -6698,7 +7544,7 @@
         <w:t xml:space="preserve">[Script Segment]</w:t>
       </w:r>
       <w:r>
-        <w:t xml:space="preserve"> "So armorers decided to cover everything. In the late 12th century, the great helm appeared. A flat-topped steel cylinder that enclosed the entire head. For the first time since the Greeks, a soldier's face vanished behind metal. Knights began painting coats of arms on their shields and surcoats, simply so they could be recognized."</w:t>
+        <w:t xml:space="preserve"> "Instead of one solid bowl, it used a frame of iron strips with plates riveted between them."</w:t>
       </w:r>
     </w:p>
     <w:p>
@@ -6724,15 +7570,15 @@
           <w:sz w:val="20"/>
           <w:szCs w:val="20"/>
         </w:rPr>
-        <w:t xml:space="preserve"> Start frame: A flat-topped steel medieval great helm from the late 12th century with narrow eye slits and breathing holes on a dark stand, and behind it a row of heater shields with distinct painted heraldic coats of arms leaning against a dark stone wall. Camera and subject motion: Slow push-in on the great helm's eye slit, then a rack focus to the painted shields behind as the camera drifts slightly sideways, one continuous unbroken move. Framing: low-angle frontal medium close-up. Lighting: narrow overhead spotlight forming a pool of light on the table, everything else falling into black. Ambient motion: fine dust motes float slowly through the pools of light. Mood: imposing, pageantry. Motion: very slow, smooth, weighted and cinematic, no camera shake, no sudden cuts. Keep every object, material and the lighting consistent with the start frame; add nothing beyond what the motion describes, never people, hands, text or logos; no warping or shape changes other than the described action. Visual style: Dark Archive Macro, a photoreal 3D CGI render in a museum-artifact still-life look, low-key lighting with steep falloff into near-black, desaturated charcoal, graphite, worn wood, aged steel and dull bronze with warm brass accents, extremely high surface detail. Duration: longest clip available (5–10 seconds), 16:9; slow to ~19 seconds in the edit.</w:t>
-      </w:r>
-    </w:p>
-    <w:p>
-      <w:pPr>
-        <w:pStyle w:val="Heading3"/>
-      </w:pPr>
-      <w:r>
-        <w:t xml:space="preserve">Shot 13 (3:46–4:03, ~17s)</w:t>
+        <w:t xml:space="preserve"> Continue the same shot for 8 seconds with the same objects, lighting and style. Scene: An abandoned Roman armory in ruins with collapsed roof beams and dust, and in the foreground on a broken bench an early medieval spangenhelm: a frame of iron strips with riveted plates, one seam burst open, a plate bent inward and broken rivets scattered beside it. Camera and motion: Slow orbit around the spangenhelm showing its iron frame strips and riveted plates. Ambient: thin atmospheric haze drifts slowly through the backlight. Style: photoreal 3D CGI, museum-artifact look, dark low-key lighting with steep falloff into near-black, desaturated charcoal, graphite, worn wood, aged steel and brass, faint haze, extremely detailed surfaces, shallow depth of field. Very slow, smooth, cinematic movement, no camera shake, no cuts. No people, no hands, no text, no logos; objects keep their shape except for the described action. Audio: no speech, no music.</w:t>
+      </w:r>
+    </w:p>
+    <w:p>
+      <w:pPr>
+        <w:pStyle w:val="Heading3"/>
+      </w:pPr>
+      <w:r>
+        <w:t xml:space="preserve">Shot 10, Clip 3 of 3 (Extend the previous clip; covers ~8s of narration)</w:t>
       </w:r>
     </w:p>
     <w:p>
@@ -6747,7 +7593,7 @@
         <w:t xml:space="preserve">[Script Segment]</w:t>
       </w:r>
       <w:r>
-        <w:t xml:space="preserve"> "But the flat top had a fatal flaw. It met every overhead strike head-on, absorbing the full force instead of turning it aside. So armorers raised the crown into a point. This was the sugarloaf helm, and it did what flat steel could not. It made blades slide off."</w:t>
+        <w:t xml:space="preserve"> "It was easy to build. But every seam was a weak point. A hard enough blow could split a joint and drive straight through."</w:t>
       </w:r>
     </w:p>
     <w:p>
@@ -6773,15 +7619,23 @@
           <w:sz w:val="20"/>
           <w:szCs w:val="20"/>
         </w:rPr>
-        <w:t xml:space="preserve"> Start frame: Two medieval helmets on a dark table: a flat-topped great helm with a dent in its crown and a pointed sugarloaf helm, a heavy sword blade glancing off the sugarloaf's pointed crown with a streak of sparks trailing along the curve. Camera and subject motion: Slow-motion sword strike: the blade comes down, glances off the pointed crown, and sparks trail along the curve, while the flat-topped helm sits dented in the background, one continuous unbroken move. Framing: low side angle close-up. Lighting: low raking side light from the right, long soft shadows, specular glints along edges. Ambient motion: faint haze drifts in the darkness and the raking light glints softly along the edges as the view shifts. Mood: tense, then satisfying. Motion: very slow, smooth, weighted and cinematic, no camera shake, no sudden cuts. Keep every object, material and the lighting consistent with the start frame; add nothing beyond what the motion describes, never people, hands, text or logos; no warping or shape changes other than the described action. Visual style: Dark Archive Macro, a photoreal 3D CGI render in a museum-artifact still-life look, low-key lighting with steep falloff into near-black, desaturated charcoal, graphite, worn wood, aged steel and dull bronze with warm brass accents, extremely high surface detail. Duration: longest clip available (5–10 seconds), 16:9; slow to ~17 seconds in the edit.</w:t>
-      </w:r>
-    </w:p>
-    <w:p>
-      <w:pPr>
-        <w:pStyle w:val="Heading3"/>
-      </w:pPr>
-      <w:r>
-        <w:t xml:space="preserve">Shot 14 (4:03–4:18, ~15s)</w:t>
+        <w:t xml:space="preserve"> Continue the same shot for 8 seconds with the same objects, lighting and style. Scene: An abandoned Roman armory in ruins with collapsed roof beams and dust, and in the foreground on a broken bench an early medieval spangenhelm: a frame of iron strips with riveted plates, one seam burst open, a plate bent inward and broken rivets scattered beside it. Camera and motion: Slow push-in on the burst seam and bent plate as a loose rivet rolls to a stop. Ambient: thin atmospheric haze drifts slowly through the backlight. Style: photoreal 3D CGI, museum-artifact look, dark low-key lighting with steep falloff into near-black, desaturated charcoal, graphite, worn wood, aged steel and brass, faint haze, extremely detailed surfaces, shallow depth of field. Very slow, smooth, cinematic movement, no camera shake, no cuts. No people, no hands, no text, no logos; objects keep their shape except for the described action. Audio: no speech, no music.</w:t>
+      </w:r>
+    </w:p>
+    <w:p>
+      <w:pPr>
+        <w:pStyle w:val="Heading3"/>
+      </w:pPr>
+      <w:r>
+        <w:t xml:space="preserve">Shot 11 (3:07, ~21s, 3 clips)</w:t>
+      </w:r>
+    </w:p>
+    <w:p>
+      <w:pPr>
+        <w:pStyle w:val="Heading3"/>
+      </w:pPr>
+      <w:r>
+        <w:t xml:space="preserve">Shot 11, Clip 1 of 3 (Frames to Video, shot image as first frame; covers ~6s of narration)</w:t>
       </w:r>
     </w:p>
     <w:p>
@@ -6796,7 +7650,7 @@
         <w:t xml:space="preserve">[Script Segment]</w:t>
       </w:r>
       <w:r>
-        <w:t xml:space="preserve"> "Underneath all that steel, knights wore something just as important. A padded arming cap and a hood of mail. The metal stopped the edge. The padding softened the shock. It was a lesson armies would forget, and then have to learn all over again."</w:t>
+        <w:t xml:space="preserve"> "By the 11th century, smiths had relearned how to raise a helmet from a single piece of iron."</w:t>
       </w:r>
     </w:p>
     <w:p>
@@ -6822,15 +7676,15 @@
           <w:sz w:val="20"/>
           <w:szCs w:val="20"/>
         </w:rPr>
-        <w:t xml:space="preserve"> Start frame: A cutaway cross-section on a dark table of a medieval great helm worn over a chainmail coif and a quilted linen arming cap on a featureless matte-grey mannequin head, every mail ring and stitch visible, a modern helmet foam pad resting beside it in the same pool of light. Camera and subject motion: Slow pan across the layers from the steel shell inward through mail and padding, then a rack focus to the modern foam pad beside it, one continuous unbroken move. Framing: side-on cutaway close-up. Lighting: low raking side light from the right, long soft shadows, specular glints along edges. Ambient motion: faint haze drifts in the darkness and the raking light glints softly along the edges as the view shifts. Mood: insightful, full-circle. Motion: very slow, smooth, weighted and cinematic, no camera shake, no sudden cuts. Keep every object, material and the lighting consistent with the start frame; add nothing beyond what the motion describes, never people, hands, text or logos; no warping or shape changes other than the described action. Visual style: Dark Archive Macro, a photoreal 3D CGI render in a museum-artifact still-life look, low-key lighting with steep falloff into near-black, desaturated charcoal, graphite, worn wood, aged steel and dull bronze with warm brass accents, extremely high surface detail. Duration: longest clip available (5–10 seconds), 16:9; slow to ~15 seconds in the edit.</w:t>
-      </w:r>
-    </w:p>
-    <w:p>
-      <w:pPr>
-        <w:pStyle w:val="Heading3"/>
-      </w:pPr>
-      <w:r>
-        <w:t xml:space="preserve">Shot 15 (4:18–4:41, ~22s)</w:t>
+        <w:t xml:space="preserve"> 8-second shot. Scene: A conical Norman nasal helmet from the 11th century, raised from a single piece of iron with one narrow bar running down over the nose, on a featureless matte-grey display mannequin head in a dark medieval forge, bodkin arrows stuck in muddy ground beside it. Camera and motion: Slow push toward the conical Norman nasal helmet as forge light flickers across the iron. Ambient: warm firelight flickers gently across the metal and tiny embers drift upward. Lighting: warm flickering orange glow from a forge or flame mixed with cold grey ambient fill. Mood: austere, vulnerable. Style: photoreal 3D CGI, museum-artifact look, dark low-key lighting with steep falloff into near-black, desaturated charcoal, graphite, worn wood, aged steel and brass, faint haze, extremely detailed surfaces, shallow depth of field. Very slow, smooth, cinematic movement, no camera shake, no cuts. No people, no hands, no text, no logos; objects keep their shape except for the described action. Audio: no speech, no music.</w:t>
+      </w:r>
+    </w:p>
+    <w:p>
+      <w:pPr>
+        <w:pStyle w:val="Heading3"/>
+      </w:pPr>
+      <w:r>
+        <w:t xml:space="preserve">Shot 11, Clip 2 of 3 (Extend the previous clip; covers ~8s of narration)</w:t>
       </w:r>
     </w:p>
     <w:p>
@@ -6845,7 +7699,7 @@
         <w:t xml:space="preserve">[Script Segment]</w:t>
       </w:r>
       <w:r>
-        <w:t xml:space="preserve"> "Vision and airflow were still a struggle. In the 14th century, the bascinet introduced a clever fix. A visor mounted on pivots. Raise it to breathe and look around. Lower it when the arrows started flying. Some visors were drawn out into a sharp point, earning the nickname hounskull, or dog's face. That beak shape gave lances and arrows nothing flat to bite into."</w:t>
+        <w:t xml:space="preserve"> "The result was the Norman nasal helmet. A conical shell that deflected blows, with one narrow bar running down over the nose."</w:t>
       </w:r>
     </w:p>
     <w:p>
@@ -6871,15 +7725,15 @@
           <w:sz w:val="20"/>
           <w:szCs w:val="20"/>
         </w:rPr>
-        <w:t xml:space="preserve"> Start frame: A 14th-century steel hounskull bascinet with a long pointed beak-shaped visor full of breathing holes on a dark stand, the visor mounted on side pivot pins, blurred arrows streaking through the dark background. Camera and subject motion: The pointed visor slowly lowers on its pivots and closes; an arrow glances off the sloped beak in slow motion as the camera eases toward the profile, one continuous unbroken move. Framing: eye-level 3/4 close-up. Lighting: soft backlight creating a thin glowing rim around the silhouette, front mostly in shadow. Ambient motion: thin atmospheric haze drifts slowly through the backlight. Mood: clever, menacing. Motion: very slow, smooth, weighted and cinematic, no camera shake, no sudden cuts. Keep every object, material and the lighting consistent with the start frame; add nothing beyond what the motion describes, never people, hands, text or logos; no warping or shape changes other than the described action. Visual style: Dark Archive Macro, a photoreal 3D CGI render in a museum-artifact still-life look, low-key lighting with steep falloff into near-black, desaturated charcoal, graphite, worn wood, aged steel and dull bronze with warm brass accents, extremely high surface detail. Duration: longest clip available (5–10 seconds), 16:9; slow to ~22 seconds in the edit.</w:t>
-      </w:r>
-    </w:p>
-    <w:p>
-      <w:pPr>
-        <w:pStyle w:val="Heading3"/>
-      </w:pPr>
-      <w:r>
-        <w:t xml:space="preserve">Shot 16 (4:41–5:06, ~26s)</w:t>
+        <w:t xml:space="preserve"> Continue the same shot for 8 seconds with the same objects, lighting and style. Scene: A conical Norman nasal helmet from the 11th century, raised from a single piece of iron with one narrow bar running down over the nose, on a featureless matte-grey display mannequin head in a dark medieval forge, bodkin arrows stuck in muddy ground beside it. Camera and motion: Slow orbit from the side profile of the conical shell to a frontal view of the narrow nose bar. Ambient: warm firelight flickers gently across the metal and tiny embers drift upward. Style: photoreal 3D CGI, museum-artifact look, dark low-key lighting with steep falloff into near-black, desaturated charcoal, graphite, worn wood, aged steel and brass, faint haze, extremely detailed surfaces, shallow depth of field. Very slow, smooth, cinematic movement, no camera shake, no cuts. No people, no hands, no text, no logos; objects keep their shape except for the described action. Audio: no speech, no music.</w:t>
+      </w:r>
+    </w:p>
+    <w:p>
+      <w:pPr>
+        <w:pStyle w:val="Heading3"/>
+      </w:pPr>
+      <w:r>
+        <w:t xml:space="preserve">Shot 11, Clip 3 of 3 (Extend the previous clip; covers ~7s of narration)</w:t>
       </w:r>
     </w:p>
     <w:p>
@@ -6894,7 +7748,7 @@
         <w:t xml:space="preserve">[Script Segment]</w:t>
       </w:r>
       <w:r>
-        <w:t xml:space="preserve"> "By the 1400s, helmets like the armet fitted the head so closely that they moved with the wearer. Medieval head protection had reached its peak. Then, gunpowder arrived on the battlefield. As firearms grew more powerful, armor thick enough to stop a musket ball became too heavy to fight in. Little by little, soldiers abandoned it. By the 18th century, most infantry marched into battle wearing felt, cloth, and leather. Helmets survived mostly as decoration."</w:t>
+        <w:t xml:space="preserve"> "Yet the rest of the face remained completely exposed. And on medieval battlefields, arrows and blades went looking for exactly that."</w:t>
       </w:r>
     </w:p>
     <w:p>
@@ -6920,15 +7774,23 @@
           <w:sz w:val="20"/>
           <w:szCs w:val="20"/>
         </w:rPr>
-        <w:t xml:space="preserve"> Start frame: A dark museum gallery: a polished 15th-century steel armet helmet with close-fitting cheek plates on a pedestal in a single spotlight, and on the table in front of it a flintlock musket, a powder horn, a small pile of black gunpowder and a flattened lead musket ball. Camera and subject motion: Slow pull back from the gleaming armet to reveal the musket and gunpowder in the foreground; the spotlight on the armet slowly dims while a match flare lights the powder, one continuous unbroken move. Framing: low-angle medium shot, foreground objects slightly out of focus. Lighting: narrow overhead spotlight forming a pool of light on the table, everything else falling into black. Ambient motion: fine dust motes float slowly through the pools of light. Mood: peak, then ominous turn. Motion: very slow, smooth, weighted and cinematic, no camera shake, no sudden cuts. Keep every object, material and the lighting consistent with the start frame; add nothing beyond what the motion describes, never people, hands, text or logos; no warping or shape changes other than the described action. Visual style: Dark Archive Macro, a photoreal 3D CGI render in a museum-artifact still-life look, low-key lighting with steep falloff into near-black, desaturated charcoal, graphite, worn wood, aged steel and dull bronze with warm brass accents, extremely high surface detail. Duration: longest clip available (5–10 seconds), 16:9; slow to ~26 seconds in the edit.</w:t>
-      </w:r>
-    </w:p>
-    <w:p>
-      <w:pPr>
-        <w:pStyle w:val="Heading3"/>
-      </w:pPr>
-      <w:r>
-        <w:t xml:space="preserve">Shot 17 (5:06–5:27, ~21s)</w:t>
+        <w:t xml:space="preserve"> Continue the same shot for 8 seconds with the same objects, lighting and style. Scene: A conical Norman nasal helmet from the 11th century, raised from a single piece of iron with one narrow bar running down over the nose, on a featureless matte-grey display mannequin head in a dark medieval forge, bodkin arrows stuck in muddy ground beside it. Camera and motion: Slow pull back revealing the bare face area of the mannequin and the bodkin arrows in the mud, smoke drifting low. Ambient: warm firelight flickers gently across the metal and tiny embers drift upward. Style: photoreal 3D CGI, museum-artifact look, dark low-key lighting with steep falloff into near-black, desaturated charcoal, graphite, worn wood, aged steel and brass, faint haze, extremely detailed surfaces, shallow depth of field. Very slow, smooth, cinematic movement, no camera shake, no cuts. No people, no hands, no text, no logos; objects keep their shape except for the described action. Audio: no speech, no music.</w:t>
+      </w:r>
+    </w:p>
+    <w:p>
+      <w:pPr>
+        <w:pStyle w:val="Heading3"/>
+      </w:pPr>
+      <w:r>
+        <w:t xml:space="preserve">Shot 12 (3:28, ~19s, 3 clips)</w:t>
+      </w:r>
+    </w:p>
+    <w:p>
+      <w:pPr>
+        <w:pStyle w:val="Heading3"/>
+      </w:pPr>
+      <w:r>
+        <w:t xml:space="preserve">Shot 12, Clip 1 of 3 (Frames to Video, shot image as first frame; covers ~5s of narration)</w:t>
       </w:r>
     </w:p>
     <w:p>
@@ -6943,7 +7805,7 @@
         <w:t xml:space="preserve">[Script Segment]</w:t>
       </w:r>
       <w:r>
-        <w:t xml:space="preserve"> "There were exceptions. Heavy cavalry, like Napoleon's cuirassiers, kept their steel helmets and breastplates well into the 1800s. But for the common foot soldier, the helmet had all but disappeared. Prussia's famous spiked Pickelhaube of 1842 was made of hardened leather. It looked impressive, but it offered almost no protection. For nearly two hundred years, that seemed acceptable. Until 1914."</w:t>
+        <w:t xml:space="preserve"> "So armorers decided to cover everything. In the late 12th century, the great helm appeared."</w:t>
       </w:r>
     </w:p>
     <w:p>
@@ -6969,15 +7831,15 @@
           <w:sz w:val="20"/>
           <w:szCs w:val="20"/>
         </w:rPr>
-        <w:t xml:space="preserve"> Start frame: A dark table with a Napoleonic French cuirassier steel helmet with brass crest and horsehair mane, a simple cloth infantry cap, and a black leather Prussian Pickelhaube with brass spike and eagle plate, with a brass WWI artillery shell standing upright at the end of the row in a harsh spotlight. Camera and subject motion: Slow lateral slide along the row from the cuirassier helmet past the cloth cap and Pickelhaube, ending on the artillery shell as the light hardens, one continuous unbroken move. Framing: low side angle along the row. Lighting: narrow overhead spotlight forming a pool of light on the table, everything else falling into black. Ambient motion: fine dust motes float slowly through the pools of light. Mood: proud, then ominous. Motion: very slow, smooth, weighted and cinematic, no camera shake, no sudden cuts. Keep every object, material and the lighting consistent with the start frame; add nothing beyond what the motion describes, never people, hands, text or logos; no warping or shape changes other than the described action. Visual style: Dark Archive Macro, a photoreal 3D CGI render in a museum-artifact still-life look, low-key lighting with steep falloff into near-black, desaturated charcoal, graphite, worn wood, aged steel and dull bronze with warm brass accents, extremely high surface detail. Duration: longest clip available (5–10 seconds), 16:9; slow to ~21 seconds in the edit.</w:t>
-      </w:r>
-    </w:p>
-    <w:p>
-      <w:pPr>
-        <w:pStyle w:val="Heading3"/>
-      </w:pPr>
-      <w:r>
-        <w:t xml:space="preserve">Shot 18 (5:27–5:42, ~15s)</w:t>
+        <w:t xml:space="preserve"> 8-second shot. Scene: A flat-topped steel medieval great helm from the late 12th century with narrow eye slits and breathing holes on a dark stand, and behind it a row of heater shields with distinct painted heraldic coats of arms leaning against a dark stone wall. Camera and motion: Slow rise from darkness as light comes up on the flat-topped great helm. Ambient: fine dust motes float slowly through the pools of light. Lighting: narrow overhead spotlight forming a pool of light on the table, everything else falling into black. Mood: imposing, pageantry. Style: photoreal 3D CGI, museum-artifact look, dark low-key lighting with steep falloff into near-black, desaturated charcoal, graphite, worn wood, aged steel and brass, faint haze, extremely detailed surfaces, shallow depth of field. Very slow, smooth, cinematic movement, no camera shake, no cuts. No people, no hands, no text, no logos; objects keep their shape except for the described action. Audio: no speech, no music.</w:t>
+      </w:r>
+    </w:p>
+    <w:p>
+      <w:pPr>
+        <w:pStyle w:val="Heading3"/>
+      </w:pPr>
+      <w:r>
+        <w:t xml:space="preserve">Shot 12, Clip 2 of 3 (Extend the previous clip; covers ~8s of narration)</w:t>
       </w:r>
     </w:p>
     <w:p>
@@ -6992,7 +7854,7 @@
         <w:t xml:space="preserve">[Script Segment]</w:t>
       </w:r>
       <w:r>
-        <w:t xml:space="preserve"> "The First World War was dominated by artillery. Shells burst above the trenches, raining hot metal fragments down on the men below. A soldier only had to raise his head above the parapet to be struck. And most of them were wearing fabric caps."</w:t>
+        <w:t xml:space="preserve"> "A flat-topped steel cylinder that enclosed the entire head. For the first time since the Greeks, a soldier's face vanished behind metal."</w:t>
       </w:r>
     </w:p>
     <w:p>
@@ -7018,15 +7880,15 @@
           <w:sz w:val="20"/>
           <w:szCs w:val="20"/>
         </w:rPr>
-        <w:t xml:space="preserve"> Start frame: An empty WWI trench at night under an exploding airburst artillery shell, glowing jagged metal fragments raining down onto wet sandbags, a soft wool cloth cap lying in the mud below the parapet, barbed wire silhouettes beyond. Camera and subject motion: Fragments rain down in slow motion while the camera slowly tilts down from the burst to the cloth cap in the mud; smoke drifts across, one continuous unbroken move. Framing: low angle from inside the trench looking up. Lighting: warm flickering orange glow from a forge or flame mixed with cold grey ambient fill. Ambient motion: warm firelight flickers gently across the metal and tiny embers drift upward. Mood: terrifying, vulnerable. Motion: very slow, smooth, weighted and cinematic, no camera shake, no sudden cuts. Keep every object, material and the lighting consistent with the start frame; add nothing beyond what the motion describes, never people, hands, text or logos; no warping or shape changes other than the described action. Visual style: Dark Archive Macro, a photoreal 3D CGI render in a museum-artifact still-life look, low-key lighting with steep falloff into near-black, desaturated charcoal, graphite, worn wood, aged steel and dull bronze with warm brass accents, extremely high surface detail. Duration: longest clip available (5–10 seconds), 16:9; slow to ~15 seconds in the edit.</w:t>
-      </w:r>
-    </w:p>
-    <w:p>
-      <w:pPr>
-        <w:pStyle w:val="Heading3"/>
-      </w:pPr>
-      <w:r>
-        <w:t xml:space="preserve">Shot 19 (5:42–6:06, ~24s)</w:t>
+        <w:t xml:space="preserve"> Continue the same shot for 8 seconds with the same objects, lighting and style. Scene: A flat-topped steel medieval great helm from the late 12th century with narrow eye slits and breathing holes on a dark stand, and behind it a row of heater shields with distinct painted heraldic coats of arms leaning against a dark stone wall. Camera and motion: Slow push-in toward the great helm's narrow eye slit until it fills the frame. Ambient: fine dust motes float slowly through the pools of light. Style: photoreal 3D CGI, museum-artifact look, dark low-key lighting with steep falloff into near-black, desaturated charcoal, graphite, worn wood, aged steel and brass, faint haze, extremely detailed surfaces, shallow depth of field. Very slow, smooth, cinematic movement, no camera shake, no cuts. No people, no hands, no text, no logos; objects keep their shape except for the described action. Audio: no speech, no music.</w:t>
+      </w:r>
+    </w:p>
+    <w:p>
+      <w:pPr>
+        <w:pStyle w:val="Heading3"/>
+      </w:pPr>
+      <w:r>
+        <w:t xml:space="preserve">Shot 12, Clip 3 of 3 (Extend the previous clip; covers ~6s of narration)</w:t>
       </w:r>
     </w:p>
     <w:p>
@@ -7041,7 +7903,7 @@
         <w:t xml:space="preserve">[Script Segment]</w:t>
       </w:r>
       <w:r>
-        <w:t xml:space="preserve"> "France reacted first. Its soldiers began receiving steel skullcaps to wear underneath their kepis. Within months, the army introduced a full steel helmet, the Adrian. Britain followed with the Brodie helmet. Its design was brilliant in its simplicity. It was pressed from a single sheet of manganese steel, a process fast enough to produce millions. Its wide, shallow brim shielded the head and shoulders from fragments falling from above."</w:t>
+        <w:t xml:space="preserve"> "Knights began painting coats of arms on their shields and surcoats, simply so they could be recognized."</w:t>
       </w:r>
     </w:p>
     <w:p>
@@ -7067,15 +7929,23 @@
           <w:sz w:val="20"/>
           <w:szCs w:val="20"/>
         </w:rPr>
-        <w:t xml:space="preserve"> Start frame: A dark industrial workshop: a horizon-blue French Adrian helmet with its crest ridge and a khaki British Brodie helmet with a wide flat brim on a workbench, behind them a steel press stamping a flat sheet into a Brodie shape with sparks and steam, and a line of identical Brodie helmets fading into the dark. Camera and subject motion: The press slams down in slow motion with sparks and steam while the camera slides from the Adrian to the Brodie and along the line of identical helmets, one continuous unbroken move. Framing: low side medium shot. Lighting: warm flickering orange glow from a forge or flame mixed with cold grey ambient fill. Ambient motion: warm firelight flickers gently across the metal and tiny embers drift upward. Mood: industrial, urgent. Motion: very slow, smooth, weighted and cinematic, no camera shake, no sudden cuts. Keep every object, material and the lighting consistent with the start frame; add nothing beyond what the motion describes, never people, hands, text or logos; no warping or shape changes other than the described action. Visual style: Dark Archive Macro, a photoreal 3D CGI render in a museum-artifact still-life look, low-key lighting with steep falloff into near-black, desaturated charcoal, graphite, worn wood, aged steel and dull bronze with warm brass accents, extremely high surface detail. Duration: longest clip available (5–10 seconds), 16:9; slow to ~24 seconds in the edit.</w:t>
-      </w:r>
-    </w:p>
-    <w:p>
-      <w:pPr>
-        <w:pStyle w:val="Heading3"/>
-      </w:pPr>
-      <w:r>
-        <w:t xml:space="preserve">Shot 20 (6:06–6:20, ~13s)</w:t>
+        <w:t xml:space="preserve"> Continue the same shot for 8 seconds with the same objects, lighting and style. Scene: A flat-topped steel medieval great helm from the late 12th century with narrow eye slits and breathing holes on a dark stand, and behind it a row of heater shields with distinct painted heraldic coats of arms leaning against a dark stone wall. Camera and motion: Rack focus from the great helm to the row of painted heraldic shields behind it, the camera drifting sideways. Ambient: fine dust motes float slowly through the pools of light. Style: photoreal 3D CGI, museum-artifact look, dark low-key lighting with steep falloff into near-black, desaturated charcoal, graphite, worn wood, aged steel and brass, faint haze, extremely detailed surfaces, shallow depth of field. Very slow, smooth, cinematic movement, no camera shake, no cuts. No people, no hands, no text, no logos; objects keep their shape except for the described action. Audio: no speech, no music.</w:t>
+      </w:r>
+    </w:p>
+    <w:p>
+      <w:pPr>
+        <w:pStyle w:val="Heading3"/>
+      </w:pPr>
+      <w:r>
+        <w:t xml:space="preserve">Shot 13 (3:46, ~17s, 3 clips)</w:t>
+      </w:r>
+    </w:p>
+    <w:p>
+      <w:pPr>
+        <w:pStyle w:val="Heading3"/>
+      </w:pPr>
+      <w:r>
+        <w:t xml:space="preserve">Shot 13, Clip 1 of 3 (Frames to Video, shot image as first frame; covers ~5s of narration)</w:t>
       </w:r>
     </w:p>
     <w:p>
@@ -7090,7 +7960,7 @@
         <w:t xml:space="preserve">[Script Segment]</w:t>
       </w:r>
       <w:r>
-        <w:t xml:space="preserve"> "Germany went further. In 1916, it introduced the Stahlhelm. Made of nickel steel, its deep shape extended down over the ears and the back of the neck. It became one of the most recognizable silhouettes of the twentieth century."</w:t>
+        <w:t xml:space="preserve"> "But the flat top had a fatal flaw. It met every overhead strike head-on,"</w:t>
       </w:r>
     </w:p>
     <w:p>
@@ -7116,15 +7986,15 @@
           <w:sz w:val="20"/>
           <w:szCs w:val="20"/>
         </w:rPr>
-        <w:t xml:space="preserve"> Start frame: A field-grey German M1916 Stahlhelm on a dark stand, its deep skirt flaring down over the ears and the back of the neck, against a softly glowing grey haze. Camera and subject motion: Slow orbit from front to side profile until the helmet becomes a pure black silhouette against the glowing haze, one continuous unbroken move. Framing: eye-level side profile close-up. Lighting: soft backlight creating a thin glowing rim around the silhouette, front mostly in shadow. Ambient motion: thin atmospheric haze drifts slowly through the backlight. Mood: iconic, haunting. Motion: very slow, smooth, weighted and cinematic, no camera shake, no sudden cuts. Keep every object, material and the lighting consistent with the start frame; add nothing beyond what the motion describes, never people, hands, text or logos; no warping or shape changes other than the described action. Visual style: Dark Archive Macro, a photoreal 3D CGI render in a museum-artifact still-life look, low-key lighting with steep falloff into near-black, desaturated charcoal, graphite, worn wood, aged steel and dull bronze with warm brass accents, extremely high surface detail. Duration: longest clip available (5–10 seconds), 16:9; slow to ~13 seconds in the edit.</w:t>
-      </w:r>
-    </w:p>
-    <w:p>
-      <w:pPr>
-        <w:pStyle w:val="Heading3"/>
-      </w:pPr>
-      <w:r>
-        <w:t xml:space="preserve">Shot 21 (6:20–6:35, ~15s)</w:t>
+        <w:t xml:space="preserve"> 8-second shot. Scene: Two medieval helmets on a dark table: a flat-topped great helm with a dent in its crown and a pointed sugarloaf helm, a heavy sword blade glancing off the sugarloaf's pointed crown with a streak of sparks trailing along the curve. Camera and motion: A heavy sword descends in slow motion toward the dented flat top of the great helm in the background. Ambient: faint haze drifts in the darkness and the raking light glints softly along the edges as the view shifts. Lighting: low raking side light from the right, long soft shadows, specular glints along edges. Mood: tense, then satisfying. Style: photoreal 3D CGI, museum-artifact look, dark low-key lighting with steep falloff into near-black, desaturated charcoal, graphite, worn wood, aged steel and brass, faint haze, extremely detailed surfaces, shallow depth of field. Very slow, smooth, cinematic movement, no camera shake, no cuts. No people, no hands, no text, no logos; objects keep their shape except for the described action. Audio: no speech, no music.</w:t>
+      </w:r>
+    </w:p>
+    <w:p>
+      <w:pPr>
+        <w:pStyle w:val="Heading3"/>
+      </w:pPr>
+      <w:r>
+        <w:t xml:space="preserve">Shot 13, Clip 2 of 3 (Extend the previous clip; covers ~6s of narration)</w:t>
       </w:r>
     </w:p>
     <w:p>
@@ -7139,7 +8009,7 @@
         <w:t xml:space="preserve">[Script Segment]</w:t>
       </w:r>
       <w:r>
-        <w:t xml:space="preserve"> "Germany even tried to add an extra steel plate that hung from lugs on the front, meant to stop bullets at the brow. It worked, but it was so heavy that few soldiers wore it for long. Once again, protection had collided with weight."</w:t>
+        <w:t xml:space="preserve"> "absorbing the full force instead of turning it aside. So armorers raised the crown into a point."</w:t>
       </w:r>
     </w:p>
     <w:p>
@@ -7165,15 +8035,15 @@
           <w:sz w:val="20"/>
           <w:szCs w:val="20"/>
         </w:rPr>
-        <w:t xml:space="preserve"> Start frame: A German Stahlhelm with a thick extra steel brow plate hooked onto its front lugs, a flattened bullet stuck in the plate, sitting on a rusted antique balance scale that tips heavily to one side, a medieval great helm softly blurred behind. Camera and subject motion: The scale slowly sinks further under the helmet's weight while the camera pushes in on the flattened bullet, then racks focus to the great helm behind, one continuous unbroken move. Framing: eye-level medium close-up. Lighting: single soft key light from upper left, steep falloff into near-black, crisp rim highlights on metal edges. Ambient motion: faint haze drifts in the darkness and specular highlights slide subtly across the metal as the view shifts. Mood: burdensome, history repeating. Motion: very slow, smooth, weighted and cinematic, no camera shake, no sudden cuts. Keep every object, material and the lighting consistent with the start frame; add nothing beyond what the motion describes, never people, hands, text or logos; no warping or shape changes other than the described action. Visual style: Dark Archive Macro, a photoreal 3D CGI render in a museum-artifact still-life look, low-key lighting with steep falloff into near-black, desaturated charcoal, graphite, worn wood, aged steel and dull bronze with warm brass accents, extremely high surface detail. Duration: longest clip available (5–10 seconds), 16:9; slow to ~15 seconds in the edit.</w:t>
-      </w:r>
-    </w:p>
-    <w:p>
-      <w:pPr>
-        <w:pStyle w:val="Heading3"/>
-      </w:pPr>
-      <w:r>
-        <w:t xml:space="preserve">Shot 22 (6:35–6:46, ~12s)</w:t>
+        <w:t xml:space="preserve"> Continue the same shot for 8 seconds with the same objects, lighting and style. Scene: Two medieval helmets on a dark table: a flat-topped great helm with a dent in its crown and a pointed sugarloaf helm, a heavy sword blade glancing off the sugarloaf's pointed crown with a streak of sparks trailing along the curve. Camera and motion: Slow pan from the dented flat-topped helm to the pointed sugarloaf helm. Ambient: faint haze drifts in the darkness and the raking light glints softly along the edges as the view shifts. Style: photoreal 3D CGI, museum-artifact look, dark low-key lighting with steep falloff into near-black, desaturated charcoal, graphite, worn wood, aged steel and brass, faint haze, extremely detailed surfaces, shallow depth of field. Very slow, smooth, cinematic movement, no camera shake, no cuts. No people, no hands, no text, no logos; objects keep their shape except for the described action. Audio: no speech, no music.</w:t>
+      </w:r>
+    </w:p>
+    <w:p>
+      <w:pPr>
+        <w:pStyle w:val="Heading3"/>
+      </w:pPr>
+      <w:r>
+        <w:t xml:space="preserve">Shot 13, Clip 3 of 3 (Extend the previous clip; covers ~6s of narration)</w:t>
       </w:r>
     </w:p>
     <w:p>
@@ -7188,7 +8058,7 @@
         <w:t xml:space="preserve">[Script Segment]</w:t>
       </w:r>
       <w:r>
-        <w:t xml:space="preserve"> "Steel helmets sharply reduced fatal head wounds. But they still had a hidden problem. When a fragment hit, the shell pressed directly against the skull, passing much of the impact straight into the wearer."</w:t>
+        <w:t xml:space="preserve"> "This was the sugarloaf helm, and it did what flat steel could not. It made blades slide off."</w:t>
       </w:r>
     </w:p>
     <w:p>
@@ -7214,15 +8084,23 @@
           <w:sz w:val="20"/>
           <w:szCs w:val="20"/>
         </w:rPr>
-        <w:t xml:space="preserve"> Start frame: A cutaway cross-section of a WWI steel helmet on a featureless matte-grey mannequin head, the thin liner pressed tight against the shell, a fragment impact denting the steel straight inward with faint glowing shockwave lines travelling into the head. Camera and subject motion: The fragment strikes in slow motion, the steel dents inward and faint glowing shockwave lines pulse straight into the mannequin's head, one continuous unbroken move. Framing: side-on cutaway close-up. Lighting: low raking side light from the right, long soft shadows, specular glints along edges. Ambient motion: faint haze drifts in the darkness and the raking light glints softly along the edges as the view shifts. Mood: tense, technical. Motion: very slow, smooth, weighted and cinematic, no camera shake, no sudden cuts. Keep every object, material and the lighting consistent with the start frame; add nothing beyond what the motion describes, never people, hands, text or logos; no warping or shape changes other than the described action. Visual style: Dark Archive Macro, a photoreal 3D CGI render in a museum-artifact still-life look, low-key lighting with steep falloff into near-black, desaturated charcoal, graphite, worn wood, aged steel and dull bronze with warm brass accents, extremely high surface detail. Duration: longest clip available (5–10 seconds), 16:9; slow to ~12 seconds in the edit.</w:t>
-      </w:r>
-    </w:p>
-    <w:p>
-      <w:pPr>
-        <w:pStyle w:val="Heading3"/>
-      </w:pPr>
-      <w:r>
-        <w:t xml:space="preserve">Shot 23 (6:46–7:05, ~19s)</w:t>
+        <w:t xml:space="preserve"> Continue the same shot for 8 seconds with the same objects, lighting and style. Scene: Two medieval helmets on a dark table: a flat-topped great helm with a dent in its crown and a pointed sugarloaf helm, a heavy sword blade glancing off the sugarloaf's pointed crown with a streak of sparks trailing along the curve. Camera and motion: The sword glances off the pointed crown in slow motion, a streak of sparks trailing along the curve. Ambient: faint haze drifts in the darkness and the raking light glints softly along the edges as the view shifts. Style: photoreal 3D CGI, museum-artifact look, dark low-key lighting with steep falloff into near-black, desaturated charcoal, graphite, worn wood, aged steel and brass, faint haze, extremely detailed surfaces, shallow depth of field. Very slow, smooth, cinematic movement, no camera shake, no cuts. No people, no hands, no text, no logos; objects keep their shape except for the described action. Audio: no speech, no music.</w:t>
+      </w:r>
+    </w:p>
+    <w:p>
+      <w:pPr>
+        <w:pStyle w:val="Heading3"/>
+      </w:pPr>
+      <w:r>
+        <w:t xml:space="preserve">Shot 14 (4:03, ~15s, 2 clips)</w:t>
+      </w:r>
+    </w:p>
+    <w:p>
+      <w:pPr>
+        <w:pStyle w:val="Heading3"/>
+      </w:pPr>
+      <w:r>
+        <w:t xml:space="preserve">Shot 14, Clip 1 of 2 (Frames to Video, shot image as first frame; covers ~7s of narration)</w:t>
       </w:r>
     </w:p>
     <w:p>
@@ -7237,7 +8115,7 @@
         <w:t xml:space="preserve">[Script Segment]</w:t>
       </w:r>
       <w:r>
-        <w:t xml:space="preserve"> "In 1941, the United States answered this with the M1 helmet. It used two separate parts. An outer steel shell, and a lighter liner inside it with an adjustable web of straps. That gap between steel and skull became a crumple zone. The shell could take a dent without the dent reaching the head."</w:t>
+        <w:t xml:space="preserve"> "Underneath all that steel, knights wore something just as important. A padded arming cap and a hood of mail."</w:t>
       </w:r>
     </w:p>
     <w:p>
@@ -7263,15 +8141,15 @@
           <w:sz w:val="20"/>
           <w:szCs w:val="20"/>
         </w:rPr>
-        <w:t xml:space="preserve"> Start frame: A cutaway cross-section of an olive-drab US M1 helmet on a featureless matte-grey mannequin head, showing the outer steel shell, the separate inner liner and the cotton webbing straps holding a clear gap between steel and head. Camera and subject motion: The shell takes a dent in slow motion and the dent stops short inside the gap, the webbing flexing; the camera slowly eases in on the untouched head, one continuous unbroken move. Framing: side-on cutaway close-up. Lighting: single soft key light from upper left, steep falloff into near-black, crisp rim highlights on metal edges. Ambient motion: faint haze drifts in the darkness and specular highlights slide subtly across the metal as the view shifts. Mood: clever, relieved. Motion: very slow, smooth, weighted and cinematic, no camera shake, no sudden cuts. Keep every object, material and the lighting consistent with the start frame; add nothing beyond what the motion describes, never people, hands, text or logos; no warping or shape changes other than the described action. Visual style: Dark Archive Macro, a photoreal 3D CGI render in a museum-artifact still-life look, low-key lighting with steep falloff into near-black, desaturated charcoal, graphite, worn wood, aged steel and dull bronze with warm brass accents, extremely high surface detail. Duration: longest clip available (5–10 seconds), 16:9; slow to ~19 seconds in the edit.</w:t>
-      </w:r>
-    </w:p>
-    <w:p>
-      <w:pPr>
-        <w:pStyle w:val="Heading3"/>
-      </w:pPr>
-      <w:r>
-        <w:t xml:space="preserve">Shot 24 (7:05–7:26, ~21s)</w:t>
+        <w:t xml:space="preserve"> 8-second shot. Scene: A cutaway cross-section on a dark table of a medieval great helm worn over a chainmail coif and a quilted linen arming cap on a featureless matte-grey mannequin head, every mail ring and stitch visible, a modern helmet foam pad resting beside it in the same pool of light. Camera and motion: Slow pan across the cutaway from the steel shell inward through the chainmail rings to the quilted padding. Ambient: faint haze drifts in the darkness and the raking light glints softly along the edges as the view shifts. Lighting: low raking side light from the right, long soft shadows, specular glints along edges. Mood: insightful, full-circle. Style: photoreal 3D CGI, museum-artifact look, dark low-key lighting with steep falloff into near-black, desaturated charcoal, graphite, worn wood, aged steel and brass, faint haze, extremely detailed surfaces, shallow depth of field. Very slow, smooth, cinematic movement, no camera shake, no cuts. No people, no hands, no text, no logos; objects keep their shape except for the described action. Audio: no speech, no music.</w:t>
+      </w:r>
+    </w:p>
+    <w:p>
+      <w:pPr>
+        <w:pStyle w:val="Heading3"/>
+      </w:pPr>
+      <w:r>
+        <w:t xml:space="preserve">Shot 14, Clip 2 of 2 (Extend the previous clip; covers ~9s of narration)</w:t>
       </w:r>
     </w:p>
     <w:p>
@@ -7286,7 +8164,7 @@
         <w:t xml:space="preserve">[Script Segment]</w:t>
       </w:r>
       <w:r>
-        <w:t xml:space="preserve"> "Soldiers nicknamed it the steel pot, and they used it as far more than armor. It became a wash basin, a shovel, a seat, and even a cooking pot over an open fire. The M1 served for more than forty years. But steel had reached its limit. To make it stronger, you had to make it thicker. And thicker meant heavier."</w:t>
+        <w:t xml:space="preserve"> "The metal stopped the edge. The padding softened the shock. It was a lesson armies would forget, and then have to learn all over again."</w:t>
       </w:r>
     </w:p>
     <w:p>
@@ -7312,15 +8190,23 @@
           <w:sz w:val="20"/>
           <w:szCs w:val="20"/>
         </w:rPr>
-        <w:t xml:space="preserve"> Start frame: A dented olive-drab M1 helmet hanging over a small campfire at night with steam rising from water inside, a folding shovel, a canteen and a shaving brush on a wooden crate beside it, and a worn scratched M1 with faded paint on a dark shelf in the background. Camera and subject motion: Steam curls and embers drift up while the camera slowly racks focus from the campfire helmet to the worn, dusty helmet on the shelf, one continuous unbroken move. Framing: low-angle close-up. Lighting: warm flickering orange glow from a forge or flame mixed with cold grey ambient fill. Ambient motion: warm firelight flickers gently across the metal and tiny embers drift upward. Mood: human, warm, end of an era. Motion: very slow, smooth, weighted and cinematic, no camera shake, no sudden cuts. Keep every object, material and the lighting consistent with the start frame; add nothing beyond what the motion describes, never people, hands, text or logos; no warping or shape changes other than the described action. Visual style: Dark Archive Macro, a photoreal 3D CGI render in a museum-artifact still-life look, low-key lighting with steep falloff into near-black, desaturated charcoal, graphite, worn wood, aged steel and dull bronze with warm brass accents, extremely high surface detail. Duration: longest clip available (5–10 seconds), 16:9; slow to ~21 seconds in the edit.</w:t>
-      </w:r>
-    </w:p>
-    <w:p>
-      <w:pPr>
-        <w:pStyle w:val="Heading3"/>
-      </w:pPr>
-      <w:r>
-        <w:t xml:space="preserve">Shot 25 (7:26–7:36, ~10s)</w:t>
+        <w:t xml:space="preserve"> Continue the same shot for 8 seconds with the same objects, lighting and style. Scene: A cutaway cross-section on a dark table of a medieval great helm worn over a chainmail coif and a quilted linen arming cap on a featureless matte-grey mannequin head, every mail ring and stitch visible, a modern helmet foam pad resting beside it in the same pool of light. Camera and motion: Slow rack focus from the old quilted padding to the modern foam pad resting beside it. Ambient: faint haze drifts in the darkness and the raking light glints softly along the edges as the view shifts. Style: photoreal 3D CGI, museum-artifact look, dark low-key lighting with steep falloff into near-black, desaturated charcoal, graphite, worn wood, aged steel and brass, faint haze, extremely detailed surfaces, shallow depth of field. Very slow, smooth, cinematic movement, no camera shake, no cuts. No people, no hands, no text, no logos; objects keep their shape except for the described action. Audio: no speech, no music.</w:t>
+      </w:r>
+    </w:p>
+    <w:p>
+      <w:pPr>
+        <w:pStyle w:val="Heading3"/>
+      </w:pPr>
+      <w:r>
+        <w:t xml:space="preserve">Shot 15 (4:18, ~22s, 3 clips)</w:t>
+      </w:r>
+    </w:p>
+    <w:p>
+      <w:pPr>
+        <w:pStyle w:val="Heading3"/>
+      </w:pPr>
+      <w:r>
+        <w:t xml:space="preserve">Shot 15, Clip 1 of 3 (Frames to Video, shot image as first frame; covers ~6s of narration)</w:t>
       </w:r>
     </w:p>
     <w:p>
@@ -7335,7 +8221,7 @@
         <w:t xml:space="preserve">[Script Segment]</w:t>
       </w:r>
       <w:r>
-        <w:t xml:space="preserve"> "The breakthrough came from a laboratory. In 1965, DuPont chemist Stephanie Kwolek discovered a synthetic fiber that, weight for weight, was five times stronger than steel. It was called Kevlar."</w:t>
+        <w:t xml:space="preserve"> "Vision and airflow were still a struggle. In the 14th century, the bascinet introduced a clever fix."</w:t>
       </w:r>
     </w:p>
     <w:p>
@@ -7361,15 +8247,15 @@
           <w:sz w:val="20"/>
           <w:szCs w:val="20"/>
         </w:rPr>
-        <w:t xml:space="preserve"> Start frame: A dim 1960s chemistry laboratory bench with glass beakers and flasks under a single desk lamp, a thin golden synthetic fiber being drawn up out of a beaker of cloudy liquid, a spool of tightly woven golden-yellow Kevlar fabric beside it. Camera and subject motion: The golden fiber slowly lifts from the liquid while the camera glides along the bench to the woven Kevlar spool, one continuous unbroken move. Framing: macro close-up. Lighting: narrow overhead spotlight forming a pool of light on the table, everything else falling into black. Ambient motion: fine dust motes float slowly through the pools of light. Mood: breakthrough, discovery. Motion: very slow, smooth, weighted and cinematic, no camera shake, no sudden cuts. Keep every object, material and the lighting consistent with the start frame; add nothing beyond what the motion describes, never people, hands, text or logos; no warping or shape changes other than the described action. Visual style: Dark Archive Macro, a photoreal 3D CGI render in a museum-artifact still-life look, low-key lighting with steep falloff into near-black, desaturated charcoal, graphite, worn wood, aged steel and dull bronze with warm brass accents, extremely high surface detail. Duration: longest clip available (5–10 seconds), 16:9; slow to ~10 seconds in the edit.</w:t>
-      </w:r>
-    </w:p>
-    <w:p>
-      <w:pPr>
-        <w:pStyle w:val="Heading3"/>
-      </w:pPr>
-      <w:r>
-        <w:t xml:space="preserve">Shot 26 (7:36–7:54, ~18s)</w:t>
+        <w:t xml:space="preserve"> 8-second shot. Scene: A 14th-century steel hounskull bascinet with a long pointed beak-shaped visor full of breathing holes on a dark stand, the visor mounted on side pivot pins, blurred arrows streaking through the dark background. Camera and motion: Slow push toward the closed hounskull bascinet on its stand, haze drifting in the backlight. Ambient: thin atmospheric haze drifts slowly through the backlight. Lighting: soft backlight creating a thin glowing rim around the silhouette, front mostly in shadow. Mood: clever, menacing. Style: photoreal 3D CGI, museum-artifact look, dark low-key lighting with steep falloff into near-black, desaturated charcoal, graphite, worn wood, aged steel and brass, faint haze, extremely detailed surfaces, shallow depth of field. Very slow, smooth, cinematic movement, no camera shake, no cuts. No people, no hands, no text, no logos; objects keep their shape except for the described action. Audio: no speech, no music.</w:t>
+      </w:r>
+    </w:p>
+    <w:p>
+      <w:pPr>
+        <w:pStyle w:val="Heading3"/>
+      </w:pPr>
+      <w:r>
+        <w:t xml:space="preserve">Shot 15, Clip 2 of 3 (Extend the previous clip; covers ~10s of narration)</w:t>
       </w:r>
     </w:p>
     <w:p>
@@ -7384,7 +8270,7 @@
         <w:t xml:space="preserve">[Script Segment]</w:t>
       </w:r>
       <w:r>
-        <w:t xml:space="preserve"> "In the early 1980s, the US Army adopted the PASGT helmet, built from layers of Kevlar bonded together with resin. Instead of resisting a fragment with hard metal, its fibers stretched and caught it, spreading the energy across the entire shell. For roughly the same weight as steel, it stopped far more."</w:t>
+        <w:t xml:space="preserve"> "A visor mounted on pivots. Raise it to breathe and look around. Lower it when the arrows started flying. Some visors were drawn out into a sharp point,"</w:t>
       </w:r>
     </w:p>
     <w:p>
@@ -7410,15 +8296,15 @@
           <w:sz w:val="20"/>
           <w:szCs w:val="20"/>
         </w:rPr>
-        <w:t xml:space="preserve"> Start frame: A woodland-camouflage US PASGT helmet on a dark stand beside an exploded view of golden Kevlar fabric layers fusing together with glossy resin, a jagged metal fragment caught in the stretched woven fibers like a net. Camera and subject motion: The fragment pushes into the Kevlar weave in slow motion and the fibers stretch and hold it, glowing energy rippling outward across the layers, one continuous unbroken move. Framing: side-on medium close-up. Lighting: low raking side light from the right, long soft shadows, specular glints along edges. Ambient motion: faint haze drifts in the darkness and the raking light glints softly along the edges as the view shifts. Mood: engineered, impressive. Motion: very slow, smooth, weighted and cinematic, no camera shake, no sudden cuts. Keep every object, material and the lighting consistent with the start frame; add nothing beyond what the motion describes, never people, hands, text or logos; no warping or shape changes other than the described action. Visual style: Dark Archive Macro, a photoreal 3D CGI render in a museum-artifact still-life look, low-key lighting with steep falloff into near-black, desaturated charcoal, graphite, worn wood, aged steel and dull bronze with warm brass accents, extremely high surface detail. Duration: longest clip available (5–10 seconds), 16:9; slow to ~18 seconds in the edit.</w:t>
-      </w:r>
-    </w:p>
-    <w:p>
-      <w:pPr>
-        <w:pStyle w:val="Heading3"/>
-      </w:pPr>
-      <w:r>
-        <w:t xml:space="preserve">Shot 27 (7:54–8:09, ~14s)</w:t>
+        <w:t xml:space="preserve"> Continue the same shot for 8 seconds with the same objects, lighting and style. Scene: A 14th-century steel hounskull bascinet with a long pointed beak-shaped visor full of breathing holes on a dark stand, the visor mounted on side pivot pins, blurred arrows streaking through the dark background. Camera and motion: The pointed visor slowly rises on its side pivots, holds, then lowers and closes as blurred arrows streak past. Ambient: thin atmospheric haze drifts slowly through the backlight. Style: photoreal 3D CGI, museum-artifact look, dark low-key lighting with steep falloff into near-black, desaturated charcoal, graphite, worn wood, aged steel and brass, faint haze, extremely detailed surfaces, shallow depth of field. Very slow, smooth, cinematic movement, no camera shake, no cuts. No people, no hands, no text, no logos; objects keep their shape except for the described action. Audio: no speech, no music.</w:t>
+      </w:r>
+    </w:p>
+    <w:p>
+      <w:pPr>
+        <w:pStyle w:val="Heading3"/>
+      </w:pPr>
+      <w:r>
+        <w:t xml:space="preserve">Shot 15, Clip 3 of 3 (Extend the previous clip; covers ~7s of narration)</w:t>
       </w:r>
     </w:p>
     <w:p>
@@ -7433,7 +8319,7 @@
         <w:t xml:space="preserve">[Script Segment]</w:t>
       </w:r>
       <w:r>
-        <w:t xml:space="preserve"> "Its shape looked familiar. The deep sides covering the ears and neck echoed the German Stahlhelm so closely that American troops nicknamed it the Fritz. Nearly seventy years later, the best answer to falling fragments still looked like a design from 1916."</w:t>
+        <w:t xml:space="preserve"> "earning the nickname hounskull, or dog's face. That beak shape gave lances and arrows nothing flat to bite into."</w:t>
       </w:r>
     </w:p>
     <w:p>
@@ -7459,15 +8345,23 @@
           <w:sz w:val="20"/>
           <w:szCs w:val="20"/>
         </w:rPr>
-        <w:t xml:space="preserve"> Start frame: A field-grey 1916 German Stahlhelm and a 1980s US PASGT helmet facing the same way side by side on a long dark table, in exact side profile, their silhouettes nearly identical, dust drifting between them. Camera and subject motion: Slow lateral slide between the two helmets so their silhouettes overlap and line up, then separate again, one continuous unbroken move. Framing: eye-level side profile shot. Lighting: soft backlight creating a thin glowing rim around the silhouette, front mostly in shadow. Ambient motion: thin atmospheric haze drifts slowly through the backlight. Mood: surprising echo, reflective. Motion: very slow, smooth, weighted and cinematic, no camera shake, no sudden cuts. Keep every object, material and the lighting consistent with the start frame; add nothing beyond what the motion describes, never people, hands, text or logos; no warping or shape changes other than the described action. Visual style: Dark Archive Macro, a photoreal 3D CGI render in a museum-artifact still-life look, low-key lighting with steep falloff into near-black, desaturated charcoal, graphite, worn wood, aged steel and dull bronze with warm brass accents, extremely high surface detail. Duration: longest clip available (5–10 seconds), 16:9; slow to ~14 seconds in the edit.</w:t>
-      </w:r>
-    </w:p>
-    <w:p>
-      <w:pPr>
-        <w:pStyle w:val="Heading3"/>
-      </w:pPr>
-      <w:r>
-        <w:t xml:space="preserve">Shot 28 (8:09–8:32, ~23s)</w:t>
+        <w:t xml:space="preserve"> Continue the same shot for 8 seconds with the same objects, lighting and style. Scene: A 14th-century steel hounskull bascinet with a long pointed beak-shaped visor full of breathing holes on a dark stand, the visor mounted on side pivot pins, blurred arrows streaking through the dark background. Camera and motion: Slow orbit to the profile of the beak-shaped visor as an arrow glances off its slope in slow motion. Ambient: thin atmospheric haze drifts slowly through the backlight. Style: photoreal 3D CGI, museum-artifact look, dark low-key lighting with steep falloff into near-black, desaturated charcoal, graphite, worn wood, aged steel and brass, faint haze, extremely detailed surfaces, shallow depth of field. Very slow, smooth, cinematic movement, no camera shake, no cuts. No people, no hands, no text, no logos; objects keep their shape except for the described action. Audio: no speech, no music.</w:t>
+      </w:r>
+    </w:p>
+    <w:p>
+      <w:pPr>
+        <w:pStyle w:val="Heading3"/>
+      </w:pPr>
+      <w:r>
+        <w:t xml:space="preserve">Shot 16 (4:41, ~26s, 4 clips)</w:t>
+      </w:r>
+    </w:p>
+    <w:p>
+      <w:pPr>
+        <w:pStyle w:val="Heading3"/>
+      </w:pPr>
+      <w:r>
+        <w:t xml:space="preserve">Shot 16, Clip 1 of 4 (Frames to Video, shot image as first frame; covers ~6s of narration)</w:t>
       </w:r>
     </w:p>
     <w:p>
@@ -7482,7 +8376,7 @@
         <w:t xml:space="preserve">[Script Segment]</w:t>
       </w:r>
       <w:r>
-        <w:t xml:space="preserve"> "But modern wars revealed a new threat. In Iraq and Afghanistan, many head injuries came not from penetration, but from blast and blunt force. The old strap suspension wasn't enough. The answer was padding. Newer helmets replaced the web of straps with shock-absorbing foam pads, spreading every impact across the skull. Their edges were cut higher around the ears, leaving room for radios and hearing protection."</w:t>
+        <w:t xml:space="preserve"> "By the 1400s, helmets like the armet fitted the head so closely that they moved with the wearer."</w:t>
       </w:r>
     </w:p>
     <w:p>
@@ -7508,15 +8402,15 @@
           <w:sz w:val="20"/>
           <w:szCs w:val="20"/>
         </w:rPr>
-        <w:t xml:space="preserve"> Start frame: A modern high-cut desert-tan combat helmet resting on sandbags at dusk in an arid landscape, beside a cutaway of it on a featureless matte-grey mannequin head showing shock-absorbing foam pads inside and a tactical over-ear headset fitted below the raised edges. Camera and subject motion: A pressure ripple passes through the cutaway helmet and spreads evenly through the foam pads while the camera slowly orbits toward the headset; dust drifts across the dusk sky, one continuous unbroken move. Framing: low-angle 3/4 close-up. Lighting: soft backlight creating a thin glowing rim around the silhouette, front mostly in shadow. Ambient motion: thin atmospheric haze drifts slowly through the backlight. Mood: harsh, then reassuring. Motion: very slow, smooth, weighted and cinematic, no camera shake, no sudden cuts. Keep every object, material and the lighting consistent with the start frame; add nothing beyond what the motion describes, never people, hands, text or logos; no warping or shape changes other than the described action. Visual style: Dark Archive Macro, a photoreal 3D CGI render in a museum-artifact still-life look, low-key lighting with steep falloff into near-black, desaturated charcoal, graphite, worn wood, aged steel and dull bronze with warm brass accents, extremely high surface detail. Duration: longest clip available (5–10 seconds), 16:9; slow to ~23 seconds in the edit.</w:t>
-      </w:r>
-    </w:p>
-    <w:p>
-      <w:pPr>
-        <w:pStyle w:val="Heading3"/>
-      </w:pPr>
-      <w:r>
-        <w:t xml:space="preserve">Shot 29 (8:32–8:44, ~12s)</w:t>
+        <w:t xml:space="preserve"> 8-second shot. Scene: A dark museum gallery: a polished 15th-century steel armet helmet with close-fitting cheek plates on a pedestal in a single spotlight, and on the table in front of it a flintlock musket, a powder horn, a small pile of black gunpowder and a flattened lead musket ball. Camera and motion: Slow orbit around the gleaming armet on its pedestal in the spotlight. Ambient: fine dust motes float slowly through the pools of light. Lighting: narrow overhead spotlight forming a pool of light on the table, everything else falling into black. Mood: peak, then ominous turn. Style: photoreal 3D CGI, museum-artifact look, dark low-key lighting with steep falloff into near-black, desaturated charcoal, graphite, worn wood, aged steel and brass, faint haze, extremely detailed surfaces, shallow depth of field. Very slow, smooth, cinematic movement, no camera shake, no cuts. No people, no hands, no text, no logos; objects keep their shape except for the described action. Audio: no speech, no music.</w:t>
+      </w:r>
+    </w:p>
+    <w:p>
+      <w:pPr>
+        <w:pStyle w:val="Heading3"/>
+      </w:pPr>
+      <w:r>
+        <w:t xml:space="preserve">Shot 16, Clip 2 of 4 (Extend the previous clip; covers ~6s of narration)</w:t>
       </w:r>
     </w:p>
     <w:p>
@@ -7531,7 +8425,7 @@
         <w:t xml:space="preserve">[Script Segment]</w:t>
       </w:r>
       <w:r>
-        <w:t xml:space="preserve"> "Then materials moved forward again. Ultra-high molecular weight polyethylene, a plastic so light it floats on water, yet in layered form even stronger than Kevlar. Helmets made from it are lighter, and they stop even more."</w:t>
+        <w:t xml:space="preserve"> "Medieval head protection had reached its peak. Then, gunpowder arrived on the battlefield. As firearms grew more powerful,"</w:t>
       </w:r>
     </w:p>
     <w:p>
@@ -7557,15 +8451,15 @@
           <w:sz w:val="20"/>
           <w:szCs w:val="20"/>
         </w:rPr>
-        <w:t xml:space="preserve"> Start frame: A thin white ultra-high molecular weight polyethylene composite plate floating on the dark water of a glass tank under a single lamp, a sleek matte-grey modern polyethylene combat helmet resting on dark wood behind it. Camera and subject motion: The plate bobs gently on the rippling water while the camera rises and racks focus to the helmet behind, one continuous unbroken move. Framing: low side close-up at water level. Lighting: narrow overhead spotlight forming a pool of light on the table, everything else falling into black. Ambient motion: fine dust motes float slowly through the pools of light. Mood: surprising, advanced. Motion: very slow, smooth, weighted and cinematic, no camera shake, no sudden cuts. Keep every object, material and the lighting consistent with the start frame; add nothing beyond what the motion describes, never people, hands, text or logos; no warping or shape changes other than the described action. Visual style: Dark Archive Macro, a photoreal 3D CGI render in a museum-artifact still-life look, low-key lighting with steep falloff into near-black, desaturated charcoal, graphite, worn wood, aged steel and dull bronze with warm brass accents, extremely high surface detail. Duration: longest clip available (5–10 seconds), 16:9; slow to ~12 seconds in the edit.</w:t>
-      </w:r>
-    </w:p>
-    <w:p>
-      <w:pPr>
-        <w:pStyle w:val="Heading3"/>
-      </w:pPr>
-      <w:r>
-        <w:t xml:space="preserve">Shot 30 (8:44–9:10, ~26s)</w:t>
+        <w:t xml:space="preserve"> Continue the same shot for 8 seconds with the same objects, lighting and style. Scene: A dark museum gallery: a polished 15th-century steel armet helmet with close-fitting cheek plates on a pedestal in a single spotlight, and on the table in front of it a flintlock musket, a powder horn, a small pile of black gunpowder and a flattened lead musket ball. Camera and motion: Slow pull back revealing the flintlock musket and gunpowder in the foreground as the spotlight on the armet begins to dim. Ambient: fine dust motes float slowly through the pools of light. Style: photoreal 3D CGI, museum-artifact look, dark low-key lighting with steep falloff into near-black, desaturated charcoal, graphite, worn wood, aged steel and brass, faint haze, extremely detailed surfaces, shallow depth of field. Very slow, smooth, cinematic movement, no camera shake, no cuts. No people, no hands, no text, no logos; objects keep their shape except for the described action. Audio: no speech, no music.</w:t>
+      </w:r>
+    </w:p>
+    <w:p>
+      <w:pPr>
+        <w:pStyle w:val="Heading3"/>
+      </w:pPr>
+      <w:r>
+        <w:t xml:space="preserve">Shot 16, Clip 3 of 4 (Extend the previous clip; covers ~7s of narration)</w:t>
       </w:r>
     </w:p>
     <w:p>
@@ -7580,7 +8474,7 @@
         <w:t xml:space="preserve">[Script Segment]</w:t>
       </w:r>
       <w:r>
-        <w:t xml:space="preserve"> "Today's combat helmet carries rails, night vision mounts, communication systems, and sensors. It looks nothing like a copper cap from ancient Sumer. From copper to bronze, bronze to iron, iron to steel, and steel to fiber, each step began with a wound the last helmet couldn't prevent. But the logic behind it has never changed. Every curve, every layer, and every pad is there because, at some point in history, a helmet without it failed."</w:t>
+        <w:t xml:space="preserve"> "armor thick enough to stop a musket ball became too heavy to fight in. Little by little, soldiers abandoned it."</w:t>
       </w:r>
     </w:p>
     <w:p>
@@ -7606,7 +8500,1932 @@
           <w:sz w:val="20"/>
           <w:szCs w:val="20"/>
         </w:rPr>
-        <w:t xml:space="preserve"> Start frame: A long dark table holding the full chronological lineup of helmets from a dented copper Sumerian cap, a bronze Corinthian, an iron Roman helmet, a split spangenhelm, a great helm and a WWI steel helmet to a fully equipped modern combat helmet with rails, night-vision mount and headset at the near end, each lit by its own light. Camera and subject motion: The lights along the table slowly dim one by one from the oldest helmet to the newest until only the modern helmet remains lit, the camera slowly pulling back, one continuous unbroken move. Framing: low-angle wide shot down the table, deep perspective. Lighting: narrow overhead spotlight forming a pool of light on the table, everything else falling into black. Ambient motion: fine dust motes float slowly through the pools of light. Mood: epic, resolved, haunting. Motion: very slow, smooth, weighted and cinematic, no camera shake, no sudden cuts. Keep every object, material and the lighting consistent with the start frame; add nothing beyond what the motion describes, never people, hands, text or logos; no warping or shape changes other than the described action. Visual style: Dark Archive Macro, a photoreal 3D CGI render in a museum-artifact still-life look, low-key lighting with steep falloff into near-black, desaturated charcoal, graphite, worn wood, aged steel and dull bronze with warm brass accents, extremely high surface detail. Duration: longest clip available (5–10 seconds), 16:9; slow to ~26 seconds in the edit.</w:t>
+        <w:t xml:space="preserve"> Continue the same shot for 8 seconds with the same objects, lighting and style. Scene: A dark museum gallery: a polished 15th-century steel armet helmet with close-fitting cheek plates on a pedestal in a single spotlight, and on the table in front of it a flintlock musket, a powder horn, a small pile of black gunpowder and a flattened lead musket ball. Camera and motion: Slow push-in on the flattened lead musket ball as a match flare lights the pile of gunpowder. Ambient: fine dust motes float slowly through the pools of light. Style: photoreal 3D CGI, museum-artifact look, dark low-key lighting with steep falloff into near-black, desaturated charcoal, graphite, worn wood, aged steel and brass, faint haze, extremely detailed surfaces, shallow depth of field. Very slow, smooth, cinematic movement, no camera shake, no cuts. No people, no hands, no text, no logos; objects keep their shape except for the described action. Audio: no speech, no music.</w:t>
+      </w:r>
+    </w:p>
+    <w:p>
+      <w:pPr>
+        <w:pStyle w:val="Heading3"/>
+      </w:pPr>
+      <w:r>
+        <w:t xml:space="preserve">Shot 16, Clip 4 of 4 (Extend the previous clip; covers ~7s of narration)</w:t>
+      </w:r>
+    </w:p>
+    <w:p>
+      <w:pPr>
+        <w:spacing w:after="120"/>
+      </w:pPr>
+      <w:r>
+        <w:rPr>
+          <w:b/>
+          <w:bCs/>
+        </w:rPr>
+        <w:t xml:space="preserve">[Script Segment]</w:t>
+      </w:r>
+      <w:r>
+        <w:t xml:space="preserve"> "By the 18th century, most infantry marched into battle wearing felt, cloth, and leather. Helmets survived mostly as decoration."</w:t>
+      </w:r>
+    </w:p>
+    <w:p>
+      <w:pPr>
+        <w:pBdr>
+          <w:left w:val="single" w:color="B9A882" w:sz="18" w:space="8"/>
+        </w:pBdr>
+        <w:shd w:fill="F3F1EC" w:color="auto" w:val="clear"/>
+        <w:spacing w:after="160" w:line="276"/>
+        <w:ind w:left="200" w:right="120"/>
+      </w:pPr>
+      <w:r>
+        <w:rPr>
+          <w:b/>
+          <w:bCs/>
+          <w:sz w:val="20"/>
+          <w:szCs w:val="20"/>
+        </w:rPr>
+        <w:t xml:space="preserve">Video Prompt:</w:t>
+      </w:r>
+      <w:r>
+        <w:rPr>
+          <w:sz w:val="20"/>
+          <w:szCs w:val="20"/>
+        </w:rPr>
+        <w:t xml:space="preserve"> Continue the same shot for 8 seconds with the same objects, lighting and style. Scene: A dark museum gallery: a polished 15th-century steel armet helmet with close-fitting cheek plates on a pedestal in a single spotlight, and on the table in front of it a flintlock musket, a powder horn, a small pile of black gunpowder and a flattened lead musket ball. Camera and motion: Slow pull back as the armet sinks into darkness, smoke drifting across the table. Ambient: fine dust motes float slowly through the pools of light. Style: photoreal 3D CGI, museum-artifact look, dark low-key lighting with steep falloff into near-black, desaturated charcoal, graphite, worn wood, aged steel and brass, faint haze, extremely detailed surfaces, shallow depth of field. Very slow, smooth, cinematic movement, no camera shake, no cuts. No people, no hands, no text, no logos; objects keep their shape except for the described action. Audio: no speech, no music.</w:t>
+      </w:r>
+    </w:p>
+    <w:p>
+      <w:pPr>
+        <w:pStyle w:val="Heading3"/>
+      </w:pPr>
+      <w:r>
+        <w:t xml:space="preserve">Shot 17 (5:06, ~21s, 3 clips)</w:t>
+      </w:r>
+    </w:p>
+    <w:p>
+      <w:pPr>
+        <w:pStyle w:val="Heading3"/>
+      </w:pPr>
+      <w:r>
+        <w:t xml:space="preserve">Shot 17, Clip 1 of 3 (Frames to Video, shot image as first frame; covers ~6s of narration)</w:t>
+      </w:r>
+    </w:p>
+    <w:p>
+      <w:pPr>
+        <w:spacing w:after="120"/>
+      </w:pPr>
+      <w:r>
+        <w:rPr>
+          <w:b/>
+          <w:bCs/>
+        </w:rPr>
+        <w:t xml:space="preserve">[Script Segment]</w:t>
+      </w:r>
+      <w:r>
+        <w:t xml:space="preserve"> "There were exceptions. Heavy cavalry, like Napoleon's cuirassiers, kept their steel helmets and breastplates well into the 1800s."</w:t>
+      </w:r>
+    </w:p>
+    <w:p>
+      <w:pPr>
+        <w:pBdr>
+          <w:left w:val="single" w:color="B9A882" w:sz="18" w:space="8"/>
+        </w:pBdr>
+        <w:shd w:fill="F3F1EC" w:color="auto" w:val="clear"/>
+        <w:spacing w:after="160" w:line="276"/>
+        <w:ind w:left="200" w:right="120"/>
+      </w:pPr>
+      <w:r>
+        <w:rPr>
+          <w:b/>
+          <w:bCs/>
+          <w:sz w:val="20"/>
+          <w:szCs w:val="20"/>
+        </w:rPr>
+        <w:t xml:space="preserve">Video Prompt:</w:t>
+      </w:r>
+      <w:r>
+        <w:rPr>
+          <w:sz w:val="20"/>
+          <w:szCs w:val="20"/>
+        </w:rPr>
+        <w:t xml:space="preserve"> 8-second shot. Scene: A dark table with a Napoleonic French cuirassier steel helmet with brass crest and horsehair mane, a simple cloth infantry cap, and a black leather Prussian Pickelhaube with brass spike and eagle plate, with a brass WWI artillery shell standing upright at the end of the row in a harsh spotlight. Camera and motion: Slow lateral slide along the row, starting on the Napoleonic cuirassier helmet with its brass crest and horsehair mane. Ambient: fine dust motes float slowly through the pools of light. Lighting: narrow overhead spotlight forming a pool of light on the table, everything else falling into black. Mood: proud, then ominous. Style: photoreal 3D CGI, museum-artifact look, dark low-key lighting with steep falloff into near-black, desaturated charcoal, graphite, worn wood, aged steel and brass, faint haze, extremely detailed surfaces, shallow depth of field. Very slow, smooth, cinematic movement, no camera shake, no cuts. No people, no hands, no text, no logos; objects keep their shape except for the described action. Audio: no speech, no music.</w:t>
+      </w:r>
+    </w:p>
+    <w:p>
+      <w:pPr>
+        <w:pStyle w:val="Heading3"/>
+      </w:pPr>
+      <w:r>
+        <w:t xml:space="preserve">Shot 17, Clip 2 of 3 (Extend the previous clip; covers ~8s of narration)</w:t>
+      </w:r>
+    </w:p>
+    <w:p>
+      <w:pPr>
+        <w:spacing w:after="120"/>
+      </w:pPr>
+      <w:r>
+        <w:rPr>
+          <w:b/>
+          <w:bCs/>
+        </w:rPr>
+        <w:t xml:space="preserve">[Script Segment]</w:t>
+      </w:r>
+      <w:r>
+        <w:t xml:space="preserve"> "But for the common foot soldier, the helmet had all but disappeared. Prussia's famous spiked Pickelhaube of 1842 was made of hardened leather."</w:t>
+      </w:r>
+    </w:p>
+    <w:p>
+      <w:pPr>
+        <w:pBdr>
+          <w:left w:val="single" w:color="B9A882" w:sz="18" w:space="8"/>
+        </w:pBdr>
+        <w:shd w:fill="F3F1EC" w:color="auto" w:val="clear"/>
+        <w:spacing w:after="160" w:line="276"/>
+        <w:ind w:left="200" w:right="120"/>
+      </w:pPr>
+      <w:r>
+        <w:rPr>
+          <w:b/>
+          <w:bCs/>
+          <w:sz w:val="20"/>
+          <w:szCs w:val="20"/>
+        </w:rPr>
+        <w:t xml:space="preserve">Video Prompt:</w:t>
+      </w:r>
+      <w:r>
+        <w:rPr>
+          <w:sz w:val="20"/>
+          <w:szCs w:val="20"/>
+        </w:rPr>
+        <w:t xml:space="preserve"> Continue the same shot for 8 seconds with the same objects, lighting and style. Scene: A dark table with a Napoleonic French cuirassier steel helmet with brass crest and horsehair mane, a simple cloth infantry cap, and a black leather Prussian Pickelhaube with brass spike and eagle plate, with a brass WWI artillery shell standing upright at the end of the row in a harsh spotlight. Camera and motion: Continue the slide past the simple cloth cap to the black leather Pickelhaube with its brass spike. Ambient: fine dust motes float slowly through the pools of light. Style: photoreal 3D CGI, museum-artifact look, dark low-key lighting with steep falloff into near-black, desaturated charcoal, graphite, worn wood, aged steel and brass, faint haze, extremely detailed surfaces, shallow depth of field. Very slow, smooth, cinematic movement, no camera shake, no cuts. No people, no hands, no text, no logos; objects keep their shape except for the described action. Audio: no speech, no music.</w:t>
+      </w:r>
+    </w:p>
+    <w:p>
+      <w:pPr>
+        <w:pStyle w:val="Heading3"/>
+      </w:pPr>
+      <w:r>
+        <w:t xml:space="preserve">Shot 17, Clip 3 of 3 (Extend the previous clip; covers ~7s of narration)</w:t>
+      </w:r>
+    </w:p>
+    <w:p>
+      <w:pPr>
+        <w:spacing w:after="120"/>
+      </w:pPr>
+      <w:r>
+        <w:rPr>
+          <w:b/>
+          <w:bCs/>
+        </w:rPr>
+        <w:t xml:space="preserve">[Script Segment]</w:t>
+      </w:r>
+      <w:r>
+        <w:t xml:space="preserve"> "It looked impressive, but it offered almost no protection. For nearly two hundred years, that seemed acceptable. Until 1914."</w:t>
+      </w:r>
+    </w:p>
+    <w:p>
+      <w:pPr>
+        <w:pBdr>
+          <w:left w:val="single" w:color="B9A882" w:sz="18" w:space="8"/>
+        </w:pBdr>
+        <w:shd w:fill="F3F1EC" w:color="auto" w:val="clear"/>
+        <w:spacing w:after="160" w:line="276"/>
+        <w:ind w:left="200" w:right="120"/>
+      </w:pPr>
+      <w:r>
+        <w:rPr>
+          <w:b/>
+          <w:bCs/>
+          <w:sz w:val="20"/>
+          <w:szCs w:val="20"/>
+        </w:rPr>
+        <w:t xml:space="preserve">Video Prompt:</w:t>
+      </w:r>
+      <w:r>
+        <w:rPr>
+          <w:sz w:val="20"/>
+          <w:szCs w:val="20"/>
+        </w:rPr>
+        <w:t xml:space="preserve"> Continue the same shot for 8 seconds with the same objects, lighting and style. Scene: A dark table with a Napoleonic French cuirassier steel helmet with brass crest and horsehair mane, a simple cloth infantry cap, and a black leather Prussian Pickelhaube with brass spike and eagle plate, with a brass WWI artillery shell standing upright at the end of the row in a harsh spotlight. Camera and motion: Continue to the brass artillery shell at the end of the row as the light hardens and the camera stops dead. Ambient: fine dust motes float slowly through the pools of light. Style: photoreal 3D CGI, museum-artifact look, dark low-key lighting with steep falloff into near-black, desaturated charcoal, graphite, worn wood, aged steel and brass, faint haze, extremely detailed surfaces, shallow depth of field. Very slow, smooth, cinematic movement, no camera shake, no cuts. No people, no hands, no text, no logos; objects keep their shape except for the described action. Audio: no speech, no music.</w:t>
+      </w:r>
+    </w:p>
+    <w:p>
+      <w:pPr>
+        <w:pStyle w:val="Heading3"/>
+      </w:pPr>
+      <w:r>
+        <w:t xml:space="preserve">Shot 18 (5:27, ~15s, 2 clips)</w:t>
+      </w:r>
+    </w:p>
+    <w:p>
+      <w:pPr>
+        <w:pStyle w:val="Heading3"/>
+      </w:pPr>
+      <w:r>
+        <w:t xml:space="preserve">Shot 18, Clip 1 of 2 (Frames to Video, shot image as first frame; covers ~8s of narration)</w:t>
+      </w:r>
+    </w:p>
+    <w:p>
+      <w:pPr>
+        <w:spacing w:after="120"/>
+      </w:pPr>
+      <w:r>
+        <w:rPr>
+          <w:b/>
+          <w:bCs/>
+        </w:rPr>
+        <w:t xml:space="preserve">[Script Segment]</w:t>
+      </w:r>
+      <w:r>
+        <w:t xml:space="preserve"> "The First World War was dominated by artillery. Shells burst above the trenches, raining hot metal fragments down on the men below."</w:t>
+      </w:r>
+    </w:p>
+    <w:p>
+      <w:pPr>
+        <w:pBdr>
+          <w:left w:val="single" w:color="B9A882" w:sz="18" w:space="8"/>
+        </w:pBdr>
+        <w:shd w:fill="F3F1EC" w:color="auto" w:val="clear"/>
+        <w:spacing w:after="160" w:line="276"/>
+        <w:ind w:left="200" w:right="120"/>
+      </w:pPr>
+      <w:r>
+        <w:rPr>
+          <w:b/>
+          <w:bCs/>
+          <w:sz w:val="20"/>
+          <w:szCs w:val="20"/>
+        </w:rPr>
+        <w:t xml:space="preserve">Video Prompt:</w:t>
+      </w:r>
+      <w:r>
+        <w:rPr>
+          <w:sz w:val="20"/>
+          <w:szCs w:val="20"/>
+        </w:rPr>
+        <w:t xml:space="preserve"> 8-second shot. Scene: An empty WWI trench at night under an exploding airburst artillery shell, glowing jagged metal fragments raining down onto wet sandbags, a soft wool cloth cap lying in the mud below the parapet, barbed wire silhouettes beyond. Camera and motion: Fragments from the airburst shell rain down in slow motion over the empty trench, smoke drifting. Ambient: warm firelight flickers gently across the metal and tiny embers drift upward. Lighting: warm flickering orange glow from a forge or flame mixed with cold grey ambient fill. Mood: terrifying, vulnerable. Style: photoreal 3D CGI, museum-artifact look, dark low-key lighting with steep falloff into near-black, desaturated charcoal, graphite, worn wood, aged steel and brass, faint haze, extremely detailed surfaces, shallow depth of field. Very slow, smooth, cinematic movement, no camera shake, no cuts. No people, no hands, no text, no logos; objects keep their shape except for the described action. Audio: no speech, no music.</w:t>
+      </w:r>
+    </w:p>
+    <w:p>
+      <w:pPr>
+        <w:pStyle w:val="Heading3"/>
+      </w:pPr>
+      <w:r>
+        <w:t xml:space="preserve">Shot 18, Clip 2 of 2 (Extend the previous clip; covers ~8s of narration)</w:t>
+      </w:r>
+    </w:p>
+    <w:p>
+      <w:pPr>
+        <w:spacing w:after="120"/>
+      </w:pPr>
+      <w:r>
+        <w:rPr>
+          <w:b/>
+          <w:bCs/>
+        </w:rPr>
+        <w:t xml:space="preserve">[Script Segment]</w:t>
+      </w:r>
+      <w:r>
+        <w:t xml:space="preserve"> "A soldier only had to raise his head above the parapet to be struck. And most of them were wearing fabric caps."</w:t>
+      </w:r>
+    </w:p>
+    <w:p>
+      <w:pPr>
+        <w:pBdr>
+          <w:left w:val="single" w:color="B9A882" w:sz="18" w:space="8"/>
+        </w:pBdr>
+        <w:shd w:fill="F3F1EC" w:color="auto" w:val="clear"/>
+        <w:spacing w:after="160" w:line="276"/>
+        <w:ind w:left="200" w:right="120"/>
+      </w:pPr>
+      <w:r>
+        <w:rPr>
+          <w:b/>
+          <w:bCs/>
+          <w:sz w:val="20"/>
+          <w:szCs w:val="20"/>
+        </w:rPr>
+        <w:t xml:space="preserve">Video Prompt:</w:t>
+      </w:r>
+      <w:r>
+        <w:rPr>
+          <w:sz w:val="20"/>
+          <w:szCs w:val="20"/>
+        </w:rPr>
+        <w:t xml:space="preserve"> Continue the same shot for 8 seconds with the same objects, lighting and style. Scene: An empty WWI trench at night under an exploding airburst artillery shell, glowing jagged metal fragments raining down onto wet sandbags, a soft wool cloth cap lying in the mud below the parapet, barbed wire silhouettes beyond. Camera and motion: Slow tilt down from the burst to the soft cloth cap lying in the mud below the parapet. Ambient: warm firelight flickers gently across the metal and tiny embers drift upward. Style: photoreal 3D CGI, museum-artifact look, dark low-key lighting with steep falloff into near-black, desaturated charcoal, graphite, worn wood, aged steel and brass, faint haze, extremely detailed surfaces, shallow depth of field. Very slow, smooth, cinematic movement, no camera shake, no cuts. No people, no hands, no text, no logos; objects keep their shape except for the described action. Audio: no speech, no music.</w:t>
+      </w:r>
+    </w:p>
+    <w:p>
+      <w:pPr>
+        <w:pStyle w:val="Heading3"/>
+      </w:pPr>
+      <w:r>
+        <w:t xml:space="preserve">Shot 19 (5:42, ~24s, 3 clips)</w:t>
+      </w:r>
+    </w:p>
+    <w:p>
+      <w:pPr>
+        <w:pStyle w:val="Heading3"/>
+      </w:pPr>
+      <w:r>
+        <w:t xml:space="preserve">Shot 19, Clip 1 of 3 (Frames to Video, shot image as first frame; covers ~9s of narration)</w:t>
+      </w:r>
+    </w:p>
+    <w:p>
+      <w:pPr>
+        <w:spacing w:after="120"/>
+      </w:pPr>
+      <w:r>
+        <w:rPr>
+          <w:b/>
+          <w:bCs/>
+        </w:rPr>
+        <w:t xml:space="preserve">[Script Segment]</w:t>
+      </w:r>
+      <w:r>
+        <w:t xml:space="preserve"> "France reacted first. Its soldiers began receiving steel skullcaps to wear underneath their kepis. Within months, the army introduced a full steel helmet, the Adrian."</w:t>
+      </w:r>
+    </w:p>
+    <w:p>
+      <w:pPr>
+        <w:pBdr>
+          <w:left w:val="single" w:color="B9A882" w:sz="18" w:space="8"/>
+        </w:pBdr>
+        <w:shd w:fill="F3F1EC" w:color="auto" w:val="clear"/>
+        <w:spacing w:after="160" w:line="276"/>
+        <w:ind w:left="200" w:right="120"/>
+      </w:pPr>
+      <w:r>
+        <w:rPr>
+          <w:b/>
+          <w:bCs/>
+          <w:sz w:val="20"/>
+          <w:szCs w:val="20"/>
+        </w:rPr>
+        <w:t xml:space="preserve">Video Prompt:</w:t>
+      </w:r>
+      <w:r>
+        <w:rPr>
+          <w:sz w:val="20"/>
+          <w:szCs w:val="20"/>
+        </w:rPr>
+        <w:t xml:space="preserve"> 8-second shot. Scene: A dark industrial workshop: a horizon-blue French Adrian helmet with its crest ridge and a khaki British Brodie helmet with a wide flat brim on a workbench, behind them a steel press stamping a flat sheet into a Brodie shape with sparks and steam, and a line of identical Brodie helmets fading into the dark. Camera and motion: Slow slide across the workbench from the horizon-blue French Adrian helmet to the khaki British Brodie helmet. Ambient: warm firelight flickers gently across the metal and tiny embers drift upward. Lighting: warm flickering orange glow from a forge or flame mixed with cold grey ambient fill. Mood: industrial, urgent. Style: photoreal 3D CGI, museum-artifact look, dark low-key lighting with steep falloff into near-black, desaturated charcoal, graphite, worn wood, aged steel and brass, faint haze, extremely detailed surfaces, shallow depth of field. Very slow, smooth, cinematic movement, no camera shake, no cuts. No people, no hands, no text, no logos; objects keep their shape except for the described action. Audio: no speech, no music.</w:t>
+      </w:r>
+    </w:p>
+    <w:p>
+      <w:pPr>
+        <w:pStyle w:val="Heading3"/>
+      </w:pPr>
+      <w:r>
+        <w:t xml:space="preserve">Shot 19, Clip 2 of 3 (Extend the previous clip; covers ~8s of narration)</w:t>
+      </w:r>
+    </w:p>
+    <w:p>
+      <w:pPr>
+        <w:spacing w:after="120"/>
+      </w:pPr>
+      <w:r>
+        <w:rPr>
+          <w:b/>
+          <w:bCs/>
+        </w:rPr>
+        <w:t xml:space="preserve">[Script Segment]</w:t>
+      </w:r>
+      <w:r>
+        <w:t xml:space="preserve"> "Britain followed with the Brodie helmet. Its design was brilliant in its simplicity. It was pressed from a single sheet of manganese steel,"</w:t>
+      </w:r>
+    </w:p>
+    <w:p>
+      <w:pPr>
+        <w:pBdr>
+          <w:left w:val="single" w:color="B9A882" w:sz="18" w:space="8"/>
+        </w:pBdr>
+        <w:shd w:fill="F3F1EC" w:color="auto" w:val="clear"/>
+        <w:spacing w:after="160" w:line="276"/>
+        <w:ind w:left="200" w:right="120"/>
+      </w:pPr>
+      <w:r>
+        <w:rPr>
+          <w:b/>
+          <w:bCs/>
+          <w:sz w:val="20"/>
+          <w:szCs w:val="20"/>
+        </w:rPr>
+        <w:t xml:space="preserve">Video Prompt:</w:t>
+      </w:r>
+      <w:r>
+        <w:rPr>
+          <w:sz w:val="20"/>
+          <w:szCs w:val="20"/>
+        </w:rPr>
+        <w:t xml:space="preserve"> Continue the same shot for 8 seconds with the same objects, lighting and style. Scene: A dark industrial workshop: a horizon-blue French Adrian helmet with its crest ridge and a khaki British Brodie helmet with a wide flat brim on a workbench, behind them a steel press stamping a flat sheet into a Brodie shape with sparks and steam, and a line of identical Brodie helmets fading into the dark. Camera and motion: The steel press slams down in slow motion with sparks and steam as the camera eases toward it. Ambient: warm firelight flickers gently across the metal and tiny embers drift upward. Style: photoreal 3D CGI, museum-artifact look, dark low-key lighting with steep falloff into near-black, desaturated charcoal, graphite, worn wood, aged steel and brass, faint haze, extremely detailed surfaces, shallow depth of field. Very slow, smooth, cinematic movement, no camera shake, no cuts. No people, no hands, no text, no logos; objects keep their shape except for the described action. Audio: no speech, no music.</w:t>
+      </w:r>
+    </w:p>
+    <w:p>
+      <w:pPr>
+        <w:pStyle w:val="Heading3"/>
+      </w:pPr>
+      <w:r>
+        <w:t xml:space="preserve">Shot 19, Clip 3 of 3 (Extend the previous clip; covers ~7s of narration)</w:t>
+      </w:r>
+    </w:p>
+    <w:p>
+      <w:pPr>
+        <w:spacing w:after="120"/>
+      </w:pPr>
+      <w:r>
+        <w:rPr>
+          <w:b/>
+          <w:bCs/>
+        </w:rPr>
+        <w:t xml:space="preserve">[Script Segment]</w:t>
+      </w:r>
+      <w:r>
+        <w:t xml:space="preserve"> "a process fast enough to produce millions. Its wide, shallow brim shielded the head and shoulders from fragments falling from above."</w:t>
+      </w:r>
+    </w:p>
+    <w:p>
+      <w:pPr>
+        <w:pBdr>
+          <w:left w:val="single" w:color="B9A882" w:sz="18" w:space="8"/>
+        </w:pBdr>
+        <w:shd w:fill="F3F1EC" w:color="auto" w:val="clear"/>
+        <w:spacing w:after="160" w:line="276"/>
+        <w:ind w:left="200" w:right="120"/>
+      </w:pPr>
+      <w:r>
+        <w:rPr>
+          <w:b/>
+          <w:bCs/>
+          <w:sz w:val="20"/>
+          <w:szCs w:val="20"/>
+        </w:rPr>
+        <w:t xml:space="preserve">Video Prompt:</w:t>
+      </w:r>
+      <w:r>
+        <w:rPr>
+          <w:sz w:val="20"/>
+          <w:szCs w:val="20"/>
+        </w:rPr>
+        <w:t xml:space="preserve"> Continue the same shot for 8 seconds with the same objects, lighting and style. Scene: A dark industrial workshop: a horizon-blue French Adrian helmet with its crest ridge and a khaki British Brodie helmet with a wide flat brim on a workbench, behind them a steel press stamping a flat sheet into a Brodie shape with sparks and steam, and a line of identical Brodie helmets fading into the dark. Camera and motion: Slow glide along the line of identical Brodie helmets fading into the dark. Ambient: warm firelight flickers gently across the metal and tiny embers drift upward. Style: photoreal 3D CGI, museum-artifact look, dark low-key lighting with steep falloff into near-black, desaturated charcoal, graphite, worn wood, aged steel and brass, faint haze, extremely detailed surfaces, shallow depth of field. Very slow, smooth, cinematic movement, no camera shake, no cuts. No people, no hands, no text, no logos; objects keep their shape except for the described action. Audio: no speech, no music.</w:t>
+      </w:r>
+    </w:p>
+    <w:p>
+      <w:pPr>
+        <w:pStyle w:val="Heading3"/>
+      </w:pPr>
+      <w:r>
+        <w:t xml:space="preserve">Shot 20 (6:06, ~13s, 2 clips)</w:t>
+      </w:r>
+    </w:p>
+    <w:p>
+      <w:pPr>
+        <w:pStyle w:val="Heading3"/>
+      </w:pPr>
+      <w:r>
+        <w:t xml:space="preserve">Shot 20, Clip 1 of 2 (Frames to Video, shot image as first frame; covers ~7s of narration)</w:t>
+      </w:r>
+    </w:p>
+    <w:p>
+      <w:pPr>
+        <w:spacing w:after="120"/>
+      </w:pPr>
+      <w:r>
+        <w:rPr>
+          <w:b/>
+          <w:bCs/>
+        </w:rPr>
+        <w:t xml:space="preserve">[Script Segment]</w:t>
+      </w:r>
+      <w:r>
+        <w:t xml:space="preserve"> "Germany went further. In 1916, it introduced the Stahlhelm. Made of nickel steel, its deep shape extended down over the ears"</w:t>
+      </w:r>
+    </w:p>
+    <w:p>
+      <w:pPr>
+        <w:pBdr>
+          <w:left w:val="single" w:color="B9A882" w:sz="18" w:space="8"/>
+        </w:pBdr>
+        <w:shd w:fill="F3F1EC" w:color="auto" w:val="clear"/>
+        <w:spacing w:after="160" w:line="276"/>
+        <w:ind w:left="200" w:right="120"/>
+      </w:pPr>
+      <w:r>
+        <w:rPr>
+          <w:b/>
+          <w:bCs/>
+          <w:sz w:val="20"/>
+          <w:szCs w:val="20"/>
+        </w:rPr>
+        <w:t xml:space="preserve">Video Prompt:</w:t>
+      </w:r>
+      <w:r>
+        <w:rPr>
+          <w:sz w:val="20"/>
+          <w:szCs w:val="20"/>
+        </w:rPr>
+        <w:t xml:space="preserve"> 8-second shot. Scene: A field-grey German M1916 Stahlhelm on a dark stand, its deep skirt flaring down over the ears and the back of the neck, against a softly glowing grey haze. Camera and motion: Slow orbit from the front of the Stahlhelm toward its side profile, showing the deep skirt over the ears. Ambient: thin atmospheric haze drifts slowly through the backlight. Lighting: soft backlight creating a thin glowing rim around the silhouette, front mostly in shadow. Mood: iconic, haunting. Style: photoreal 3D CGI, museum-artifact look, dark low-key lighting with steep falloff into near-black, desaturated charcoal, graphite, worn wood, aged steel and brass, faint haze, extremely detailed surfaces, shallow depth of field. Very slow, smooth, cinematic movement, no camera shake, no cuts. No people, no hands, no text, no logos; objects keep their shape except for the described action. Audio: no speech, no music.</w:t>
+      </w:r>
+    </w:p>
+    <w:p>
+      <w:pPr>
+        <w:pStyle w:val="Heading3"/>
+      </w:pPr>
+      <w:r>
+        <w:t xml:space="preserve">Shot 20, Clip 2 of 2 (Extend the previous clip; covers ~6s of narration)</w:t>
+      </w:r>
+    </w:p>
+    <w:p>
+      <w:pPr>
+        <w:spacing w:after="120"/>
+      </w:pPr>
+      <w:r>
+        <w:rPr>
+          <w:b/>
+          <w:bCs/>
+        </w:rPr>
+        <w:t xml:space="preserve">[Script Segment]</w:t>
+      </w:r>
+      <w:r>
+        <w:t xml:space="preserve"> "and the back of the neck. It became one of the most recognizable silhouettes of the twentieth century."</w:t>
+      </w:r>
+    </w:p>
+    <w:p>
+      <w:pPr>
+        <w:pBdr>
+          <w:left w:val="single" w:color="B9A882" w:sz="18" w:space="8"/>
+        </w:pBdr>
+        <w:shd w:fill="F3F1EC" w:color="auto" w:val="clear"/>
+        <w:spacing w:after="160" w:line="276"/>
+        <w:ind w:left="200" w:right="120"/>
+      </w:pPr>
+      <w:r>
+        <w:rPr>
+          <w:b/>
+          <w:bCs/>
+          <w:sz w:val="20"/>
+          <w:szCs w:val="20"/>
+        </w:rPr>
+        <w:t xml:space="preserve">Video Prompt:</w:t>
+      </w:r>
+      <w:r>
+        <w:rPr>
+          <w:sz w:val="20"/>
+          <w:szCs w:val="20"/>
+        </w:rPr>
+        <w:t xml:space="preserve"> Continue the same shot for 8 seconds with the same objects, lighting and style. Scene: A field-grey German M1916 Stahlhelm on a dark stand, its deep skirt flaring down over the ears and the back of the neck, against a softly glowing grey haze. Camera and motion: Continue the orbit until the helmet becomes a pure black silhouette against the glowing haze. Ambient: thin atmospheric haze drifts slowly through the backlight. Style: photoreal 3D CGI, museum-artifact look, dark low-key lighting with steep falloff into near-black, desaturated charcoal, graphite, worn wood, aged steel and brass, faint haze, extremely detailed surfaces, shallow depth of field. Very slow, smooth, cinematic movement, no camera shake, no cuts. No people, no hands, no text, no logos; objects keep their shape except for the described action. Audio: no speech, no music.</w:t>
+      </w:r>
+    </w:p>
+    <w:p>
+      <w:pPr>
+        <w:pStyle w:val="Heading3"/>
+      </w:pPr>
+      <w:r>
+        <w:t xml:space="preserve">Shot 21 (6:20, ~15s, 2 clips)</w:t>
+      </w:r>
+    </w:p>
+    <w:p>
+      <w:pPr>
+        <w:pStyle w:val="Heading3"/>
+      </w:pPr>
+      <w:r>
+        <w:t xml:space="preserve">Shot 21, Clip 1 of 2 (Frames to Video, shot image as first frame; covers ~8s of narration)</w:t>
+      </w:r>
+    </w:p>
+    <w:p>
+      <w:pPr>
+        <w:spacing w:after="120"/>
+      </w:pPr>
+      <w:r>
+        <w:rPr>
+          <w:b/>
+          <w:bCs/>
+        </w:rPr>
+        <w:t xml:space="preserve">[Script Segment]</w:t>
+      </w:r>
+      <w:r>
+        <w:t xml:space="preserve"> "Germany even tried to add an extra steel plate that hung from lugs on the front, meant to stop bullets at the brow."</w:t>
+      </w:r>
+    </w:p>
+    <w:p>
+      <w:pPr>
+        <w:pBdr>
+          <w:left w:val="single" w:color="B9A882" w:sz="18" w:space="8"/>
+        </w:pBdr>
+        <w:shd w:fill="F3F1EC" w:color="auto" w:val="clear"/>
+        <w:spacing w:after="160" w:line="276"/>
+        <w:ind w:left="200" w:right="120"/>
+      </w:pPr>
+      <w:r>
+        <w:rPr>
+          <w:b/>
+          <w:bCs/>
+          <w:sz w:val="20"/>
+          <w:szCs w:val="20"/>
+        </w:rPr>
+        <w:t xml:space="preserve">Video Prompt:</w:t>
+      </w:r>
+      <w:r>
+        <w:rPr>
+          <w:sz w:val="20"/>
+          <w:szCs w:val="20"/>
+        </w:rPr>
+        <w:t xml:space="preserve"> 8-second shot. Scene: A German Stahlhelm with a thick extra steel brow plate hooked onto its front lugs, a flattened bullet stuck in the plate, sitting on a rusted antique balance scale that tips heavily to one side, a medieval great helm softly blurred behind. Camera and motion: Slow push-in on the heavy brow plate and the flattened bullet stuck in it. Ambient: faint haze drifts in the darkness and specular highlights slide subtly across the metal as the view shifts. Lighting: single soft key light from upper left, steep falloff into near-black, crisp rim highlights on metal edges. Mood: burdensome, history repeating. Style: photoreal 3D CGI, museum-artifact look, dark low-key lighting with steep falloff into near-black, desaturated charcoal, graphite, worn wood, aged steel and brass, faint haze, extremely detailed surfaces, shallow depth of field. Very slow, smooth, cinematic movement, no camera shake, no cuts. No people, no hands, no text, no logos; objects keep their shape except for the described action. Audio: no speech, no music.</w:t>
+      </w:r>
+    </w:p>
+    <w:p>
+      <w:pPr>
+        <w:pStyle w:val="Heading3"/>
+      </w:pPr>
+      <w:r>
+        <w:t xml:space="preserve">Shot 21, Clip 2 of 2 (Extend the previous clip; covers ~7s of narration)</w:t>
+      </w:r>
+    </w:p>
+    <w:p>
+      <w:pPr>
+        <w:spacing w:after="120"/>
+      </w:pPr>
+      <w:r>
+        <w:rPr>
+          <w:b/>
+          <w:bCs/>
+        </w:rPr>
+        <w:t xml:space="preserve">[Script Segment]</w:t>
+      </w:r>
+      <w:r>
+        <w:t xml:space="preserve"> "It worked, but it was so heavy that few soldiers wore it for long. Once again, protection had collided with weight."</w:t>
+      </w:r>
+    </w:p>
+    <w:p>
+      <w:pPr>
+        <w:pBdr>
+          <w:left w:val="single" w:color="B9A882" w:sz="18" w:space="8"/>
+        </w:pBdr>
+        <w:shd w:fill="F3F1EC" w:color="auto" w:val="clear"/>
+        <w:spacing w:after="160" w:line="276"/>
+        <w:ind w:left="200" w:right="120"/>
+      </w:pPr>
+      <w:r>
+        <w:rPr>
+          <w:b/>
+          <w:bCs/>
+          <w:sz w:val="20"/>
+          <w:szCs w:val="20"/>
+        </w:rPr>
+        <w:t xml:space="preserve">Video Prompt:</w:t>
+      </w:r>
+      <w:r>
+        <w:rPr>
+          <w:sz w:val="20"/>
+          <w:szCs w:val="20"/>
+        </w:rPr>
+        <w:t xml:space="preserve"> Continue the same shot for 8 seconds with the same objects, lighting and style. Scene: A German Stahlhelm with a thick extra steel brow plate hooked onto its front lugs, a flattened bullet stuck in the plate, sitting on a rusted antique balance scale that tips heavily to one side, a medieval great helm softly blurred behind. Camera and motion: The scale slowly sinks further under the weight, then rack focus to the great helm blurred behind. Ambient: faint haze drifts in the darkness and specular highlights slide subtly across the metal as the view shifts. Style: photoreal 3D CGI, museum-artifact look, dark low-key lighting with steep falloff into near-black, desaturated charcoal, graphite, worn wood, aged steel and brass, faint haze, extremely detailed surfaces, shallow depth of field. Very slow, smooth, cinematic movement, no camera shake, no cuts. No people, no hands, no text, no logos; objects keep their shape except for the described action. Audio: no speech, no music.</w:t>
+      </w:r>
+    </w:p>
+    <w:p>
+      <w:pPr>
+        <w:pStyle w:val="Heading3"/>
+      </w:pPr>
+      <w:r>
+        <w:t xml:space="preserve">Shot 22 (6:35, ~12s, 2 clips)</w:t>
+      </w:r>
+    </w:p>
+    <w:p>
+      <w:pPr>
+        <w:pStyle w:val="Heading3"/>
+      </w:pPr>
+      <w:r>
+        <w:t xml:space="preserve">Shot 22, Clip 1 of 2 (Frames to Video, shot image as first frame; covers ~5s of narration)</w:t>
+      </w:r>
+    </w:p>
+    <w:p>
+      <w:pPr>
+        <w:spacing w:after="120"/>
+      </w:pPr>
+      <w:r>
+        <w:rPr>
+          <w:b/>
+          <w:bCs/>
+        </w:rPr>
+        <w:t xml:space="preserve">[Script Segment]</w:t>
+      </w:r>
+      <w:r>
+        <w:t xml:space="preserve"> "Steel helmets sharply reduced fatal head wounds. But they still had a hidden problem."</w:t>
+      </w:r>
+    </w:p>
+    <w:p>
+      <w:pPr>
+        <w:pBdr>
+          <w:left w:val="single" w:color="B9A882" w:sz="18" w:space="8"/>
+        </w:pBdr>
+        <w:shd w:fill="F3F1EC" w:color="auto" w:val="clear"/>
+        <w:spacing w:after="160" w:line="276"/>
+        <w:ind w:left="200" w:right="120"/>
+      </w:pPr>
+      <w:r>
+        <w:rPr>
+          <w:b/>
+          <w:bCs/>
+          <w:sz w:val="20"/>
+          <w:szCs w:val="20"/>
+        </w:rPr>
+        <w:t xml:space="preserve">Video Prompt:</w:t>
+      </w:r>
+      <w:r>
+        <w:rPr>
+          <w:sz w:val="20"/>
+          <w:szCs w:val="20"/>
+        </w:rPr>
+        <w:t xml:space="preserve"> 8-second shot. Scene: A cutaway cross-section of a WWI steel helmet on a featureless matte-grey mannequin head, the thin liner pressed tight against the shell, a fragment impact denting the steel straight inward with faint glowing shockwave lines travelling into the head. Camera and motion: Slow push-in on the cutaway, the thin liner pressed tight against the steel shell. Ambient: faint haze drifts in the darkness and the raking light glints softly along the edges as the view shifts. Lighting: low raking side light from the right, long soft shadows, specular glints along edges. Mood: tense, technical. Style: photoreal 3D CGI, museum-artifact look, dark low-key lighting with steep falloff into near-black, desaturated charcoal, graphite, worn wood, aged steel and brass, faint haze, extremely detailed surfaces, shallow depth of field. Very slow, smooth, cinematic movement, no camera shake, no cuts. No people, no hands, no text, no logos; objects keep their shape except for the described action. Audio: no speech, no music.</w:t>
+      </w:r>
+    </w:p>
+    <w:p>
+      <w:pPr>
+        <w:pStyle w:val="Heading3"/>
+      </w:pPr>
+      <w:r>
+        <w:t xml:space="preserve">Shot 22, Clip 2 of 2 (Extend the previous clip; covers ~7s of narration)</w:t>
+      </w:r>
+    </w:p>
+    <w:p>
+      <w:pPr>
+        <w:spacing w:after="120"/>
+      </w:pPr>
+      <w:r>
+        <w:rPr>
+          <w:b/>
+          <w:bCs/>
+        </w:rPr>
+        <w:t xml:space="preserve">[Script Segment]</w:t>
+      </w:r>
+      <w:r>
+        <w:t xml:space="preserve"> "When a fragment hit, the shell pressed directly against the skull, passing much of the impact straight into the wearer."</w:t>
+      </w:r>
+    </w:p>
+    <w:p>
+      <w:pPr>
+        <w:pBdr>
+          <w:left w:val="single" w:color="B9A882" w:sz="18" w:space="8"/>
+        </w:pBdr>
+        <w:shd w:fill="F3F1EC" w:color="auto" w:val="clear"/>
+        <w:spacing w:after="160" w:line="276"/>
+        <w:ind w:left="200" w:right="120"/>
+      </w:pPr>
+      <w:r>
+        <w:rPr>
+          <w:b/>
+          <w:bCs/>
+          <w:sz w:val="20"/>
+          <w:szCs w:val="20"/>
+        </w:rPr>
+        <w:t xml:space="preserve">Video Prompt:</w:t>
+      </w:r>
+      <w:r>
+        <w:rPr>
+          <w:sz w:val="20"/>
+          <w:szCs w:val="20"/>
+        </w:rPr>
+        <w:t xml:space="preserve"> Continue the same shot for 8 seconds with the same objects, lighting and style. Scene: A cutaway cross-section of a WWI steel helmet on a featureless matte-grey mannequin head, the thin liner pressed tight against the shell, a fragment impact denting the steel straight inward with faint glowing shockwave lines travelling into the head. Camera and motion: A fragment strikes in slow motion, the steel dents straight inward and faint glowing shockwave lines pulse into the head. Ambient: faint haze drifts in the darkness and the raking light glints softly along the edges as the view shifts. Style: photoreal 3D CGI, museum-artifact look, dark low-key lighting with steep falloff into near-black, desaturated charcoal, graphite, worn wood, aged steel and brass, faint haze, extremely detailed surfaces, shallow depth of field. Very slow, smooth, cinematic movement, no camera shake, no cuts. No people, no hands, no text, no logos; objects keep their shape except for the described action. Audio: no speech, no music.</w:t>
+      </w:r>
+    </w:p>
+    <w:p>
+      <w:pPr>
+        <w:pStyle w:val="Heading3"/>
+      </w:pPr>
+      <w:r>
+        <w:t xml:space="preserve">Shot 23 (6:46, ~19s, 3 clips)</w:t>
+      </w:r>
+    </w:p>
+    <w:p>
+      <w:pPr>
+        <w:pStyle w:val="Heading3"/>
+      </w:pPr>
+      <w:r>
+        <w:t xml:space="preserve">Shot 23, Clip 1 of 3 (Frames to Video, shot image as first frame; covers ~7s of narration)</w:t>
+      </w:r>
+    </w:p>
+    <w:p>
+      <w:pPr>
+        <w:spacing w:after="120"/>
+      </w:pPr>
+      <w:r>
+        <w:rPr>
+          <w:b/>
+          <w:bCs/>
+        </w:rPr>
+        <w:t xml:space="preserve">[Script Segment]</w:t>
+      </w:r>
+      <w:r>
+        <w:t xml:space="preserve"> "In 1941, the United States answered this with the M1 helmet. It used two separate parts. An outer steel shell,"</w:t>
+      </w:r>
+    </w:p>
+    <w:p>
+      <w:pPr>
+        <w:pBdr>
+          <w:left w:val="single" w:color="B9A882" w:sz="18" w:space="8"/>
+        </w:pBdr>
+        <w:shd w:fill="F3F1EC" w:color="auto" w:val="clear"/>
+        <w:spacing w:after="160" w:line="276"/>
+        <w:ind w:left="200" w:right="120"/>
+      </w:pPr>
+      <w:r>
+        <w:rPr>
+          <w:b/>
+          <w:bCs/>
+          <w:sz w:val="20"/>
+          <w:szCs w:val="20"/>
+        </w:rPr>
+        <w:t xml:space="preserve">Video Prompt:</w:t>
+      </w:r>
+      <w:r>
+        <w:rPr>
+          <w:sz w:val="20"/>
+          <w:szCs w:val="20"/>
+        </w:rPr>
+        <w:t xml:space="preserve"> 8-second shot. Scene: A cutaway cross-section of an olive-drab US M1 helmet on a featureless matte-grey mannequin head, showing the outer steel shell, the separate inner liner and the cotton webbing straps holding a clear gap between steel and head. Camera and motion: Slow orbit around the cutaway M1, showing the outer steel shell. Ambient: faint haze drifts in the darkness and specular highlights slide subtly across the metal as the view shifts. Lighting: single soft key light from upper left, steep falloff into near-black, crisp rim highlights on metal edges. Mood: clever, relieved. Style: photoreal 3D CGI, museum-artifact look, dark low-key lighting with steep falloff into near-black, desaturated charcoal, graphite, worn wood, aged steel and brass, faint haze, extremely detailed surfaces, shallow depth of field. Very slow, smooth, cinematic movement, no camera shake, no cuts. No people, no hands, no text, no logos; objects keep their shape except for the described action. Audio: no speech, no music.</w:t>
+      </w:r>
+    </w:p>
+    <w:p>
+      <w:pPr>
+        <w:pStyle w:val="Heading3"/>
+      </w:pPr>
+      <w:r>
+        <w:t xml:space="preserve">Shot 23, Clip 2 of 3 (Extend the previous clip; covers ~4s of narration)</w:t>
+      </w:r>
+    </w:p>
+    <w:p>
+      <w:pPr>
+        <w:spacing w:after="120"/>
+      </w:pPr>
+      <w:r>
+        <w:rPr>
+          <w:b/>
+          <w:bCs/>
+        </w:rPr>
+        <w:t xml:space="preserve">[Script Segment]</w:t>
+      </w:r>
+      <w:r>
+        <w:t xml:space="preserve"> "and a lighter liner inside it with an adjustable web of straps."</w:t>
+      </w:r>
+    </w:p>
+    <w:p>
+      <w:pPr>
+        <w:pBdr>
+          <w:left w:val="single" w:color="B9A882" w:sz="18" w:space="8"/>
+        </w:pBdr>
+        <w:shd w:fill="F3F1EC" w:color="auto" w:val="clear"/>
+        <w:spacing w:after="160" w:line="276"/>
+        <w:ind w:left="200" w:right="120"/>
+      </w:pPr>
+      <w:r>
+        <w:rPr>
+          <w:b/>
+          <w:bCs/>
+          <w:sz w:val="20"/>
+          <w:szCs w:val="20"/>
+        </w:rPr>
+        <w:t xml:space="preserve">Video Prompt:</w:t>
+      </w:r>
+      <w:r>
+        <w:rPr>
+          <w:sz w:val="20"/>
+          <w:szCs w:val="20"/>
+        </w:rPr>
+        <w:t xml:space="preserve"> Continue the same shot for 8 seconds with the same objects, lighting and style. Scene: A cutaway cross-section of an olive-drab US M1 helmet on a featureless matte-grey mannequin head, showing the outer steel shell, the separate inner liner and the cotton webbing straps holding a clear gap between steel and head. Camera and motion: Slow push-in on the separate liner and its cotton webbing straps holding the gap. Ambient: faint haze drifts in the darkness and specular highlights slide subtly across the metal as the view shifts. Style: photoreal 3D CGI, museum-artifact look, dark low-key lighting with steep falloff into near-black, desaturated charcoal, graphite, worn wood, aged steel and brass, faint haze, extremely detailed surfaces, shallow depth of field. Very slow, smooth, cinematic movement, no camera shake, no cuts. No people, no hands, no text, no logos; objects keep their shape except for the described action. Audio: no speech, no music.</w:t>
+      </w:r>
+    </w:p>
+    <w:p>
+      <w:pPr>
+        <w:pStyle w:val="Heading3"/>
+      </w:pPr>
+      <w:r>
+        <w:t xml:space="preserve">Shot 23, Clip 3 of 3 (Extend the previous clip; covers ~8s of narration)</w:t>
+      </w:r>
+    </w:p>
+    <w:p>
+      <w:pPr>
+        <w:spacing w:after="120"/>
+      </w:pPr>
+      <w:r>
+        <w:rPr>
+          <w:b/>
+          <w:bCs/>
+        </w:rPr>
+        <w:t xml:space="preserve">[Script Segment]</w:t>
+      </w:r>
+      <w:r>
+        <w:t xml:space="preserve"> "That gap between steel and skull became a crumple zone. The shell could take a dent without the dent reaching the head."</w:t>
+      </w:r>
+    </w:p>
+    <w:p>
+      <w:pPr>
+        <w:pBdr>
+          <w:left w:val="single" w:color="B9A882" w:sz="18" w:space="8"/>
+        </w:pBdr>
+        <w:shd w:fill="F3F1EC" w:color="auto" w:val="clear"/>
+        <w:spacing w:after="160" w:line="276"/>
+        <w:ind w:left="200" w:right="120"/>
+      </w:pPr>
+      <w:r>
+        <w:rPr>
+          <w:b/>
+          <w:bCs/>
+          <w:sz w:val="20"/>
+          <w:szCs w:val="20"/>
+        </w:rPr>
+        <w:t xml:space="preserve">Video Prompt:</w:t>
+      </w:r>
+      <w:r>
+        <w:rPr>
+          <w:sz w:val="20"/>
+          <w:szCs w:val="20"/>
+        </w:rPr>
+        <w:t xml:space="preserve"> Continue the same shot for 8 seconds with the same objects, lighting and style. Scene: A cutaway cross-section of an olive-drab US M1 helmet on a featureless matte-grey mannequin head, showing the outer steel shell, the separate inner liner and the cotton webbing straps holding a clear gap between steel and head. Camera and motion: The shell takes a dent in slow motion and the dent stops short inside the gap as the webbing flexes. Ambient: faint haze drifts in the darkness and specular highlights slide subtly across the metal as the view shifts. Style: photoreal 3D CGI, museum-artifact look, dark low-key lighting with steep falloff into near-black, desaturated charcoal, graphite, worn wood, aged steel and brass, faint haze, extremely detailed surfaces, shallow depth of field. Very slow, smooth, cinematic movement, no camera shake, no cuts. No people, no hands, no text, no logos; objects keep their shape except for the described action. Audio: no speech, no music.</w:t>
+      </w:r>
+    </w:p>
+    <w:p>
+      <w:pPr>
+        <w:pStyle w:val="Heading3"/>
+      </w:pPr>
+      <w:r>
+        <w:t xml:space="preserve">Shot 24 (7:05, ~21s, 3 clips)</w:t>
+      </w:r>
+    </w:p>
+    <w:p>
+      <w:pPr>
+        <w:pStyle w:val="Heading3"/>
+      </w:pPr>
+      <w:r>
+        <w:t xml:space="preserve">Shot 24, Clip 1 of 3 (Frames to Video, shot image as first frame; covers ~8s of narration)</w:t>
+      </w:r>
+    </w:p>
+    <w:p>
+      <w:pPr>
+        <w:spacing w:after="120"/>
+      </w:pPr>
+      <w:r>
+        <w:rPr>
+          <w:b/>
+          <w:bCs/>
+        </w:rPr>
+        <w:t xml:space="preserve">[Script Segment]</w:t>
+      </w:r>
+      <w:r>
+        <w:t xml:space="preserve"> "Soldiers nicknamed it the steel pot, and they used it as far more than armor. It became a wash basin, a shovel, a seat,"</w:t>
+      </w:r>
+    </w:p>
+    <w:p>
+      <w:pPr>
+        <w:pBdr>
+          <w:left w:val="single" w:color="B9A882" w:sz="18" w:space="8"/>
+        </w:pBdr>
+        <w:shd w:fill="F3F1EC" w:color="auto" w:val="clear"/>
+        <w:spacing w:after="160" w:line="276"/>
+        <w:ind w:left="200" w:right="120"/>
+      </w:pPr>
+      <w:r>
+        <w:rPr>
+          <w:b/>
+          <w:bCs/>
+          <w:sz w:val="20"/>
+          <w:szCs w:val="20"/>
+        </w:rPr>
+        <w:t xml:space="preserve">Video Prompt:</w:t>
+      </w:r>
+      <w:r>
+        <w:rPr>
+          <w:sz w:val="20"/>
+          <w:szCs w:val="20"/>
+        </w:rPr>
+        <w:t xml:space="preserve"> 8-second shot. Scene: A dented olive-drab M1 helmet hanging over a small campfire at night with steam rising from water inside, a folding shovel, a canteen and a shaving brush on a wooden crate beside it, and a worn scratched M1 with faded paint on a dark shelf in the background. Camera and motion: Slow push toward the M1 hanging over the campfire as steam rises and embers drift, the shovel and shaving brush on the crate beside it. Ambient: warm firelight flickers gently across the metal and tiny embers drift upward. Lighting: warm flickering orange glow from a forge or flame mixed with cold grey ambient fill. Mood: human, warm, end of an era. Style: photoreal 3D CGI, museum-artifact look, dark low-key lighting with steep falloff into near-black, desaturated charcoal, graphite, worn wood, aged steel and brass, faint haze, extremely detailed surfaces, shallow depth of field. Very slow, smooth, cinematic movement, no camera shake, no cuts. No people, no hands, no text, no logos; objects keep their shape except for the described action. Audio: no speech, no music.</w:t>
+      </w:r>
+    </w:p>
+    <w:p>
+      <w:pPr>
+        <w:pStyle w:val="Heading3"/>
+      </w:pPr>
+      <w:r>
+        <w:t xml:space="preserve">Shot 24, Clip 2 of 3 (Extend the previous clip; covers ~8s of narration)</w:t>
+      </w:r>
+    </w:p>
+    <w:p>
+      <w:pPr>
+        <w:spacing w:after="120"/>
+      </w:pPr>
+      <w:r>
+        <w:rPr>
+          <w:b/>
+          <w:bCs/>
+        </w:rPr>
+        <w:t xml:space="preserve">[Script Segment]</w:t>
+      </w:r>
+      <w:r>
+        <w:t xml:space="preserve"> "and even a cooking pot over an open fire. The M1 served for more than forty years. But steel had reached its limit."</w:t>
+      </w:r>
+    </w:p>
+    <w:p>
+      <w:pPr>
+        <w:pBdr>
+          <w:left w:val="single" w:color="B9A882" w:sz="18" w:space="8"/>
+        </w:pBdr>
+        <w:shd w:fill="F3F1EC" w:color="auto" w:val="clear"/>
+        <w:spacing w:after="160" w:line="276"/>
+        <w:ind w:left="200" w:right="120"/>
+      </w:pPr>
+      <w:r>
+        <w:rPr>
+          <w:b/>
+          <w:bCs/>
+          <w:sz w:val="20"/>
+          <w:szCs w:val="20"/>
+        </w:rPr>
+        <w:t xml:space="preserve">Video Prompt:</w:t>
+      </w:r>
+      <w:r>
+        <w:rPr>
+          <w:sz w:val="20"/>
+          <w:szCs w:val="20"/>
+        </w:rPr>
+        <w:t xml:space="preserve"> Continue the same shot for 8 seconds with the same objects, lighting and style. Scene: A dented olive-drab M1 helmet hanging over a small campfire at night with steam rising from water inside, a folding shovel, a canteen and a shaving brush on a wooden crate beside it, and a worn scratched M1 with faded paint on a dark shelf in the background. Camera and motion: Slow rack focus from the campfire helmet to the worn, dusty M1 on the shelf behind. Ambient: warm firelight flickers gently across the metal and tiny embers drift upward. Style: photoreal 3D CGI, museum-artifact look, dark low-key lighting with steep falloff into near-black, desaturated charcoal, graphite, worn wood, aged steel and brass, faint haze, extremely detailed surfaces, shallow depth of field. Very slow, smooth, cinematic movement, no camera shake, no cuts. No people, no hands, no text, no logos; objects keep their shape except for the described action. Audio: no speech, no music.</w:t>
+      </w:r>
+    </w:p>
+    <w:p>
+      <w:pPr>
+        <w:pStyle w:val="Heading3"/>
+      </w:pPr>
+      <w:r>
+        <w:t xml:space="preserve">Shot 24, Clip 3 of 3 (Extend the previous clip; covers ~5s of narration)</w:t>
+      </w:r>
+    </w:p>
+    <w:p>
+      <w:pPr>
+        <w:spacing w:after="120"/>
+      </w:pPr>
+      <w:r>
+        <w:rPr>
+          <w:b/>
+          <w:bCs/>
+        </w:rPr>
+        <w:t xml:space="preserve">[Script Segment]</w:t>
+      </w:r>
+      <w:r>
+        <w:t xml:space="preserve"> "To make it stronger, you had to make it thicker. And thicker meant heavier."</w:t>
+      </w:r>
+    </w:p>
+    <w:p>
+      <w:pPr>
+        <w:pBdr>
+          <w:left w:val="single" w:color="B9A882" w:sz="18" w:space="8"/>
+        </w:pBdr>
+        <w:shd w:fill="F3F1EC" w:color="auto" w:val="clear"/>
+        <w:spacing w:after="160" w:line="276"/>
+        <w:ind w:left="200" w:right="120"/>
+      </w:pPr>
+      <w:r>
+        <w:rPr>
+          <w:b/>
+          <w:bCs/>
+          <w:sz w:val="20"/>
+          <w:szCs w:val="20"/>
+        </w:rPr>
+        <w:t xml:space="preserve">Video Prompt:</w:t>
+      </w:r>
+      <w:r>
+        <w:rPr>
+          <w:sz w:val="20"/>
+          <w:szCs w:val="20"/>
+        </w:rPr>
+        <w:t xml:space="preserve"> Continue the same shot for 8 seconds with the same objects, lighting and style. Scene: A dented olive-drab M1 helmet hanging over a small campfire at night with steam rising from water inside, a folding shovel, a canteen and a shaving brush on a wooden crate beside it, and a worn scratched M1 with faded paint on a dark shelf in the background. Camera and motion: Slow push-in on the faded, scratched paint of the worn M1 as dust settles. Ambient: warm firelight flickers gently across the metal and tiny embers drift upward. Style: photoreal 3D CGI, museum-artifact look, dark low-key lighting with steep falloff into near-black, desaturated charcoal, graphite, worn wood, aged steel and brass, faint haze, extremely detailed surfaces, shallow depth of field. Very slow, smooth, cinematic movement, no camera shake, no cuts. No people, no hands, no text, no logos; objects keep their shape except for the described action. Audio: no speech, no music.</w:t>
+      </w:r>
+    </w:p>
+    <w:p>
+      <w:pPr>
+        <w:pStyle w:val="Heading3"/>
+      </w:pPr>
+      <w:r>
+        <w:t xml:space="preserve">Shot 25 (7:26, ~10s, 2 clips)</w:t>
+      </w:r>
+    </w:p>
+    <w:p>
+      <w:pPr>
+        <w:pStyle w:val="Heading3"/>
+      </w:pPr>
+      <w:r>
+        <w:t xml:space="preserve">Shot 25, Clip 1 of 2 (Frames to Video, shot image as first frame; covers ~6s of narration)</w:t>
+      </w:r>
+    </w:p>
+    <w:p>
+      <w:pPr>
+        <w:spacing w:after="120"/>
+      </w:pPr>
+      <w:r>
+        <w:rPr>
+          <w:b/>
+          <w:bCs/>
+        </w:rPr>
+        <w:t xml:space="preserve">[Script Segment]</w:t>
+      </w:r>
+      <w:r>
+        <w:t xml:space="preserve"> "The breakthrough came from a laboratory. In 1965, DuPont chemist Stephanie Kwolek discovered a synthetic fiber"</w:t>
+      </w:r>
+    </w:p>
+    <w:p>
+      <w:pPr>
+        <w:pBdr>
+          <w:left w:val="single" w:color="B9A882" w:sz="18" w:space="8"/>
+        </w:pBdr>
+        <w:shd w:fill="F3F1EC" w:color="auto" w:val="clear"/>
+        <w:spacing w:after="160" w:line="276"/>
+        <w:ind w:left="200" w:right="120"/>
+      </w:pPr>
+      <w:r>
+        <w:rPr>
+          <w:b/>
+          <w:bCs/>
+          <w:sz w:val="20"/>
+          <w:szCs w:val="20"/>
+        </w:rPr>
+        <w:t xml:space="preserve">Video Prompt:</w:t>
+      </w:r>
+      <w:r>
+        <w:rPr>
+          <w:sz w:val="20"/>
+          <w:szCs w:val="20"/>
+        </w:rPr>
+        <w:t xml:space="preserve"> 8-second shot. Scene: A dim 1960s chemistry laboratory bench with glass beakers and flasks under a single desk lamp, a thin golden synthetic fiber being drawn up out of a beaker of cloudy liquid, a spool of tightly woven golden-yellow Kevlar fabric beside it. Camera and motion: Slow glide along the dim laboratory bench under the desk lamp as the golden fiber lifts out of the beaker. Ambient: fine dust motes float slowly through the pools of light. Lighting: narrow overhead spotlight forming a pool of light on the table, everything else falling into black. Mood: breakthrough, discovery. Style: photoreal 3D CGI, museum-artifact look, dark low-key lighting with steep falloff into near-black, desaturated charcoal, graphite, worn wood, aged steel and brass, faint haze, extremely detailed surfaces, shallow depth of field. Very slow, smooth, cinematic movement, no camera shake, no cuts. No people, no hands, no text, no logos; objects keep their shape except for the described action. Audio: no speech, no music.</w:t>
+      </w:r>
+    </w:p>
+    <w:p>
+      <w:pPr>
+        <w:pStyle w:val="Heading3"/>
+      </w:pPr>
+      <w:r>
+        <w:t xml:space="preserve">Shot 25, Clip 2 of 2 (Extend the previous clip; covers ~5s of narration)</w:t>
+      </w:r>
+    </w:p>
+    <w:p>
+      <w:pPr>
+        <w:spacing w:after="120"/>
+      </w:pPr>
+      <w:r>
+        <w:rPr>
+          <w:b/>
+          <w:bCs/>
+        </w:rPr>
+        <w:t xml:space="preserve">[Script Segment]</w:t>
+      </w:r>
+      <w:r>
+        <w:t xml:space="preserve"> "that, weight for weight, was five times stronger than steel. It was called Kevlar."</w:t>
+      </w:r>
+    </w:p>
+    <w:p>
+      <w:pPr>
+        <w:pBdr>
+          <w:left w:val="single" w:color="B9A882" w:sz="18" w:space="8"/>
+        </w:pBdr>
+        <w:shd w:fill="F3F1EC" w:color="auto" w:val="clear"/>
+        <w:spacing w:after="160" w:line="276"/>
+        <w:ind w:left="200" w:right="120"/>
+      </w:pPr>
+      <w:r>
+        <w:rPr>
+          <w:b/>
+          <w:bCs/>
+          <w:sz w:val="20"/>
+          <w:szCs w:val="20"/>
+        </w:rPr>
+        <w:t xml:space="preserve">Video Prompt:</w:t>
+      </w:r>
+      <w:r>
+        <w:rPr>
+          <w:sz w:val="20"/>
+          <w:szCs w:val="20"/>
+        </w:rPr>
+        <w:t xml:space="preserve"> Continue the same shot for 8 seconds with the same objects, lighting and style. Scene: A dim 1960s chemistry laboratory bench with glass beakers and flasks under a single desk lamp, a thin golden synthetic fiber being drawn up out of a beaker of cloudy liquid, a spool of tightly woven golden-yellow Kevlar fabric beside it. Camera and motion: Slow push from the golden fiber to the spool of woven Kevlar fabric beside it. Ambient: fine dust motes float slowly through the pools of light. Style: photoreal 3D CGI, museum-artifact look, dark low-key lighting with steep falloff into near-black, desaturated charcoal, graphite, worn wood, aged steel and brass, faint haze, extremely detailed surfaces, shallow depth of field. Very slow, smooth, cinematic movement, no camera shake, no cuts. No people, no hands, no text, no logos; objects keep their shape except for the described action. Audio: no speech, no music.</w:t>
+      </w:r>
+    </w:p>
+    <w:p>
+      <w:pPr>
+        <w:pStyle w:val="Heading3"/>
+      </w:pPr>
+      <w:r>
+        <w:t xml:space="preserve">Shot 26 (7:36, ~18s, 3 clips)</w:t>
+      </w:r>
+    </w:p>
+    <w:p>
+      <w:pPr>
+        <w:pStyle w:val="Heading3"/>
+      </w:pPr>
+      <w:r>
+        <w:t xml:space="preserve">Shot 26, Clip 1 of 3 (Frames to Video, shot image as first frame; covers ~7s of narration)</w:t>
+      </w:r>
+    </w:p>
+    <w:p>
+      <w:pPr>
+        <w:spacing w:after="120"/>
+      </w:pPr>
+      <w:r>
+        <w:rPr>
+          <w:b/>
+          <w:bCs/>
+        </w:rPr>
+        <w:t xml:space="preserve">[Script Segment]</w:t>
+      </w:r>
+      <w:r>
+        <w:t xml:space="preserve"> "In the early 1980s, the US Army adopted the PASGT helmet, built from layers of Kevlar bonded together with resin."</w:t>
+      </w:r>
+    </w:p>
+    <w:p>
+      <w:pPr>
+        <w:pBdr>
+          <w:left w:val="single" w:color="B9A882" w:sz="18" w:space="8"/>
+        </w:pBdr>
+        <w:shd w:fill="F3F1EC" w:color="auto" w:val="clear"/>
+        <w:spacing w:after="160" w:line="276"/>
+        <w:ind w:left="200" w:right="120"/>
+      </w:pPr>
+      <w:r>
+        <w:rPr>
+          <w:b/>
+          <w:bCs/>
+          <w:sz w:val="20"/>
+          <w:szCs w:val="20"/>
+        </w:rPr>
+        <w:t xml:space="preserve">Video Prompt:</w:t>
+      </w:r>
+      <w:r>
+        <w:rPr>
+          <w:sz w:val="20"/>
+          <w:szCs w:val="20"/>
+        </w:rPr>
+        <w:t xml:space="preserve"> 8-second shot. Scene: A woodland-camouflage US PASGT helmet on a dark stand beside an exploded view of golden Kevlar fabric layers fusing together with glossy resin, a jagged metal fragment caught in the stretched woven fibers like a net. Camera and motion: Slow orbit around the camouflaged PASGT helmet on its stand, the Kevlar layers glowing faintly beside it. Ambient: faint haze drifts in the darkness and the raking light glints softly along the edges as the view shifts. Lighting: low raking side light from the right, long soft shadows, specular glints along edges. Mood: engineered, impressive. Style: photoreal 3D CGI, museum-artifact look, dark low-key lighting with steep falloff into near-black, desaturated charcoal, graphite, worn wood, aged steel and brass, faint haze, extremely detailed surfaces, shallow depth of field. Very slow, smooth, cinematic movement, no camera shake, no cuts. No people, no hands, no text, no logos; objects keep their shape except for the described action. Audio: no speech, no music.</w:t>
+      </w:r>
+    </w:p>
+    <w:p>
+      <w:pPr>
+        <w:pStyle w:val="Heading3"/>
+      </w:pPr>
+      <w:r>
+        <w:t xml:space="preserve">Shot 26, Clip 2 of 3 (Extend the previous clip; covers ~5s of narration)</w:t>
+      </w:r>
+    </w:p>
+    <w:p>
+      <w:pPr>
+        <w:spacing w:after="120"/>
+      </w:pPr>
+      <w:r>
+        <w:rPr>
+          <w:b/>
+          <w:bCs/>
+        </w:rPr>
+        <w:t xml:space="preserve">[Script Segment]</w:t>
+      </w:r>
+      <w:r>
+        <w:t xml:space="preserve"> "Instead of resisting a fragment with hard metal, its fibers stretched and caught it,"</w:t>
+      </w:r>
+    </w:p>
+    <w:p>
+      <w:pPr>
+        <w:pBdr>
+          <w:left w:val="single" w:color="B9A882" w:sz="18" w:space="8"/>
+        </w:pBdr>
+        <w:shd w:fill="F3F1EC" w:color="auto" w:val="clear"/>
+        <w:spacing w:after="160" w:line="276"/>
+        <w:ind w:left="200" w:right="120"/>
+      </w:pPr>
+      <w:r>
+        <w:rPr>
+          <w:b/>
+          <w:bCs/>
+          <w:sz w:val="20"/>
+          <w:szCs w:val="20"/>
+        </w:rPr>
+        <w:t xml:space="preserve">Video Prompt:</w:t>
+      </w:r>
+      <w:r>
+        <w:rPr>
+          <w:sz w:val="20"/>
+          <w:szCs w:val="20"/>
+        </w:rPr>
+        <w:t xml:space="preserve"> Continue the same shot for 8 seconds with the same objects, lighting and style. Scene: A woodland-camouflage US PASGT helmet on a dark stand beside an exploded view of golden Kevlar fabric layers fusing together with glossy resin, a jagged metal fragment caught in the stretched woven fibers like a net. Camera and motion: A jagged fragment pushes into the Kevlar weave in slow motion and the fibers stretch and hold it. Ambient: faint haze drifts in the darkness and the raking light glints softly along the edges as the view shifts. Style: photoreal 3D CGI, museum-artifact look, dark low-key lighting with steep falloff into near-black, desaturated charcoal, graphite, worn wood, aged steel and brass, faint haze, extremely detailed surfaces, shallow depth of field. Very slow, smooth, cinematic movement, no camera shake, no cuts. No people, no hands, no text, no logos; objects keep their shape except for the described action. Audio: no speech, no music.</w:t>
+      </w:r>
+    </w:p>
+    <w:p>
+      <w:pPr>
+        <w:pStyle w:val="Heading3"/>
+      </w:pPr>
+      <w:r>
+        <w:t xml:space="preserve">Shot 26, Clip 3 of 3 (Extend the previous clip; covers ~6s of narration)</w:t>
+      </w:r>
+    </w:p>
+    <w:p>
+      <w:pPr>
+        <w:spacing w:after="120"/>
+      </w:pPr>
+      <w:r>
+        <w:rPr>
+          <w:b/>
+          <w:bCs/>
+        </w:rPr>
+        <w:t xml:space="preserve">[Script Segment]</w:t>
+      </w:r>
+      <w:r>
+        <w:t xml:space="preserve"> "spreading the energy across the entire shell. For roughly the same weight as steel, it stopped far more."</w:t>
+      </w:r>
+    </w:p>
+    <w:p>
+      <w:pPr>
+        <w:pBdr>
+          <w:left w:val="single" w:color="B9A882" w:sz="18" w:space="8"/>
+        </w:pBdr>
+        <w:shd w:fill="F3F1EC" w:color="auto" w:val="clear"/>
+        <w:spacing w:after="160" w:line="276"/>
+        <w:ind w:left="200" w:right="120"/>
+      </w:pPr>
+      <w:r>
+        <w:rPr>
+          <w:b/>
+          <w:bCs/>
+          <w:sz w:val="20"/>
+          <w:szCs w:val="20"/>
+        </w:rPr>
+        <w:t xml:space="preserve">Video Prompt:</w:t>
+      </w:r>
+      <w:r>
+        <w:rPr>
+          <w:sz w:val="20"/>
+          <w:szCs w:val="20"/>
+        </w:rPr>
+        <w:t xml:space="preserve"> Continue the same shot for 8 seconds with the same objects, lighting and style. Scene: A woodland-camouflage US PASGT helmet on a dark stand beside an exploded view of golden Kevlar fabric layers fusing together with glossy resin, a jagged metal fragment caught in the stretched woven fibers like a net. Camera and motion: Glowing energy ripples outward across the Kevlar layers as the camera eases back to the helmet. Ambient: faint haze drifts in the darkness and the raking light glints softly along the edges as the view shifts. Style: photoreal 3D CGI, museum-artifact look, dark low-key lighting with steep falloff into near-black, desaturated charcoal, graphite, worn wood, aged steel and brass, faint haze, extremely detailed surfaces, shallow depth of field. Very slow, smooth, cinematic movement, no camera shake, no cuts. No people, no hands, no text, no logos; objects keep their shape except for the described action. Audio: no speech, no music.</w:t>
+      </w:r>
+    </w:p>
+    <w:p>
+      <w:pPr>
+        <w:pStyle w:val="Heading3"/>
+      </w:pPr>
+      <w:r>
+        <w:t xml:space="preserve">Shot 27 (7:54, ~14s, 2 clips)</w:t>
+      </w:r>
+    </w:p>
+    <w:p>
+      <w:pPr>
+        <w:pStyle w:val="Heading3"/>
+      </w:pPr>
+      <w:r>
+        <w:t xml:space="preserve">Shot 27, Clip 1 of 2 (Frames to Video, shot image as first frame; covers ~9s of narration)</w:t>
+      </w:r>
+    </w:p>
+    <w:p>
+      <w:pPr>
+        <w:spacing w:after="120"/>
+      </w:pPr>
+      <w:r>
+        <w:rPr>
+          <w:b/>
+          <w:bCs/>
+        </w:rPr>
+        <w:t xml:space="preserve">[Script Segment]</w:t>
+      </w:r>
+      <w:r>
+        <w:t xml:space="preserve"> "Its shape looked familiar. The deep sides covering the ears and neck echoed the German Stahlhelm so closely that American troops nicknamed it the Fritz."</w:t>
+      </w:r>
+    </w:p>
+    <w:p>
+      <w:pPr>
+        <w:pBdr>
+          <w:left w:val="single" w:color="B9A882" w:sz="18" w:space="8"/>
+        </w:pBdr>
+        <w:shd w:fill="F3F1EC" w:color="auto" w:val="clear"/>
+        <w:spacing w:after="160" w:line="276"/>
+        <w:ind w:left="200" w:right="120"/>
+      </w:pPr>
+      <w:r>
+        <w:rPr>
+          <w:b/>
+          <w:bCs/>
+          <w:sz w:val="20"/>
+          <w:szCs w:val="20"/>
+        </w:rPr>
+        <w:t xml:space="preserve">Video Prompt:</w:t>
+      </w:r>
+      <w:r>
+        <w:rPr>
+          <w:sz w:val="20"/>
+          <w:szCs w:val="20"/>
+        </w:rPr>
+        <w:t xml:space="preserve"> 8-second shot. Scene: A field-grey 1916 German Stahlhelm and a 1980s US PASGT helmet facing the same way side by side on a long dark table, in exact side profile, their silhouettes nearly identical, dust drifting between them. Camera and motion: Slow lateral slide between the two helmets until their side-profile silhouettes overlap and line up. Ambient: thin atmospheric haze drifts slowly through the backlight. Lighting: soft backlight creating a thin glowing rim around the silhouette, front mostly in shadow. Mood: surprising echo, reflective. Style: photoreal 3D CGI, museum-artifact look, dark low-key lighting with steep falloff into near-black, desaturated charcoal, graphite, worn wood, aged steel and brass, faint haze, extremely detailed surfaces, shallow depth of field. Very slow, smooth, cinematic movement, no camera shake, no cuts. No people, no hands, no text, no logos; objects keep their shape except for the described action. Audio: no speech, no music.</w:t>
+      </w:r>
+    </w:p>
+    <w:p>
+      <w:pPr>
+        <w:pStyle w:val="Heading3"/>
+      </w:pPr>
+      <w:r>
+        <w:t xml:space="preserve">Shot 27, Clip 2 of 2 (Extend the previous clip; covers ~6s of narration)</w:t>
+      </w:r>
+    </w:p>
+    <w:p>
+      <w:pPr>
+        <w:spacing w:after="120"/>
+      </w:pPr>
+      <w:r>
+        <w:rPr>
+          <w:b/>
+          <w:bCs/>
+        </w:rPr>
+        <w:t xml:space="preserve">[Script Segment]</w:t>
+      </w:r>
+      <w:r>
+        <w:t xml:space="preserve"> "Nearly seventy years later, the best answer to falling fragments still looked like a design from 1916."</w:t>
+      </w:r>
+    </w:p>
+    <w:p>
+      <w:pPr>
+        <w:pBdr>
+          <w:left w:val="single" w:color="B9A882" w:sz="18" w:space="8"/>
+        </w:pBdr>
+        <w:shd w:fill="F3F1EC" w:color="auto" w:val="clear"/>
+        <w:spacing w:after="160" w:line="276"/>
+        <w:ind w:left="200" w:right="120"/>
+      </w:pPr>
+      <w:r>
+        <w:rPr>
+          <w:b/>
+          <w:bCs/>
+          <w:sz w:val="20"/>
+          <w:szCs w:val="20"/>
+        </w:rPr>
+        <w:t xml:space="preserve">Video Prompt:</w:t>
+      </w:r>
+      <w:r>
+        <w:rPr>
+          <w:sz w:val="20"/>
+          <w:szCs w:val="20"/>
+        </w:rPr>
+        <w:t xml:space="preserve"> Continue the same shot for 8 seconds with the same objects, lighting and style. Scene: A field-grey 1916 German Stahlhelm and a 1980s US PASGT helmet facing the same way side by side on a long dark table, in exact side profile, their silhouettes nearly identical, dust drifting between them. Camera and motion: Slow slide back so the silhouettes separate again, dust drifting between them. Ambient: thin atmospheric haze drifts slowly through the backlight. Style: photoreal 3D CGI, museum-artifact look, dark low-key lighting with steep falloff into near-black, desaturated charcoal, graphite, worn wood, aged steel and brass, faint haze, extremely detailed surfaces, shallow depth of field. Very slow, smooth, cinematic movement, no camera shake, no cuts. No people, no hands, no text, no logos; objects keep their shape except for the described action. Audio: no speech, no music.</w:t>
+      </w:r>
+    </w:p>
+    <w:p>
+      <w:pPr>
+        <w:pStyle w:val="Heading3"/>
+      </w:pPr>
+      <w:r>
+        <w:t xml:space="preserve">Shot 28 (8:09, ~23s, 3 clips)</w:t>
+      </w:r>
+    </w:p>
+    <w:p>
+      <w:pPr>
+        <w:pStyle w:val="Heading3"/>
+      </w:pPr>
+      <w:r>
+        <w:t xml:space="preserve">Shot 28, Clip 1 of 3 (Frames to Video, shot image as first frame; covers ~6s of narration)</w:t>
+      </w:r>
+    </w:p>
+    <w:p>
+      <w:pPr>
+        <w:spacing w:after="120"/>
+      </w:pPr>
+      <w:r>
+        <w:rPr>
+          <w:b/>
+          <w:bCs/>
+        </w:rPr>
+        <w:t xml:space="preserve">[Script Segment]</w:t>
+      </w:r>
+      <w:r>
+        <w:t xml:space="preserve"> "But modern wars revealed a new threat. In Iraq and Afghanistan, many head injuries came not from penetration,"</w:t>
+      </w:r>
+    </w:p>
+    <w:p>
+      <w:pPr>
+        <w:pBdr>
+          <w:left w:val="single" w:color="B9A882" w:sz="18" w:space="8"/>
+        </w:pBdr>
+        <w:shd w:fill="F3F1EC" w:color="auto" w:val="clear"/>
+        <w:spacing w:after="160" w:line="276"/>
+        <w:ind w:left="200" w:right="120"/>
+      </w:pPr>
+      <w:r>
+        <w:rPr>
+          <w:b/>
+          <w:bCs/>
+          <w:sz w:val="20"/>
+          <w:szCs w:val="20"/>
+        </w:rPr>
+        <w:t xml:space="preserve">Video Prompt:</w:t>
+      </w:r>
+      <w:r>
+        <w:rPr>
+          <w:sz w:val="20"/>
+          <w:szCs w:val="20"/>
+        </w:rPr>
+        <w:t xml:space="preserve"> 8-second shot. Scene: A modern high-cut desert-tan combat helmet resting on sandbags at dusk in an arid landscape, beside a cutaway of it on a featureless matte-grey mannequin head showing shock-absorbing foam pads inside and a tactical over-ear headset fitted below the raised edges. Camera and motion: Slow push toward the desert-tan helmet resting on sandbags as dust drifts across the dusk sky. Ambient: thin atmospheric haze drifts slowly through the backlight. Lighting: soft backlight creating a thin glowing rim around the silhouette, front mostly in shadow. Mood: harsh, then reassuring. Style: photoreal 3D CGI, museum-artifact look, dark low-key lighting with steep falloff into near-black, desaturated charcoal, graphite, worn wood, aged steel and brass, faint haze, extremely detailed surfaces, shallow depth of field. Very slow, smooth, cinematic movement, no camera shake, no cuts. No people, no hands, no text, no logos; objects keep their shape except for the described action. Audio: no speech, no music.</w:t>
+      </w:r>
+    </w:p>
+    <w:p>
+      <w:pPr>
+        <w:pStyle w:val="Heading3"/>
+      </w:pPr>
+      <w:r>
+        <w:t xml:space="preserve">Shot 28, Clip 2 of 3 (Extend the previous clip; covers ~9s of narration)</w:t>
+      </w:r>
+    </w:p>
+    <w:p>
+      <w:pPr>
+        <w:spacing w:after="120"/>
+      </w:pPr>
+      <w:r>
+        <w:rPr>
+          <w:b/>
+          <w:bCs/>
+        </w:rPr>
+        <w:t xml:space="preserve">[Script Segment]</w:t>
+      </w:r>
+      <w:r>
+        <w:t xml:space="preserve"> "but from blast and blunt force. The old strap suspension wasn't enough. The answer was padding. Newer helmets replaced the web of straps with shock-absorbing foam pads,"</w:t>
+      </w:r>
+    </w:p>
+    <w:p>
+      <w:pPr>
+        <w:pBdr>
+          <w:left w:val="single" w:color="B9A882" w:sz="18" w:space="8"/>
+        </w:pBdr>
+        <w:shd w:fill="F3F1EC" w:color="auto" w:val="clear"/>
+        <w:spacing w:after="160" w:line="276"/>
+        <w:ind w:left="200" w:right="120"/>
+      </w:pPr>
+      <w:r>
+        <w:rPr>
+          <w:b/>
+          <w:bCs/>
+          <w:sz w:val="20"/>
+          <w:szCs w:val="20"/>
+        </w:rPr>
+        <w:t xml:space="preserve">Video Prompt:</w:t>
+      </w:r>
+      <w:r>
+        <w:rPr>
+          <w:sz w:val="20"/>
+          <w:szCs w:val="20"/>
+        </w:rPr>
+        <w:t xml:space="preserve"> Continue the same shot for 8 seconds with the same objects, lighting and style. Scene: A modern high-cut desert-tan combat helmet resting on sandbags at dusk in an arid landscape, beside a cutaway of it on a featureless matte-grey mannequin head showing shock-absorbing foam pads inside and a tactical over-ear headset fitted below the raised edges. Camera and motion: A pressure ripple passes through the cutaway helmet and spreads evenly through the foam pads. Ambient: thin atmospheric haze drifts slowly through the backlight. Style: photoreal 3D CGI, museum-artifact look, dark low-key lighting with steep falloff into near-black, desaturated charcoal, graphite, worn wood, aged steel and brass, faint haze, extremely detailed surfaces, shallow depth of field. Very slow, smooth, cinematic movement, no camera shake, no cuts. No people, no hands, no text, no logos; objects keep their shape except for the described action. Audio: no speech, no music.</w:t>
+      </w:r>
+    </w:p>
+    <w:p>
+      <w:pPr>
+        <w:pStyle w:val="Heading3"/>
+      </w:pPr>
+      <w:r>
+        <w:t xml:space="preserve">Shot 28, Clip 3 of 3 (Extend the previous clip; covers ~7s of narration)</w:t>
+      </w:r>
+    </w:p>
+    <w:p>
+      <w:pPr>
+        <w:spacing w:after="120"/>
+      </w:pPr>
+      <w:r>
+        <w:rPr>
+          <w:b/>
+          <w:bCs/>
+        </w:rPr>
+        <w:t xml:space="preserve">[Script Segment]</w:t>
+      </w:r>
+      <w:r>
+        <w:t xml:space="preserve"> "spreading every impact across the skull. Their edges were cut higher around the ears, leaving room for radios and hearing protection."</w:t>
+      </w:r>
+    </w:p>
+    <w:p>
+      <w:pPr>
+        <w:pBdr>
+          <w:left w:val="single" w:color="B9A882" w:sz="18" w:space="8"/>
+        </w:pBdr>
+        <w:shd w:fill="F3F1EC" w:color="auto" w:val="clear"/>
+        <w:spacing w:after="160" w:line="276"/>
+        <w:ind w:left="200" w:right="120"/>
+      </w:pPr>
+      <w:r>
+        <w:rPr>
+          <w:b/>
+          <w:bCs/>
+          <w:sz w:val="20"/>
+          <w:szCs w:val="20"/>
+        </w:rPr>
+        <w:t xml:space="preserve">Video Prompt:</w:t>
+      </w:r>
+      <w:r>
+        <w:rPr>
+          <w:sz w:val="20"/>
+          <w:szCs w:val="20"/>
+        </w:rPr>
+        <w:t xml:space="preserve"> Continue the same shot for 8 seconds with the same objects, lighting and style. Scene: A modern high-cut desert-tan combat helmet resting on sandbags at dusk in an arid landscape, beside a cutaway of it on a featureless matte-grey mannequin head showing shock-absorbing foam pads inside and a tactical over-ear headset fitted below the raised edges. Camera and motion: Slow orbit toward the raised edges and the tactical headset fitted below them. Ambient: thin atmospheric haze drifts slowly through the backlight. Style: photoreal 3D CGI, museum-artifact look, dark low-key lighting with steep falloff into near-black, desaturated charcoal, graphite, worn wood, aged steel and brass, faint haze, extremely detailed surfaces, shallow depth of field. Very slow, smooth, cinematic movement, no camera shake, no cuts. No people, no hands, no text, no logos; objects keep their shape except for the described action. Audio: no speech, no music.</w:t>
+      </w:r>
+    </w:p>
+    <w:p>
+      <w:pPr>
+        <w:pStyle w:val="Heading3"/>
+      </w:pPr>
+      <w:r>
+        <w:t xml:space="preserve">Shot 29 (8:32, ~12s, 2 clips)</w:t>
+      </w:r>
+    </w:p>
+    <w:p>
+      <w:pPr>
+        <w:pStyle w:val="Heading3"/>
+      </w:pPr>
+      <w:r>
+        <w:t xml:space="preserve">Shot 29, Clip 1 of 2 (Frames to Video, shot image as first frame; covers ~6s of narration)</w:t>
+      </w:r>
+    </w:p>
+    <w:p>
+      <w:pPr>
+        <w:spacing w:after="120"/>
+      </w:pPr>
+      <w:r>
+        <w:rPr>
+          <w:b/>
+          <w:bCs/>
+        </w:rPr>
+        <w:t xml:space="preserve">[Script Segment]</w:t>
+      </w:r>
+      <w:r>
+        <w:t xml:space="preserve"> "Then materials moved forward again. Ultra-high molecular weight polyethylene, a plastic so light it floats on water,"</w:t>
+      </w:r>
+    </w:p>
+    <w:p>
+      <w:pPr>
+        <w:pBdr>
+          <w:left w:val="single" w:color="B9A882" w:sz="18" w:space="8"/>
+        </w:pBdr>
+        <w:shd w:fill="F3F1EC" w:color="auto" w:val="clear"/>
+        <w:spacing w:after="160" w:line="276"/>
+        <w:ind w:left="200" w:right="120"/>
+      </w:pPr>
+      <w:r>
+        <w:rPr>
+          <w:b/>
+          <w:bCs/>
+          <w:sz w:val="20"/>
+          <w:szCs w:val="20"/>
+        </w:rPr>
+        <w:t xml:space="preserve">Video Prompt:</w:t>
+      </w:r>
+      <w:r>
+        <w:rPr>
+          <w:sz w:val="20"/>
+          <w:szCs w:val="20"/>
+        </w:rPr>
+        <w:t xml:space="preserve"> 8-second shot. Scene: A thin white ultra-high molecular weight polyethylene composite plate floating on the dark water of a glass tank under a single lamp, a sleek matte-grey modern polyethylene combat helmet resting on dark wood behind it. Camera and motion: The white polyethylene plate bobs gently on the rippling water as the camera holds at water level. Ambient: fine dust motes float slowly through the pools of light. Lighting: narrow overhead spotlight forming a pool of light on the table, everything else falling into black. Mood: surprising, advanced. Style: photoreal 3D CGI, museum-artifact look, dark low-key lighting with steep falloff into near-black, desaturated charcoal, graphite, worn wood, aged steel and brass, faint haze, extremely detailed surfaces, shallow depth of field. Very slow, smooth, cinematic movement, no camera shake, no cuts. No people, no hands, no text, no logos; objects keep their shape except for the described action. Audio: no speech, no music.</w:t>
+      </w:r>
+    </w:p>
+    <w:p>
+      <w:pPr>
+        <w:pStyle w:val="Heading3"/>
+      </w:pPr>
+      <w:r>
+        <w:t xml:space="preserve">Shot 29, Clip 2 of 2 (Extend the previous clip; covers ~7s of narration)</w:t>
+      </w:r>
+    </w:p>
+    <w:p>
+      <w:pPr>
+        <w:spacing w:after="120"/>
+      </w:pPr>
+      <w:r>
+        <w:rPr>
+          <w:b/>
+          <w:bCs/>
+        </w:rPr>
+        <w:t xml:space="preserve">[Script Segment]</w:t>
+      </w:r>
+      <w:r>
+        <w:t xml:space="preserve"> "yet in layered form even stronger than Kevlar. Helmets made from it are lighter, and they stop even more."</w:t>
+      </w:r>
+    </w:p>
+    <w:p>
+      <w:pPr>
+        <w:pBdr>
+          <w:left w:val="single" w:color="B9A882" w:sz="18" w:space="8"/>
+        </w:pBdr>
+        <w:shd w:fill="F3F1EC" w:color="auto" w:val="clear"/>
+        <w:spacing w:after="160" w:line="276"/>
+        <w:ind w:left="200" w:right="120"/>
+      </w:pPr>
+      <w:r>
+        <w:rPr>
+          <w:b/>
+          <w:bCs/>
+          <w:sz w:val="20"/>
+          <w:szCs w:val="20"/>
+        </w:rPr>
+        <w:t xml:space="preserve">Video Prompt:</w:t>
+      </w:r>
+      <w:r>
+        <w:rPr>
+          <w:sz w:val="20"/>
+          <w:szCs w:val="20"/>
+        </w:rPr>
+        <w:t xml:space="preserve"> Continue the same shot for 8 seconds with the same objects, lighting and style. Scene: A thin white ultra-high molecular weight polyethylene composite plate floating on the dark water of a glass tank under a single lamp, a sleek matte-grey modern polyethylene combat helmet resting on dark wood behind it. Camera and motion: The camera slowly rises and racks focus to the sleek grey polyethylene helmet behind the tank. Ambient: fine dust motes float slowly through the pools of light. Style: photoreal 3D CGI, museum-artifact look, dark low-key lighting with steep falloff into near-black, desaturated charcoal, graphite, worn wood, aged steel and brass, faint haze, extremely detailed surfaces, shallow depth of field. Very slow, smooth, cinematic movement, no camera shake, no cuts. No people, no hands, no text, no logos; objects keep their shape except for the described action. Audio: no speech, no music.</w:t>
+      </w:r>
+    </w:p>
+    <w:p>
+      <w:pPr>
+        <w:pStyle w:val="Heading3"/>
+      </w:pPr>
+      <w:r>
+        <w:t xml:space="preserve">Shot 30 (8:44, ~26s, 4 clips)</w:t>
+      </w:r>
+    </w:p>
+    <w:p>
+      <w:pPr>
+        <w:pStyle w:val="Heading3"/>
+      </w:pPr>
+      <w:r>
+        <w:t xml:space="preserve">Shot 30, Clip 1 of 4 (Frames to Video, shot image as first frame; covers ~8s of narration)</w:t>
+      </w:r>
+    </w:p>
+    <w:p>
+      <w:pPr>
+        <w:spacing w:after="120"/>
+      </w:pPr>
+      <w:r>
+        <w:rPr>
+          <w:b/>
+          <w:bCs/>
+        </w:rPr>
+        <w:t xml:space="preserve">[Script Segment]</w:t>
+      </w:r>
+      <w:r>
+        <w:t xml:space="preserve"> "Today's combat helmet carries rails, night vision mounts, communication systems, and sensors. It looks nothing like a copper cap from ancient Sumer."</w:t>
+      </w:r>
+    </w:p>
+    <w:p>
+      <w:pPr>
+        <w:pBdr>
+          <w:left w:val="single" w:color="B9A882" w:sz="18" w:space="8"/>
+        </w:pBdr>
+        <w:shd w:fill="F3F1EC" w:color="auto" w:val="clear"/>
+        <w:spacing w:after="160" w:line="276"/>
+        <w:ind w:left="200" w:right="120"/>
+      </w:pPr>
+      <w:r>
+        <w:rPr>
+          <w:b/>
+          <w:bCs/>
+          <w:sz w:val="20"/>
+          <w:szCs w:val="20"/>
+        </w:rPr>
+        <w:t xml:space="preserve">Video Prompt:</w:t>
+      </w:r>
+      <w:r>
+        <w:rPr>
+          <w:sz w:val="20"/>
+          <w:szCs w:val="20"/>
+        </w:rPr>
+        <w:t xml:space="preserve"> 8-second shot. Scene: A long dark table holding the full chronological lineup of helmets from a dented copper Sumerian cap, a bronze Corinthian, an iron Roman helmet, a split spangenhelm, a great helm and a WWI steel helmet to a fully equipped modern combat helmet with rails, night-vision mount and headset at the near end, each lit by its own light. Camera and motion: Slow orbit around the fully equipped modern helmet in the foreground, rails and night-vision mount catching the light. Ambient: fine dust motes float slowly through the pools of light. Lighting: narrow overhead spotlight forming a pool of light on the table, everything else falling into black. Mood: epic, resolved, haunting. Style: photoreal 3D CGI, museum-artifact look, dark low-key lighting with steep falloff into near-black, desaturated charcoal, graphite, worn wood, aged steel and brass, faint haze, extremely detailed surfaces, shallow depth of field. Very slow, smooth, cinematic movement, no camera shake, no cuts. No people, no hands, no text, no logos; objects keep their shape except for the described action. Audio: no speech, no music.</w:t>
+      </w:r>
+    </w:p>
+    <w:p>
+      <w:pPr>
+        <w:pStyle w:val="Heading3"/>
+      </w:pPr>
+      <w:r>
+        <w:t xml:space="preserve">Shot 30, Clip 2 of 4 (Extend the previous clip; covers ~5s of narration)</w:t>
+      </w:r>
+    </w:p>
+    <w:p>
+      <w:pPr>
+        <w:spacing w:after="120"/>
+      </w:pPr>
+      <w:r>
+        <w:rPr>
+          <w:b/>
+          <w:bCs/>
+        </w:rPr>
+        <w:t xml:space="preserve">[Script Segment]</w:t>
+      </w:r>
+      <w:r>
+        <w:t xml:space="preserve"> "From copper to bronze, bronze to iron, iron to steel, and steel to fiber,"</w:t>
+      </w:r>
+    </w:p>
+    <w:p>
+      <w:pPr>
+        <w:pBdr>
+          <w:left w:val="single" w:color="B9A882" w:sz="18" w:space="8"/>
+        </w:pBdr>
+        <w:shd w:fill="F3F1EC" w:color="auto" w:val="clear"/>
+        <w:spacing w:after="160" w:line="276"/>
+        <w:ind w:left="200" w:right="120"/>
+      </w:pPr>
+      <w:r>
+        <w:rPr>
+          <w:b/>
+          <w:bCs/>
+          <w:sz w:val="20"/>
+          <w:szCs w:val="20"/>
+        </w:rPr>
+        <w:t xml:space="preserve">Video Prompt:</w:t>
+      </w:r>
+      <w:r>
+        <w:rPr>
+          <w:sz w:val="20"/>
+          <w:szCs w:val="20"/>
+        </w:rPr>
+        <w:t xml:space="preserve"> Continue the same shot for 8 seconds with the same objects, lighting and style. Scene: A long dark table holding the full chronological lineup of helmets from a dented copper Sumerian cap, a bronze Corinthian, an iron Roman helmet, a split spangenhelm, a great helm and a WWI steel helmet to a fully equipped modern combat helmet with rails, night-vision mount and headset at the near end, each lit by its own light. Camera and motion: Slow rack focus down the table from the modern helmet to the dented copper cap at the far end. Ambient: fine dust motes float slowly through the pools of light. Style: photoreal 3D CGI, museum-artifact look, dark low-key lighting with steep falloff into near-black, desaturated charcoal, graphite, worn wood, aged steel and brass, faint haze, extremely detailed surfaces, shallow depth of field. Very slow, smooth, cinematic movement, no camera shake, no cuts. No people, no hands, no text, no logos; objects keep their shape except for the described action. Audio: no speech, no music.</w:t>
+      </w:r>
+    </w:p>
+    <w:p>
+      <w:pPr>
+        <w:pStyle w:val="Heading3"/>
+      </w:pPr>
+      <w:r>
+        <w:t xml:space="preserve">Shot 30, Clip 3 of 4 (Extend the previous clip; covers ~7s of narration)</w:t>
+      </w:r>
+    </w:p>
+    <w:p>
+      <w:pPr>
+        <w:spacing w:after="120"/>
+      </w:pPr>
+      <w:r>
+        <w:rPr>
+          <w:b/>
+          <w:bCs/>
+        </w:rPr>
+        <w:t xml:space="preserve">[Script Segment]</w:t>
+      </w:r>
+      <w:r>
+        <w:t xml:space="preserve"> "each step began with a wound the last helmet couldn't prevent. But the logic behind it has never changed."</w:t>
+      </w:r>
+    </w:p>
+    <w:p>
+      <w:pPr>
+        <w:pBdr>
+          <w:left w:val="single" w:color="B9A882" w:sz="18" w:space="8"/>
+        </w:pBdr>
+        <w:shd w:fill="F3F1EC" w:color="auto" w:val="clear"/>
+        <w:spacing w:after="160" w:line="276"/>
+        <w:ind w:left="200" w:right="120"/>
+      </w:pPr>
+      <w:r>
+        <w:rPr>
+          <w:b/>
+          <w:bCs/>
+          <w:sz w:val="20"/>
+          <w:szCs w:val="20"/>
+        </w:rPr>
+        <w:t xml:space="preserve">Video Prompt:</w:t>
+      </w:r>
+      <w:r>
+        <w:rPr>
+          <w:sz w:val="20"/>
+          <w:szCs w:val="20"/>
+        </w:rPr>
+        <w:t xml:space="preserve"> Continue the same shot for 8 seconds with the same objects, lighting and style. Scene: A long dark table holding the full chronological lineup of helmets from a dented copper Sumerian cap, a bronze Corinthian, an iron Roman helmet, a split spangenhelm, a great helm and a WWI steel helmet to a fully equipped modern combat helmet with rails, night-vision mount and headset at the near end, each lit by its own light. Camera and motion: Slow lateral slide back along the row from the oldest helmets toward the newest. Ambient: fine dust motes float slowly through the pools of light. Style: photoreal 3D CGI, museum-artifact look, dark low-key lighting with steep falloff into near-black, desaturated charcoal, graphite, worn wood, aged steel and brass, faint haze, extremely detailed surfaces, shallow depth of field. Very slow, smooth, cinematic movement, no camera shake, no cuts. No people, no hands, no text, no logos; objects keep their shape except for the described action. Audio: no speech, no music.</w:t>
+      </w:r>
+    </w:p>
+    <w:p>
+      <w:pPr>
+        <w:pStyle w:val="Heading3"/>
+      </w:pPr>
+      <w:r>
+        <w:t xml:space="preserve">Shot 30, Clip 4 of 4 (Extend the previous clip; covers ~7s of narration)</w:t>
+      </w:r>
+    </w:p>
+    <w:p>
+      <w:pPr>
+        <w:spacing w:after="120"/>
+      </w:pPr>
+      <w:r>
+        <w:rPr>
+          <w:b/>
+          <w:bCs/>
+        </w:rPr>
+        <w:t xml:space="preserve">[Script Segment]</w:t>
+      </w:r>
+      <w:r>
+        <w:t xml:space="preserve"> "Every curve, every layer, and every pad is there because, at some point in history, a helmet without it failed."</w:t>
+      </w:r>
+    </w:p>
+    <w:p>
+      <w:pPr>
+        <w:pBdr>
+          <w:left w:val="single" w:color="B9A882" w:sz="18" w:space="8"/>
+        </w:pBdr>
+        <w:shd w:fill="F3F1EC" w:color="auto" w:val="clear"/>
+        <w:spacing w:after="160" w:line="276"/>
+        <w:ind w:left="200" w:right="120"/>
+      </w:pPr>
+      <w:r>
+        <w:rPr>
+          <w:b/>
+          <w:bCs/>
+          <w:sz w:val="20"/>
+          <w:szCs w:val="20"/>
+        </w:rPr>
+        <w:t xml:space="preserve">Video Prompt:</w:t>
+      </w:r>
+      <w:r>
+        <w:rPr>
+          <w:sz w:val="20"/>
+          <w:szCs w:val="20"/>
+        </w:rPr>
+        <w:t xml:space="preserve"> Continue the same shot for 8 seconds with the same objects, lighting and style. Scene: A long dark table holding the full chronological lineup of helmets from a dented copper Sumerian cap, a bronze Corinthian, an iron Roman helmet, a split spangenhelm, a great helm and a WWI steel helmet to a fully equipped modern combat helmet with rails, night-vision mount and headset at the near end, each lit by its own light. Camera and motion: The lights along the table dim one by one from the oldest helmet to the newest until only the modern helmet remains lit, the camera slowly pulling back. Ambient: fine dust motes float slowly through the pools of light. Style: photoreal 3D CGI, museum-artifact look, dark low-key lighting with steep falloff into near-black, desaturated charcoal, graphite, worn wood, aged steel and brass, faint haze, extremely detailed surfaces, shallow depth of field. Very slow, smooth, cinematic movement, no camera shake, no cuts. No people, no hands, no text, no logos; objects keep their shape except for the described action. Audio: no speech, no music.</w:t>
       </w:r>
     </w:p>
     <w:p>

</xml_diff>